<commit_message>
Sửa đề cương theo góp ý: chú thích in đậm, danh mục bảng hình, hình trắng đen
Đổi tên style chú thích để Word không dùng nhầm style trùng, bỏ nền xám
dòng tiêu đề bảng, SmartArt và Shape chuyển sang trắng đen, dòng nguồn
căn phải in nghiêng, tài liệu tham khảo căn đều hai bên.

Co-Authored-By: Claude Opus 5.5 <noreply@anthropic.com>
Claude-Session: https://claude.ai/code/session_01Jj9HfJt3spogVjREoAJ7gj
</commit_message>
<xml_diff>
--- a/de_cuong_tien_si/De_cuong_NCS_NguyenVanTrung.docx
+++ b/de_cuong_tien_si/De_cuong_NCS_NguyenVanTrung.docx
@@ -833,7 +833,7 @@
         <w:fldChar w:fldCharType="begin"/>
       </w:r>
       <w:r>
-        <w:instrText xml:space="preserve"> TOC \h \z \t "Table Caption,1" </w:instrText>
+        <w:instrText xml:space="preserve"> TOC \h \z \t "TableCaption,1" </w:instrText>
       </w:r>
       <w:r>
         <w:fldChar w:fldCharType="separate"/>
@@ -978,7 +978,7 @@
         <w:fldChar w:fldCharType="begin"/>
       </w:r>
       <w:r>
-        <w:instrText xml:space="preserve"> TOC \h \z \t "Figure Caption,1" </w:instrText>
+        <w:instrText xml:space="preserve"> TOC \h \z \t "FigureCaption,1" </w:instrText>
       </w:r>
       <w:r>
         <w:fldChar w:fldCharType="separate"/>
@@ -1714,23 +1714,15 @@
                           <a:prstGeom prst="rect">
                             <a:avLst/>
                           </a:prstGeom>
+                          <a:solidFill>
+                            <a:srgbClr val="FFFFFF"/>
+                          </a:solidFill>
+                          <a:ln w="9525">
+                            <a:solidFill>
+                              <a:srgbClr val="000000"/>
+                            </a:solidFill>
+                          </a:ln>
                         </wps:spPr>
-                        <wps:style>
-                          <a:lnRef idx="2">
-                            <a:schemeClr val="accent1">
-                              <a:shade val="50000"/>
-                            </a:schemeClr>
-                          </a:lnRef>
-                          <a:fillRef idx="1">
-                            <a:schemeClr val="accent1"/>
-                          </a:fillRef>
-                          <a:effectRef idx="0">
-                            <a:schemeClr val="accent1"/>
-                          </a:effectRef>
-                          <a:fontRef idx="minor">
-                            <a:schemeClr val="lt1"/>
-                          </a:fontRef>
-                        </wps:style>
                         <wps:txbx>
                           <w:txbxContent>
                             <w:p>
@@ -1743,7 +1735,7 @@
                                 <w:rPr>
                                   <w:b/>
                                   <w:bCs/>
-                                  <w:color w:val="FFFFFF"/>
+                                  <w:color w:val="000000"/>
                                   <w:sz w:val="22"/>
                                   <w:szCs w:val="22"/>
                                 </w:rPr>
@@ -1758,7 +1750,7 @@
                               </w:pPr>
                               <w:r>
                                 <w:rPr>
-                                  <w:color w:val="FFFFFF"/>
+                                  <w:color w:val="000000"/>
                                   <w:sz w:val="22"/>
                                   <w:szCs w:val="22"/>
                                 </w:rPr>
@@ -1773,7 +1765,7 @@
                               </w:pPr>
                               <w:r>
                                 <w:rPr>
-                                  <w:color w:val="FFFFFF"/>
+                                  <w:color w:val="000000"/>
                                   <w:sz w:val="22"/>
                                   <w:szCs w:val="22"/>
                                 </w:rPr>
@@ -1788,7 +1780,7 @@
                               </w:pPr>
                               <w:r>
                                 <w:rPr>
-                                  <w:color w:val="FFFFFF"/>
+                                  <w:color w:val="000000"/>
                                   <w:sz w:val="22"/>
                                   <w:szCs w:val="22"/>
                                 </w:rPr>
@@ -1796,7 +1788,7 @@
                               </w:r>
                               <w:r>
                                 <w:rPr>
-                                  <w:color w:val="FFFFFF"/>
+                                  <w:color w:val="000000"/>
                                   <w:sz w:val="22"/>
                                   <w:szCs w:val="22"/>
                                   <w:vertAlign w:val="subscript"/>
@@ -1805,7 +1797,7 @@
                               </w:r>
                               <w:r>
                                 <w:rPr>
-                                  <w:color w:val="FFFFFF"/>
+                                  <w:color w:val="000000"/>
                                   <w:sz w:val="22"/>
                                   <w:szCs w:val="22"/>
                                 </w:rPr>
@@ -1829,23 +1821,15 @@
                           <a:prstGeom prst="rect">
                             <a:avLst/>
                           </a:prstGeom>
+                          <a:solidFill>
+                            <a:srgbClr val="FFFFFF"/>
+                          </a:solidFill>
+                          <a:ln w="9525">
+                            <a:solidFill>
+                              <a:srgbClr val="000000"/>
+                            </a:solidFill>
+                          </a:ln>
                         </wps:spPr>
-                        <wps:style>
-                          <a:lnRef idx="2">
-                            <a:schemeClr val="accent1">
-                              <a:shade val="50000"/>
-                            </a:schemeClr>
-                          </a:lnRef>
-                          <a:fillRef idx="1">
-                            <a:schemeClr val="accent1"/>
-                          </a:fillRef>
-                          <a:effectRef idx="0">
-                            <a:schemeClr val="accent1"/>
-                          </a:effectRef>
-                          <a:fontRef idx="minor">
-                            <a:schemeClr val="lt1"/>
-                          </a:fontRef>
-                        </wps:style>
                         <wps:txbx>
                           <w:txbxContent>
                             <w:p>
@@ -1858,7 +1842,7 @@
                                 <w:rPr>
                                   <w:b/>
                                   <w:bCs/>
-                                  <w:color w:val="FFFFFF"/>
+                                  <w:color w:val="000000"/>
                                   <w:sz w:val="22"/>
                                   <w:szCs w:val="22"/>
                                 </w:rPr>
@@ -1873,7 +1857,7 @@
                               </w:pPr>
                               <w:r>
                                 <w:rPr>
-                                  <w:color w:val="FFFFFF"/>
+                                  <w:color w:val="000000"/>
                                   <w:sz w:val="22"/>
                                   <w:szCs w:val="22"/>
                                 </w:rPr>
@@ -1881,7 +1865,7 @@
                               </w:r>
                               <w:r>
                                 <w:rPr>
-                                  <w:color w:val="FFFFFF"/>
+                                  <w:color w:val="000000"/>
                                   <w:sz w:val="22"/>
                                   <w:szCs w:val="22"/>
                                   <w:vertAlign w:val="subscript"/>
@@ -1897,7 +1881,7 @@
                               </w:pPr>
                               <w:r>
                                 <w:rPr>
-                                  <w:color w:val="FFFFFF"/>
+                                  <w:color w:val="000000"/>
                                   <w:sz w:val="22"/>
                                   <w:szCs w:val="22"/>
                                 </w:rPr>
@@ -1905,7 +1889,7 @@
                               </w:r>
                               <w:r>
                                 <w:rPr>
-                                  <w:color w:val="FFFFFF"/>
+                                  <w:color w:val="000000"/>
                                   <w:sz w:val="22"/>
                                   <w:szCs w:val="22"/>
                                   <w:vertAlign w:val="subscript"/>
@@ -1921,7 +1905,7 @@
                               </w:pPr>
                               <w:r>
                                 <w:rPr>
-                                  <w:color w:val="FFFFFF"/>
+                                  <w:color w:val="000000"/>
                                   <w:sz w:val="22"/>
                                   <w:szCs w:val="22"/>
                                 </w:rPr>
@@ -1945,23 +1929,15 @@
                           <a:prstGeom prst="rect">
                             <a:avLst/>
                           </a:prstGeom>
+                          <a:solidFill>
+                            <a:srgbClr val="FFFFFF"/>
+                          </a:solidFill>
+                          <a:ln w="9525">
+                            <a:solidFill>
+                              <a:srgbClr val="000000"/>
+                            </a:solidFill>
+                          </a:ln>
                         </wps:spPr>
-                        <wps:style>
-                          <a:lnRef idx="2">
-                            <a:schemeClr val="accent1">
-                              <a:shade val="50000"/>
-                            </a:schemeClr>
-                          </a:lnRef>
-                          <a:fillRef idx="1">
-                            <a:schemeClr val="accent1"/>
-                          </a:fillRef>
-                          <a:effectRef idx="0">
-                            <a:schemeClr val="accent1"/>
-                          </a:effectRef>
-                          <a:fontRef idx="minor">
-                            <a:schemeClr val="lt1"/>
-                          </a:fontRef>
-                        </wps:style>
                         <wps:txbx>
                           <w:txbxContent>
                             <w:p>
@@ -1974,7 +1950,7 @@
                                 <w:rPr>
                                   <w:b/>
                                   <w:bCs/>
-                                  <w:color w:val="FFFFFF"/>
+                                  <w:color w:val="000000"/>
                                   <w:sz w:val="22"/>
                                   <w:szCs w:val="22"/>
                                 </w:rPr>
@@ -1989,7 +1965,7 @@
                               </w:pPr>
                               <w:r>
                                 <w:rPr>
-                                  <w:color w:val="FFFFFF"/>
+                                  <w:color w:val="000000"/>
                                   <w:sz w:val="22"/>
                                   <w:szCs w:val="22"/>
                                 </w:rPr>
@@ -2004,7 +1980,7 @@
                               </w:pPr>
                               <w:r>
                                 <w:rPr>
-                                  <w:color w:val="FFFFFF"/>
+                                  <w:color w:val="000000"/>
                                   <w:sz w:val="22"/>
                                   <w:szCs w:val="22"/>
                                 </w:rPr>
@@ -2019,7 +1995,7 @@
                               </w:pPr>
                               <w:r>
                                 <w:rPr>
-                                  <w:color w:val="FFFFFF"/>
+                                  <w:color w:val="000000"/>
                                   <w:sz w:val="22"/>
                                   <w:szCs w:val="22"/>
                                 </w:rPr>
@@ -2044,23 +2020,12 @@
                             <a:avLst/>
                           </a:prstGeom>
                           <a:ln w="12700">
+                            <a:solidFill>
+                              <a:srgbClr val="000000"/>
+                            </a:solidFill>
                             <a:tailEnd type="triangle"/>
                           </a:ln>
                         </wps:spPr>
-                        <wps:style>
-                          <a:lnRef idx="1">
-                            <a:schemeClr val="accent1"/>
-                          </a:lnRef>
-                          <a:fillRef idx="0">
-                            <a:schemeClr val="accent1"/>
-                          </a:fillRef>
-                          <a:effectRef idx="0">
-                            <a:schemeClr val="accent1"/>
-                          </a:effectRef>
-                          <a:fontRef idx="minor">
-                            <a:schemeClr val="tx1"/>
-                          </a:fontRef>
-                        </wps:style>
                         <wps:bodyPr/>
                       </wps:wsp>
                       <wps:wsp>
@@ -2075,24 +2040,13 @@
                             <a:avLst/>
                           </a:prstGeom>
                           <a:ln w="12700">
+                            <a:solidFill>
+                              <a:srgbClr val="000000"/>
+                            </a:solidFill>
                             <a:prstDash val="dash"/>
                             <a:tailEnd type="triangle"/>
                           </a:ln>
                         </wps:spPr>
-                        <wps:style>
-                          <a:lnRef idx="1">
-                            <a:schemeClr val="accent1"/>
-                          </a:lnRef>
-                          <a:fillRef idx="0">
-                            <a:schemeClr val="accent1"/>
-                          </a:fillRef>
-                          <a:effectRef idx="0">
-                            <a:schemeClr val="accent1"/>
-                          </a:effectRef>
-                          <a:fontRef idx="minor">
-                            <a:schemeClr val="tx1"/>
-                          </a:fontRef>
-                        </wps:style>
                         <wps:bodyPr/>
                       </wps:wsp>
                       <wps:wsp>
@@ -2106,23 +2060,15 @@
                           <a:prstGeom prst="rect">
                             <a:avLst/>
                           </a:prstGeom>
+                          <a:solidFill>
+                            <a:srgbClr val="FFFFFF"/>
+                          </a:solidFill>
+                          <a:ln w="9525">
+                            <a:solidFill>
+                              <a:srgbClr val="000000"/>
+                            </a:solidFill>
+                          </a:ln>
                         </wps:spPr>
-                        <wps:style>
-                          <a:lnRef idx="2">
-                            <a:schemeClr val="accent1">
-                              <a:shade val="50000"/>
-                            </a:schemeClr>
-                          </a:lnRef>
-                          <a:fillRef idx="1">
-                            <a:schemeClr val="accent1"/>
-                          </a:fillRef>
-                          <a:effectRef idx="0">
-                            <a:schemeClr val="accent1"/>
-                          </a:effectRef>
-                          <a:fontRef idx="minor">
-                            <a:schemeClr val="lt1"/>
-                          </a:fontRef>
-                        </wps:style>
                         <wps:txbx>
                           <w:txbxContent>
                             <w:p>
@@ -2135,7 +2081,7 @@
                                 <w:rPr>
                                   <w:b/>
                                   <w:bCs/>
-                                  <w:color w:val="FFFFFF"/>
+                                  <w:color w:val="000000"/>
                                   <w:sz w:val="22"/>
                                   <w:szCs w:val="22"/>
                                 </w:rPr>
@@ -2150,7 +2096,7 @@
                               </w:pPr>
                               <w:r>
                                 <w:rPr>
-                                  <w:color w:val="FFFFFF"/>
+                                  <w:color w:val="000000"/>
                                   <w:sz w:val="22"/>
                                   <w:szCs w:val="22"/>
                                 </w:rPr>
@@ -2165,7 +2111,7 @@
                               </w:pPr>
                               <w:r>
                                 <w:rPr>
-                                  <w:color w:val="FFFFFF"/>
+                                  <w:color w:val="000000"/>
                                   <w:sz w:val="22"/>
                                   <w:szCs w:val="22"/>
                                 </w:rPr>
@@ -2180,7 +2126,7 @@
                               </w:pPr>
                               <w:r>
                                 <w:rPr>
-                                  <w:color w:val="FFFFFF"/>
+                                  <w:color w:val="000000"/>
                                   <w:sz w:val="22"/>
                                   <w:szCs w:val="22"/>
                                 </w:rPr>
@@ -2204,23 +2150,15 @@
                           <a:prstGeom prst="rect">
                             <a:avLst/>
                           </a:prstGeom>
+                          <a:solidFill>
+                            <a:srgbClr val="FFFFFF"/>
+                          </a:solidFill>
+                          <a:ln w="9525">
+                            <a:solidFill>
+                              <a:srgbClr val="000000"/>
+                            </a:solidFill>
+                          </a:ln>
                         </wps:spPr>
-                        <wps:style>
-                          <a:lnRef idx="2">
-                            <a:schemeClr val="accent1">
-                              <a:shade val="50000"/>
-                            </a:schemeClr>
-                          </a:lnRef>
-                          <a:fillRef idx="1">
-                            <a:schemeClr val="accent1"/>
-                          </a:fillRef>
-                          <a:effectRef idx="0">
-                            <a:schemeClr val="accent1"/>
-                          </a:effectRef>
-                          <a:fontRef idx="minor">
-                            <a:schemeClr val="lt1"/>
-                          </a:fontRef>
-                        </wps:style>
                         <wps:txbx>
                           <w:txbxContent>
                             <w:p>
@@ -2233,7 +2171,7 @@
                                 <w:rPr>
                                   <w:b/>
                                   <w:bCs/>
-                                  <w:color w:val="FFFFFF"/>
+                                  <w:color w:val="000000"/>
                                   <w:sz w:val="22"/>
                                   <w:szCs w:val="22"/>
                                 </w:rPr>
@@ -2248,7 +2186,7 @@
                               </w:pPr>
                               <w:r>
                                 <w:rPr>
-                                  <w:color w:val="FFFFFF"/>
+                                  <w:color w:val="000000"/>
                                   <w:sz w:val="22"/>
                                   <w:szCs w:val="22"/>
                                 </w:rPr>
@@ -2263,7 +2201,7 @@
                               </w:pPr>
                               <w:r>
                                 <w:rPr>
-                                  <w:color w:val="FFFFFF"/>
+                                  <w:color w:val="000000"/>
                                   <w:sz w:val="22"/>
                                   <w:szCs w:val="22"/>
                                 </w:rPr>
@@ -2278,7 +2216,7 @@
                               </w:pPr>
                               <w:r>
                                 <w:rPr>
-                                  <w:color w:val="FFFFFF"/>
+                                  <w:color w:val="000000"/>
                                   <w:sz w:val="22"/>
                                   <w:szCs w:val="22"/>
                                 </w:rPr>
@@ -2303,23 +2241,12 @@
                             <a:avLst/>
                           </a:prstGeom>
                           <a:ln w="12700">
+                            <a:solidFill>
+                              <a:srgbClr val="000000"/>
+                            </a:solidFill>
                             <a:tailEnd type="triangle"/>
                           </a:ln>
                         </wps:spPr>
-                        <wps:style>
-                          <a:lnRef idx="1">
-                            <a:schemeClr val="accent1"/>
-                          </a:lnRef>
-                          <a:fillRef idx="0">
-                            <a:schemeClr val="accent1"/>
-                          </a:fillRef>
-                          <a:effectRef idx="0">
-                            <a:schemeClr val="accent1"/>
-                          </a:effectRef>
-                          <a:fontRef idx="minor">
-                            <a:schemeClr val="tx1"/>
-                          </a:fontRef>
-                        </wps:style>
                         <wps:bodyPr/>
                       </wps:wsp>
                       <wps:wsp>
@@ -2334,23 +2261,12 @@
                             <a:avLst/>
                           </a:prstGeom>
                           <a:ln w="12700">
+                            <a:solidFill>
+                              <a:srgbClr val="000000"/>
+                            </a:solidFill>
                             <a:tailEnd type="triangle"/>
                           </a:ln>
                         </wps:spPr>
-                        <wps:style>
-                          <a:lnRef idx="1">
-                            <a:schemeClr val="accent1"/>
-                          </a:lnRef>
-                          <a:fillRef idx="0">
-                            <a:schemeClr val="accent1"/>
-                          </a:fillRef>
-                          <a:effectRef idx="0">
-                            <a:schemeClr val="accent1"/>
-                          </a:effectRef>
-                          <a:fontRef idx="minor">
-                            <a:schemeClr val="tx1"/>
-                          </a:fontRef>
-                        </wps:style>
                         <wps:bodyPr/>
                       </wps:wsp>
                       <wps:wsp>
@@ -4619,23 +4535,15 @@
                           <a:prstGeom prst="rect">
                             <a:avLst/>
                           </a:prstGeom>
+                          <a:solidFill>
+                            <a:srgbClr val="FFFFFF"/>
+                          </a:solidFill>
+                          <a:ln w="9525">
+                            <a:solidFill>
+                              <a:srgbClr val="000000"/>
+                            </a:solidFill>
+                          </a:ln>
                         </wps:spPr>
-                        <wps:style>
-                          <a:lnRef idx="2">
-                            <a:schemeClr val="accent1">
-                              <a:shade val="50000"/>
-                            </a:schemeClr>
-                          </a:lnRef>
-                          <a:fillRef idx="1">
-                            <a:schemeClr val="accent1"/>
-                          </a:fillRef>
-                          <a:effectRef idx="0">
-                            <a:schemeClr val="accent1"/>
-                          </a:effectRef>
-                          <a:fontRef idx="minor">
-                            <a:schemeClr val="lt1"/>
-                          </a:fontRef>
-                        </wps:style>
                         <wps:txbx>
                           <w:txbxContent>
                             <w:p>
@@ -4646,7 +4554,7 @@
                               </w:pPr>
                               <w:r>
                                 <w:rPr>
-                                  <w:color w:val="FFFFFF"/>
+                                  <w:color w:val="000000"/>
                                   <w:sz w:val="20"/>
                                   <w:szCs w:val="20"/>
                                 </w:rPr>
@@ -4670,23 +4578,15 @@
                           <a:prstGeom prst="rect">
                             <a:avLst/>
                           </a:prstGeom>
+                          <a:solidFill>
+                            <a:srgbClr val="D9D9D9"/>
+                          </a:solidFill>
+                          <a:ln w="9525">
+                            <a:solidFill>
+                              <a:srgbClr val="000000"/>
+                            </a:solidFill>
+                          </a:ln>
                         </wps:spPr>
-                        <wps:style>
-                          <a:lnRef idx="2">
-                            <a:schemeClr val="accent2">
-                              <a:shade val="50000"/>
-                            </a:schemeClr>
-                          </a:lnRef>
-                          <a:fillRef idx="1">
-                            <a:schemeClr val="accent2"/>
-                          </a:fillRef>
-                          <a:effectRef idx="0">
-                            <a:schemeClr val="accent2"/>
-                          </a:effectRef>
-                          <a:fontRef idx="minor">
-                            <a:schemeClr val="lt1"/>
-                          </a:fontRef>
-                        </wps:style>
                         <wps:txbx>
                           <w:txbxContent>
                             <w:p>
@@ -4774,23 +4674,15 @@
                           <a:prstGeom prst="rect">
                             <a:avLst/>
                           </a:prstGeom>
+                          <a:solidFill>
+                            <a:srgbClr val="FFFFFF"/>
+                          </a:solidFill>
+                          <a:ln w="9525">
+                            <a:solidFill>
+                              <a:srgbClr val="000000"/>
+                            </a:solidFill>
+                          </a:ln>
                         </wps:spPr>
-                        <wps:style>
-                          <a:lnRef idx="2">
-                            <a:schemeClr val="accent1">
-                              <a:shade val="50000"/>
-                            </a:schemeClr>
-                          </a:lnRef>
-                          <a:fillRef idx="1">
-                            <a:schemeClr val="accent1"/>
-                          </a:fillRef>
-                          <a:effectRef idx="0">
-                            <a:schemeClr val="accent1"/>
-                          </a:effectRef>
-                          <a:fontRef idx="minor">
-                            <a:schemeClr val="lt1"/>
-                          </a:fontRef>
-                        </wps:style>
                         <wps:txbx>
                           <w:txbxContent>
                             <w:p>
@@ -4801,7 +4693,7 @@
                               </w:pPr>
                               <w:r>
                                 <w:rPr>
-                                  <w:color w:val="FFFFFF"/>
+                                  <w:color w:val="000000"/>
                                   <w:sz w:val="20"/>
                                   <w:szCs w:val="20"/>
                                 </w:rPr>
@@ -4825,23 +4717,15 @@
                           <a:prstGeom prst="rect">
                             <a:avLst/>
                           </a:prstGeom>
+                          <a:solidFill>
+                            <a:srgbClr val="D9D9D9"/>
+                          </a:solidFill>
+                          <a:ln w="9525">
+                            <a:solidFill>
+                              <a:srgbClr val="000000"/>
+                            </a:solidFill>
+                          </a:ln>
                         </wps:spPr>
-                        <wps:style>
-                          <a:lnRef idx="2">
-                            <a:schemeClr val="accent2">
-                              <a:shade val="50000"/>
-                            </a:schemeClr>
-                          </a:lnRef>
-                          <a:fillRef idx="1">
-                            <a:schemeClr val="accent2"/>
-                          </a:fillRef>
-                          <a:effectRef idx="0">
-                            <a:schemeClr val="accent2"/>
-                          </a:effectRef>
-                          <a:fontRef idx="minor">
-                            <a:schemeClr val="lt1"/>
-                          </a:fontRef>
-                        </wps:style>
                         <wps:txbx>
                           <w:txbxContent>
                             <w:p>
@@ -4929,23 +4813,15 @@
                           <a:prstGeom prst="rect">
                             <a:avLst/>
                           </a:prstGeom>
+                          <a:solidFill>
+                            <a:srgbClr val="FFFFFF"/>
+                          </a:solidFill>
+                          <a:ln w="9525">
+                            <a:solidFill>
+                              <a:srgbClr val="000000"/>
+                            </a:solidFill>
+                          </a:ln>
                         </wps:spPr>
-                        <wps:style>
-                          <a:lnRef idx="2">
-                            <a:schemeClr val="accent1">
-                              <a:shade val="50000"/>
-                            </a:schemeClr>
-                          </a:lnRef>
-                          <a:fillRef idx="1">
-                            <a:schemeClr val="accent1"/>
-                          </a:fillRef>
-                          <a:effectRef idx="0">
-                            <a:schemeClr val="accent1"/>
-                          </a:effectRef>
-                          <a:fontRef idx="minor">
-                            <a:schemeClr val="lt1"/>
-                          </a:fontRef>
-                        </wps:style>
                         <wps:txbx>
                           <w:txbxContent>
                             <w:p>
@@ -4956,7 +4832,7 @@
                               </w:pPr>
                               <w:r>
                                 <w:rPr>
-                                  <w:color w:val="FFFFFF"/>
+                                  <w:color w:val="000000"/>
                                   <w:sz w:val="20"/>
                                   <w:szCs w:val="20"/>
                                 </w:rPr>
@@ -4980,23 +4856,15 @@
                           <a:prstGeom prst="rect">
                             <a:avLst/>
                           </a:prstGeom>
+                          <a:solidFill>
+                            <a:srgbClr val="D9D9D9"/>
+                          </a:solidFill>
+                          <a:ln w="9525">
+                            <a:solidFill>
+                              <a:srgbClr val="000000"/>
+                            </a:solidFill>
+                          </a:ln>
                         </wps:spPr>
-                        <wps:style>
-                          <a:lnRef idx="2">
-                            <a:schemeClr val="accent2">
-                              <a:shade val="50000"/>
-                            </a:schemeClr>
-                          </a:lnRef>
-                          <a:fillRef idx="1">
-                            <a:schemeClr val="accent2"/>
-                          </a:fillRef>
-                          <a:effectRef idx="0">
-                            <a:schemeClr val="accent2"/>
-                          </a:effectRef>
-                          <a:fontRef idx="minor">
-                            <a:schemeClr val="lt1"/>
-                          </a:fontRef>
-                        </wps:style>
                         <wps:txbx>
                           <w:txbxContent>
                             <w:p>
@@ -5047,23 +4915,12 @@
                             <a:avLst/>
                           </a:prstGeom>
                           <a:ln w="12700">
+                            <a:solidFill>
+                              <a:srgbClr val="000000"/>
+                            </a:solidFill>
                             <a:tailEnd type="triangle"/>
                           </a:ln>
                         </wps:spPr>
-                        <wps:style>
-                          <a:lnRef idx="1">
-                            <a:schemeClr val="accent1"/>
-                          </a:lnRef>
-                          <a:fillRef idx="0">
-                            <a:schemeClr val="accent1"/>
-                          </a:fillRef>
-                          <a:effectRef idx="0">
-                            <a:schemeClr val="accent1"/>
-                          </a:effectRef>
-                          <a:fontRef idx="minor">
-                            <a:schemeClr val="tx1"/>
-                          </a:fontRef>
-                        </wps:style>
                         <wps:bodyPr/>
                       </wps:wsp>
                       <wps:wsp>
@@ -5116,23 +4973,12 @@
                             <a:avLst/>
                           </a:prstGeom>
                           <a:ln w="12700">
+                            <a:solidFill>
+                              <a:srgbClr val="000000"/>
+                            </a:solidFill>
                             <a:tailEnd type="triangle"/>
                           </a:ln>
                         </wps:spPr>
-                        <wps:style>
-                          <a:lnRef idx="1">
-                            <a:schemeClr val="accent1"/>
-                          </a:lnRef>
-                          <a:fillRef idx="0">
-                            <a:schemeClr val="accent1"/>
-                          </a:fillRef>
-                          <a:effectRef idx="0">
-                            <a:schemeClr val="accent1"/>
-                          </a:effectRef>
-                          <a:fontRef idx="minor">
-                            <a:schemeClr val="tx1"/>
-                          </a:fontRef>
-                        </wps:style>
                         <wps:bodyPr/>
                       </wps:wsp>
                       <wps:wsp>
@@ -5147,23 +4993,12 @@
                             <a:avLst/>
                           </a:prstGeom>
                           <a:ln w="12700">
+                            <a:solidFill>
+                              <a:srgbClr val="000000"/>
+                            </a:solidFill>
                             <a:tailEnd type="triangle"/>
                           </a:ln>
                         </wps:spPr>
-                        <wps:style>
-                          <a:lnRef idx="1">
-                            <a:schemeClr val="accent1"/>
-                          </a:lnRef>
-                          <a:fillRef idx="0">
-                            <a:schemeClr val="accent1"/>
-                          </a:fillRef>
-                          <a:effectRef idx="0">
-                            <a:schemeClr val="accent1"/>
-                          </a:effectRef>
-                          <a:fontRef idx="minor">
-                            <a:schemeClr val="tx1"/>
-                          </a:fontRef>
-                        </wps:style>
                         <wps:bodyPr/>
                       </wps:wsp>
                       <wps:wsp>
@@ -5178,23 +5013,12 @@
                             <a:avLst/>
                           </a:prstGeom>
                           <a:ln w="12700">
+                            <a:solidFill>
+                              <a:srgbClr val="000000"/>
+                            </a:solidFill>
                             <a:tailEnd type="triangle"/>
                           </a:ln>
                         </wps:spPr>
-                        <wps:style>
-                          <a:lnRef idx="1">
-                            <a:schemeClr val="accent1"/>
-                          </a:lnRef>
-                          <a:fillRef idx="0">
-                            <a:schemeClr val="accent1"/>
-                          </a:fillRef>
-                          <a:effectRef idx="0">
-                            <a:schemeClr val="accent1"/>
-                          </a:effectRef>
-                          <a:fontRef idx="minor">
-                            <a:schemeClr val="tx1"/>
-                          </a:fontRef>
-                        </wps:style>
                         <wps:bodyPr/>
                       </wps:wsp>
                       <wps:wsp>
@@ -10787,7 +10611,7 @@
     </w:rPr>
   </w:style>
   <w:style w:customStyle="1" w:styleId="TableCaption" w:type="paragraph">
-    <w:name w:val="Table Caption"/>
+    <w:name w:val="TableCaption"/>
     <w:basedOn w:val="Normal"/>
     <w:qFormat/>
     <w:pPr>
@@ -10802,7 +10626,7 @@
     </w:rPr>
   </w:style>
   <w:style w:customStyle="1" w:styleId="FigureCaption" w:type="paragraph">
-    <w:name w:val="Figure Caption"/>
+    <w:name w:val="FigureCaption"/>
     <w:basedOn w:val="Normal"/>
     <w:qFormat/>
     <w:pPr>
@@ -10817,13 +10641,13 @@
     </w:rPr>
   </w:style>
   <w:style w:customStyle="1" w:styleId="SourceNote" w:type="paragraph">
-    <w:name w:val="Source Note"/>
+    <w:name w:val="SourceNote"/>
     <w:basedOn w:val="Normal"/>
     <w:qFormat/>
     <w:pPr>
       <w:spacing w:after="120" w:before="40" w:line="276" w:lineRule="auto"/>
       <w:ind w:firstLine="0"/>
-      <w:jc w:val="left"/>
+      <w:jc w:val="right"/>
     </w:pPr>
     <w:rPr>
       <w:i/>
@@ -10848,7 +10672,7 @@
     <w:rPr/>
   </w:style>
   <w:style w:customStyle="1" w:styleId="FigureBox" w:type="paragraph">
-    <w:name w:val="Figure Box"/>
+    <w:name w:val="FigureBox"/>
     <w:basedOn w:val="Normal"/>
     <w:qFormat/>
     <w:pPr>
@@ -10860,7 +10684,7 @@
     <w:rPr/>
   </w:style>
   <w:style w:customStyle="1" w:styleId="CoverLine" w:type="paragraph">
-    <w:name w:val="Cover Line"/>
+    <w:name w:val="CoverLine"/>
     <w:basedOn w:val="Normal"/>
     <w:qFormat/>
     <w:pPr>
@@ -10877,12 +10701,12 @@
     <w:pPr>
       <w:spacing w:after="80" w:before="0" w:line="312" w:lineRule="auto"/>
       <w:ind w:hanging="567" w:left="567"/>
-      <w:jc w:val="left"/>
+      <w:jc w:val="both"/>
     </w:pPr>
     <w:rPr/>
   </w:style>
   <w:style w:customStyle="1" w:styleId="ListHeading" w:type="paragraph">
-    <w:name w:val="List Heading"/>
+    <w:name w:val="ListHeading"/>
     <w:basedOn w:val="Normal"/>
     <w:qFormat/>
     <w:pPr>
@@ -11081,30 +10905,7 @@
         <w:b/>
         <w:bCs/>
       </w:rPr>
-      <w:tcPr>
-        <w:shd w:color="auto" w:fill="F2F2F2" w:val="clear"/>
-      </w:tcPr>
     </w:tblStylePr>
-  </w:style>
-  <w:style w:type="paragraph" w:customStyle="1" w:styleId="CoverLine">
-    <w:name w:val="CoverLine"/>
-    <w:basedOn w:val="BodyText"/>
-    <w:qFormat/>
-  </w:style>
-  <w:style w:type="paragraph" w:customStyle="1" w:styleId="FigureCaption">
-    <w:name w:val="FigureCaption"/>
-    <w:basedOn w:val="BodyText"/>
-    <w:qFormat/>
-  </w:style>
-  <w:style w:type="paragraph" w:customStyle="1" w:styleId="SourceNote">
-    <w:name w:val="SourceNote"/>
-    <w:basedOn w:val="BodyText"/>
-    <w:qFormat/>
-  </w:style>
-  <w:style w:type="paragraph" w:customStyle="1" w:styleId="TableCaption">
-    <w:name w:val="TableCaption"/>
-    <w:basedOn w:val="BodyText"/>
-    <w:qFormat/>
   </w:style>
   <w:style w:type="paragraph" w:customStyle="1" w:styleId="SourceCode">
     <w:name w:val="Source Code"/>
@@ -11344,68 +11145,86 @@
 </file>
 
 <file path=word/diagrams/colors1.xml><?xml version="1.0" encoding="utf-8"?>
-<dgm:colorsDef xmlns:dgm="http://schemas.openxmlformats.org/drawingml/2006/diagram" xmlns:a="http://schemas.openxmlformats.org/drawingml/2006/main" uniqueId="urn:microsoft.com/office/officeart/2005/8/colors/accent1_2">
+<dgm:colorsDef xmlns:dgm="http://schemas.openxmlformats.org/drawingml/2006/diagram" xmlns:a="http://schemas.openxmlformats.org/drawingml/2006/main" uniqueId="urn:microsoft.com/office/officeart/2005/8/colors/accent0_1">
   <dgm:title val=""/>
   <dgm:desc val=""/>
   <dgm:catLst>
-    <dgm:cat type="accent1" pri="11200"/>
+    <dgm:cat type="mainScheme" pri="10100"/>
   </dgm:catLst>
   <dgm:styleLbl name="node0">
     <dgm:fillClrLst meth="repeat">
-      <a:schemeClr val="accent1"/>
+      <a:schemeClr val="lt1"/>
     </dgm:fillClrLst>
     <dgm:linClrLst meth="repeat">
-      <a:schemeClr val="lt1"/>
+      <a:schemeClr val="dk1">
+        <a:shade val="80000"/>
+      </a:schemeClr>
     </dgm:linClrLst>
     <dgm:effectClrLst/>
     <dgm:txLinClrLst/>
-    <dgm:txFillClrLst/>
+    <dgm:txFillClrLst meth="repeat">
+      <a:schemeClr val="dk1"/>
+    </dgm:txFillClrLst>
+    <dgm:txEffectClrLst/>
+  </dgm:styleLbl>
+  <dgm:styleLbl name="node1">
+    <dgm:fillClrLst meth="repeat">
+      <a:schemeClr val="lt1"/>
+    </dgm:fillClrLst>
+    <dgm:linClrLst meth="repeat">
+      <a:schemeClr val="dk1">
+        <a:shade val="80000"/>
+      </a:schemeClr>
+    </dgm:linClrLst>
+    <dgm:effectClrLst/>
+    <dgm:txLinClrLst/>
+    <dgm:txFillClrLst meth="repeat">
+      <a:schemeClr val="dk1"/>
+    </dgm:txFillClrLst>
     <dgm:txEffectClrLst/>
   </dgm:styleLbl>
   <dgm:styleLbl name="alignNode1">
     <dgm:fillClrLst meth="repeat">
-      <a:schemeClr val="accent1"/>
+      <a:schemeClr val="lt1"/>
     </dgm:fillClrLst>
     <dgm:linClrLst meth="repeat">
-      <a:schemeClr val="accent1"/>
+      <a:schemeClr val="dk1">
+        <a:shade val="80000"/>
+      </a:schemeClr>
     </dgm:linClrLst>
     <dgm:effectClrLst/>
     <dgm:txLinClrLst/>
-    <dgm:txFillClrLst/>
-    <dgm:txEffectClrLst/>
-  </dgm:styleLbl>
-  <dgm:styleLbl name="node1">
-    <dgm:fillClrLst meth="repeat">
-      <a:schemeClr val="accent1"/>
-    </dgm:fillClrLst>
-    <dgm:linClrLst meth="repeat">
-      <a:schemeClr val="lt1"/>
-    </dgm:linClrLst>
-    <dgm:effectClrLst/>
-    <dgm:txLinClrLst/>
-    <dgm:txFillClrLst/>
+    <dgm:txFillClrLst meth="repeat">
+      <a:schemeClr val="dk1"/>
+    </dgm:txFillClrLst>
     <dgm:txEffectClrLst/>
   </dgm:styleLbl>
   <dgm:styleLbl name="lnNode1">
     <dgm:fillClrLst meth="repeat">
-      <a:schemeClr val="accent1"/>
+      <a:schemeClr val="lt1"/>
     </dgm:fillClrLst>
     <dgm:linClrLst meth="repeat">
-      <a:schemeClr val="lt1"/>
+      <a:schemeClr val="dk1">
+        <a:shade val="80000"/>
+      </a:schemeClr>
     </dgm:linClrLst>
     <dgm:effectClrLst/>
     <dgm:txLinClrLst/>
-    <dgm:txFillClrLst/>
+    <dgm:txFillClrLst meth="repeat">
+      <a:schemeClr val="dk1"/>
+    </dgm:txFillClrLst>
     <dgm:txEffectClrLst/>
   </dgm:styleLbl>
   <dgm:styleLbl name="vennNode1">
     <dgm:fillClrLst meth="repeat">
-      <a:schemeClr val="accent1">
+      <a:schemeClr val="lt1">
         <a:alpha val="50000"/>
       </a:schemeClr>
     </dgm:fillClrLst>
     <dgm:linClrLst meth="repeat">
-      <a:schemeClr val="lt1"/>
+      <a:schemeClr val="dk1">
+        <a:shade val="80000"/>
+      </a:schemeClr>
     </dgm:linClrLst>
     <dgm:effectClrLst/>
     <dgm:txLinClrLst/>
@@ -11414,48 +11233,62 @@
   </dgm:styleLbl>
   <dgm:styleLbl name="node2">
     <dgm:fillClrLst meth="repeat">
-      <a:schemeClr val="accent1"/>
+      <a:schemeClr val="lt1"/>
     </dgm:fillClrLst>
     <dgm:linClrLst meth="repeat">
-      <a:schemeClr val="lt1"/>
+      <a:schemeClr val="dk1">
+        <a:shade val="80000"/>
+      </a:schemeClr>
     </dgm:linClrLst>
     <dgm:effectClrLst/>
     <dgm:txLinClrLst/>
-    <dgm:txFillClrLst/>
+    <dgm:txFillClrLst meth="repeat">
+      <a:schemeClr val="dk1"/>
+    </dgm:txFillClrLst>
     <dgm:txEffectClrLst/>
   </dgm:styleLbl>
   <dgm:styleLbl name="node3">
     <dgm:fillClrLst meth="repeat">
-      <a:schemeClr val="accent1"/>
+      <a:schemeClr val="lt1"/>
     </dgm:fillClrLst>
     <dgm:linClrLst meth="repeat">
-      <a:schemeClr val="lt1"/>
+      <a:schemeClr val="dk1">
+        <a:shade val="80000"/>
+      </a:schemeClr>
     </dgm:linClrLst>
     <dgm:effectClrLst/>
     <dgm:txLinClrLst/>
-    <dgm:txFillClrLst/>
+    <dgm:txFillClrLst meth="repeat">
+      <a:schemeClr val="dk1"/>
+    </dgm:txFillClrLst>
     <dgm:txEffectClrLst/>
   </dgm:styleLbl>
   <dgm:styleLbl name="node4">
     <dgm:fillClrLst meth="repeat">
-      <a:schemeClr val="accent1"/>
+      <a:schemeClr val="lt1"/>
     </dgm:fillClrLst>
     <dgm:linClrLst meth="repeat">
-      <a:schemeClr val="lt1"/>
+      <a:schemeClr val="dk1">
+        <a:shade val="80000"/>
+      </a:schemeClr>
     </dgm:linClrLst>
     <dgm:effectClrLst/>
     <dgm:txLinClrLst/>
-    <dgm:txFillClrLst/>
+    <dgm:txFillClrLst meth="repeat">
+      <a:schemeClr val="dk1"/>
+    </dgm:txFillClrLst>
     <dgm:txEffectClrLst/>
   </dgm:styleLbl>
   <dgm:styleLbl name="fgImgPlace1">
     <dgm:fillClrLst meth="repeat">
-      <a:schemeClr val="accent1">
-        <a:tint val="50000"/>
+      <a:schemeClr val="dk1">
+        <a:tint val="40000"/>
       </a:schemeClr>
     </dgm:fillClrLst>
     <dgm:linClrLst meth="repeat">
-      <a:schemeClr val="lt1"/>
+      <a:schemeClr val="dk1">
+        <a:shade val="80000"/>
+      </a:schemeClr>
     </dgm:linClrLst>
     <dgm:effectClrLst/>
     <dgm:txLinClrLst/>
@@ -11466,12 +11299,14 @@
   </dgm:styleLbl>
   <dgm:styleLbl name="alignImgPlace1">
     <dgm:fillClrLst meth="repeat">
-      <a:schemeClr val="accent1">
-        <a:tint val="50000"/>
+      <a:schemeClr val="dk1">
+        <a:tint val="40000"/>
       </a:schemeClr>
     </dgm:fillClrLst>
     <dgm:linClrLst meth="repeat">
-      <a:schemeClr val="lt1"/>
+      <a:schemeClr val="dk1">
+        <a:shade val="80000"/>
+      </a:schemeClr>
     </dgm:linClrLst>
     <dgm:effectClrLst/>
     <dgm:txLinClrLst/>
@@ -11482,12 +11317,14 @@
   </dgm:styleLbl>
   <dgm:styleLbl name="bgImgPlace1">
     <dgm:fillClrLst meth="repeat">
-      <a:schemeClr val="accent1">
-        <a:tint val="50000"/>
+      <a:schemeClr val="dk1">
+        <a:tint val="40000"/>
       </a:schemeClr>
     </dgm:fillClrLst>
     <dgm:linClrLst meth="repeat">
-      <a:schemeClr val="lt1"/>
+      <a:schemeClr val="dk1">
+        <a:shade val="80000"/>
+      </a:schemeClr>
     </dgm:linClrLst>
     <dgm:effectClrLst/>
     <dgm:txLinClrLst/>
@@ -11498,58 +11335,64 @@
   </dgm:styleLbl>
   <dgm:styleLbl name="sibTrans2D1">
     <dgm:fillClrLst meth="repeat">
-      <a:schemeClr val="accent1">
+      <a:schemeClr val="dk1">
         <a:tint val="60000"/>
       </a:schemeClr>
     </dgm:fillClrLst>
     <dgm:linClrLst meth="repeat">
-      <a:schemeClr val="accent1">
+      <a:schemeClr val="dk1">
         <a:tint val="60000"/>
       </a:schemeClr>
     </dgm:linClrLst>
     <dgm:effectClrLst/>
     <dgm:txLinClrLst/>
-    <dgm:txFillClrLst/>
+    <dgm:txFillClrLst meth="repeat">
+      <a:schemeClr val="dk1"/>
+    </dgm:txFillClrLst>
     <dgm:txEffectClrLst/>
   </dgm:styleLbl>
   <dgm:styleLbl name="fgSibTrans2D1">
     <dgm:fillClrLst meth="repeat">
-      <a:schemeClr val="accent1">
+      <a:schemeClr val="dk1">
         <a:tint val="60000"/>
       </a:schemeClr>
     </dgm:fillClrLst>
     <dgm:linClrLst meth="repeat">
-      <a:schemeClr val="accent1">
+      <a:schemeClr val="dk1">
         <a:tint val="60000"/>
       </a:schemeClr>
     </dgm:linClrLst>
     <dgm:effectClrLst/>
     <dgm:txLinClrLst/>
-    <dgm:txFillClrLst/>
+    <dgm:txFillClrLst meth="repeat">
+      <a:schemeClr val="dk1"/>
+    </dgm:txFillClrLst>
     <dgm:txEffectClrLst/>
   </dgm:styleLbl>
   <dgm:styleLbl name="bgSibTrans2D1">
     <dgm:fillClrLst meth="repeat">
-      <a:schemeClr val="accent1">
+      <a:schemeClr val="dk1">
         <a:tint val="60000"/>
       </a:schemeClr>
     </dgm:fillClrLst>
     <dgm:linClrLst meth="repeat">
-      <a:schemeClr val="accent1">
+      <a:schemeClr val="dk1">
         <a:tint val="60000"/>
       </a:schemeClr>
     </dgm:linClrLst>
     <dgm:effectClrLst/>
     <dgm:txLinClrLst/>
-    <dgm:txFillClrLst/>
+    <dgm:txFillClrLst meth="repeat">
+      <a:schemeClr val="dk1"/>
+    </dgm:txFillClrLst>
     <dgm:txEffectClrLst/>
   </dgm:styleLbl>
   <dgm:styleLbl name="sibTrans1D1">
     <dgm:fillClrLst meth="repeat">
-      <a:schemeClr val="accent1"/>
+      <a:schemeClr val="dk1"/>
     </dgm:fillClrLst>
     <dgm:linClrLst meth="repeat">
-      <a:schemeClr val="accent1"/>
+      <a:schemeClr val="dk1"/>
     </dgm:linClrLst>
     <dgm:effectClrLst/>
     <dgm:txLinClrLst/>
@@ -11560,12 +11403,10 @@
   </dgm:styleLbl>
   <dgm:styleLbl name="callout">
     <dgm:fillClrLst meth="repeat">
-      <a:schemeClr val="accent1"/>
+      <a:schemeClr val="dk1"/>
     </dgm:fillClrLst>
     <dgm:linClrLst meth="repeat">
-      <a:schemeClr val="accent1">
-        <a:tint val="50000"/>
-      </a:schemeClr>
+      <a:schemeClr val="dk1"/>
     </dgm:linClrLst>
     <dgm:effectClrLst/>
     <dgm:txLinClrLst/>
@@ -11576,116 +11417,130 @@
   </dgm:styleLbl>
   <dgm:styleLbl name="asst0">
     <dgm:fillClrLst meth="repeat">
-      <a:schemeClr val="accent1"/>
+      <a:schemeClr val="lt1"/>
     </dgm:fillClrLst>
     <dgm:linClrLst meth="repeat">
+      <a:schemeClr val="dk1">
+        <a:shade val="80000"/>
+      </a:schemeClr>
+    </dgm:linClrLst>
+    <dgm:effectClrLst/>
+    <dgm:txLinClrLst/>
+    <dgm:txFillClrLst meth="repeat">
+      <a:schemeClr val="dk1"/>
+    </dgm:txFillClrLst>
+    <dgm:txEffectClrLst/>
+  </dgm:styleLbl>
+  <dgm:styleLbl name="asst1">
+    <dgm:fillClrLst meth="repeat">
       <a:schemeClr val="lt1"/>
+    </dgm:fillClrLst>
+    <dgm:linClrLst meth="repeat">
+      <a:schemeClr val="dk1">
+        <a:shade val="80000"/>
+      </a:schemeClr>
+    </dgm:linClrLst>
+    <dgm:effectClrLst/>
+    <dgm:txLinClrLst/>
+    <dgm:txFillClrLst meth="repeat">
+      <a:schemeClr val="dk1"/>
+    </dgm:txFillClrLst>
+    <dgm:txEffectClrLst/>
+  </dgm:styleLbl>
+  <dgm:styleLbl name="asst2">
+    <dgm:fillClrLst meth="repeat">
+      <a:schemeClr val="lt1"/>
+    </dgm:fillClrLst>
+    <dgm:linClrLst meth="repeat">
+      <a:schemeClr val="dk1">
+        <a:shade val="80000"/>
+      </a:schemeClr>
+    </dgm:linClrLst>
+    <dgm:effectClrLst/>
+    <dgm:txLinClrLst/>
+    <dgm:txFillClrLst meth="repeat">
+      <a:schemeClr val="dk1"/>
+    </dgm:txFillClrLst>
+    <dgm:txEffectClrLst/>
+  </dgm:styleLbl>
+  <dgm:styleLbl name="asst3">
+    <dgm:fillClrLst meth="repeat">
+      <a:schemeClr val="lt1"/>
+    </dgm:fillClrLst>
+    <dgm:linClrLst meth="repeat">
+      <a:schemeClr val="dk1">
+        <a:shade val="80000"/>
+      </a:schemeClr>
+    </dgm:linClrLst>
+    <dgm:effectClrLst/>
+    <dgm:txLinClrLst/>
+    <dgm:txFillClrLst meth="repeat">
+      <a:schemeClr val="dk1"/>
+    </dgm:txFillClrLst>
+    <dgm:txEffectClrLst/>
+  </dgm:styleLbl>
+  <dgm:styleLbl name="asst4">
+    <dgm:fillClrLst meth="repeat">
+      <a:schemeClr val="lt1"/>
+    </dgm:fillClrLst>
+    <dgm:linClrLst meth="repeat">
+      <a:schemeClr val="dk1">
+        <a:shade val="80000"/>
+      </a:schemeClr>
+    </dgm:linClrLst>
+    <dgm:effectClrLst/>
+    <dgm:txLinClrLst/>
+    <dgm:txFillClrLst meth="repeat">
+      <a:schemeClr val="dk1"/>
+    </dgm:txFillClrLst>
+    <dgm:txEffectClrLst/>
+  </dgm:styleLbl>
+  <dgm:styleLbl name="parChTrans2D1">
+    <dgm:fillClrLst meth="repeat">
+      <a:schemeClr val="dk1">
+        <a:tint val="60000"/>
+      </a:schemeClr>
+    </dgm:fillClrLst>
+    <dgm:linClrLst meth="repeat">
+      <a:schemeClr val="dk1">
+        <a:tint val="60000"/>
+      </a:schemeClr>
     </dgm:linClrLst>
     <dgm:effectClrLst/>
     <dgm:txLinClrLst/>
     <dgm:txFillClrLst/>
     <dgm:txEffectClrLst/>
   </dgm:styleLbl>
-  <dgm:styleLbl name="asst1">
+  <dgm:styleLbl name="parChTrans2D2">
     <dgm:fillClrLst meth="repeat">
-      <a:schemeClr val="accent1"/>
+      <a:schemeClr val="dk1"/>
     </dgm:fillClrLst>
     <dgm:linClrLst meth="repeat">
-      <a:schemeClr val="lt1"/>
+      <a:schemeClr val="dk1"/>
     </dgm:linClrLst>
     <dgm:effectClrLst/>
     <dgm:txLinClrLst/>
     <dgm:txFillClrLst/>
     <dgm:txEffectClrLst/>
   </dgm:styleLbl>
-  <dgm:styleLbl name="asst2">
+  <dgm:styleLbl name="parChTrans2D3">
     <dgm:fillClrLst meth="repeat">
-      <a:schemeClr val="accent1"/>
+      <a:schemeClr val="dk1"/>
     </dgm:fillClrLst>
     <dgm:linClrLst meth="repeat">
-      <a:schemeClr val="lt1"/>
+      <a:schemeClr val="dk1"/>
     </dgm:linClrLst>
     <dgm:effectClrLst/>
     <dgm:txLinClrLst/>
     <dgm:txFillClrLst/>
     <dgm:txEffectClrLst/>
   </dgm:styleLbl>
-  <dgm:styleLbl name="asst3">
+  <dgm:styleLbl name="parChTrans2D4">
     <dgm:fillClrLst meth="repeat">
-      <a:schemeClr val="accent1"/>
+      <a:schemeClr val="dk1"/>
     </dgm:fillClrLst>
     <dgm:linClrLst meth="repeat">
-      <a:schemeClr val="lt1"/>
-    </dgm:linClrLst>
-    <dgm:effectClrLst/>
-    <dgm:txLinClrLst/>
-    <dgm:txFillClrLst/>
-    <dgm:txEffectClrLst/>
-  </dgm:styleLbl>
-  <dgm:styleLbl name="asst4">
-    <dgm:fillClrLst meth="repeat">
-      <a:schemeClr val="accent1"/>
-    </dgm:fillClrLst>
-    <dgm:linClrLst meth="repeat">
-      <a:schemeClr val="lt1"/>
-    </dgm:linClrLst>
-    <dgm:effectClrLst/>
-    <dgm:txLinClrLst/>
-    <dgm:txFillClrLst/>
-    <dgm:txEffectClrLst/>
-  </dgm:styleLbl>
-  <dgm:styleLbl name="parChTrans2D1">
-    <dgm:fillClrLst meth="repeat">
-      <a:schemeClr val="accent1">
-        <a:tint val="60000"/>
-      </a:schemeClr>
-    </dgm:fillClrLst>
-    <dgm:linClrLst meth="repeat">
-      <a:schemeClr val="accent1">
-        <a:tint val="60000"/>
-      </a:schemeClr>
-    </dgm:linClrLst>
-    <dgm:effectClrLst/>
-    <dgm:txLinClrLst/>
-    <dgm:txFillClrLst meth="repeat">
-      <a:schemeClr val="lt1"/>
-    </dgm:txFillClrLst>
-    <dgm:txEffectClrLst/>
-  </dgm:styleLbl>
-  <dgm:styleLbl name="parChTrans2D2">
-    <dgm:fillClrLst meth="repeat">
-      <a:schemeClr val="accent1"/>
-    </dgm:fillClrLst>
-    <dgm:linClrLst meth="repeat">
-      <a:schemeClr val="accent1"/>
-    </dgm:linClrLst>
-    <dgm:effectClrLst/>
-    <dgm:txLinClrLst/>
-    <dgm:txFillClrLst meth="repeat">
-      <a:schemeClr val="lt1"/>
-    </dgm:txFillClrLst>
-    <dgm:txEffectClrLst/>
-  </dgm:styleLbl>
-  <dgm:styleLbl name="parChTrans2D3">
-    <dgm:fillClrLst meth="repeat">
-      <a:schemeClr val="accent1"/>
-    </dgm:fillClrLst>
-    <dgm:linClrLst meth="repeat">
-      <a:schemeClr val="accent1"/>
-    </dgm:linClrLst>
-    <dgm:effectClrLst/>
-    <dgm:txLinClrLst/>
-    <dgm:txFillClrLst meth="repeat">
-      <a:schemeClr val="lt1"/>
-    </dgm:txFillClrLst>
-    <dgm:txEffectClrLst/>
-  </dgm:styleLbl>
-  <dgm:styleLbl name="parChTrans2D4">
-    <dgm:fillClrLst meth="repeat">
-      <a:schemeClr val="accent1"/>
-    </dgm:fillClrLst>
-    <dgm:linClrLst meth="repeat">
-      <a:schemeClr val="accent1"/>
+      <a:schemeClr val="dk1"/>
     </dgm:linClrLst>
     <dgm:effectClrLst/>
     <dgm:txLinClrLst/>
@@ -11696,10 +11551,10 @@
   </dgm:styleLbl>
   <dgm:styleLbl name="parChTrans1D1">
     <dgm:fillClrLst meth="repeat">
-      <a:schemeClr val="accent1"/>
+      <a:schemeClr val="dk1"/>
     </dgm:fillClrLst>
     <dgm:linClrLst meth="repeat">
-      <a:schemeClr val="accent1">
+      <a:schemeClr val="dk1">
         <a:shade val="60000"/>
       </a:schemeClr>
     </dgm:linClrLst>
@@ -11712,10 +11567,10 @@
   </dgm:styleLbl>
   <dgm:styleLbl name="parChTrans1D2">
     <dgm:fillClrLst meth="repeat">
-      <a:schemeClr val="accent1"/>
+      <a:schemeClr val="dk1"/>
     </dgm:fillClrLst>
     <dgm:linClrLst meth="repeat">
-      <a:schemeClr val="accent1">
+      <a:schemeClr val="dk1">
         <a:shade val="60000"/>
       </a:schemeClr>
     </dgm:linClrLst>
@@ -11728,10 +11583,10 @@
   </dgm:styleLbl>
   <dgm:styleLbl name="parChTrans1D3">
     <dgm:fillClrLst meth="repeat">
-      <a:schemeClr val="accent1"/>
+      <a:schemeClr val="dk1"/>
     </dgm:fillClrLst>
     <dgm:linClrLst meth="repeat">
-      <a:schemeClr val="accent1">
+      <a:schemeClr val="dk1">
         <a:shade val="80000"/>
       </a:schemeClr>
     </dgm:linClrLst>
@@ -11744,10 +11599,10 @@
   </dgm:styleLbl>
   <dgm:styleLbl name="parChTrans1D4">
     <dgm:fillClrLst meth="repeat">
-      <a:schemeClr val="accent1"/>
+      <a:schemeClr val="dk1"/>
     </dgm:fillClrLst>
     <dgm:linClrLst meth="repeat">
-      <a:schemeClr val="accent1">
+      <a:schemeClr val="dk1">
         <a:shade val="80000"/>
       </a:schemeClr>
     </dgm:linClrLst>
@@ -11760,12 +11615,13 @@
   </dgm:styleLbl>
   <dgm:styleLbl name="fgAcc1">
     <dgm:fillClrLst meth="repeat">
-      <a:schemeClr val="lt1">
+      <a:schemeClr val="dk1">
         <a:alpha val="90000"/>
+        <a:tint val="40000"/>
       </a:schemeClr>
     </dgm:fillClrLst>
     <dgm:linClrLst meth="repeat">
-      <a:schemeClr val="accent1"/>
+      <a:schemeClr val="dk1"/>
     </dgm:linClrLst>
     <dgm:effectClrLst/>
     <dgm:txLinClrLst/>
@@ -11776,12 +11632,13 @@
   </dgm:styleLbl>
   <dgm:styleLbl name="conFgAcc1">
     <dgm:fillClrLst meth="repeat">
-      <a:schemeClr val="lt1">
+      <a:schemeClr val="dk1">
         <a:alpha val="90000"/>
+        <a:tint val="40000"/>
       </a:schemeClr>
     </dgm:fillClrLst>
     <dgm:linClrLst meth="repeat">
-      <a:schemeClr val="accent1"/>
+      <a:schemeClr val="dk1"/>
     </dgm:linClrLst>
     <dgm:effectClrLst/>
     <dgm:txLinClrLst/>
@@ -11792,12 +11649,13 @@
   </dgm:styleLbl>
   <dgm:styleLbl name="alignAcc1">
     <dgm:fillClrLst meth="repeat">
-      <a:schemeClr val="lt1">
+      <a:schemeClr val="dk1">
         <a:alpha val="90000"/>
+        <a:tint val="40000"/>
       </a:schemeClr>
     </dgm:fillClrLst>
     <dgm:linClrLst meth="repeat">
-      <a:schemeClr val="accent1"/>
+      <a:schemeClr val="dk1"/>
     </dgm:linClrLst>
     <dgm:effectClrLst/>
     <dgm:txLinClrLst/>
@@ -11808,12 +11666,13 @@
   </dgm:styleLbl>
   <dgm:styleLbl name="trAlignAcc1">
     <dgm:fillClrLst meth="repeat">
-      <a:schemeClr val="lt1">
+      <a:schemeClr val="dk1">
         <a:alpha val="40000"/>
+        <a:tint val="40000"/>
       </a:schemeClr>
     </dgm:fillClrLst>
     <dgm:linClrLst meth="repeat">
-      <a:schemeClr val="accent1"/>
+      <a:schemeClr val="dk1"/>
     </dgm:linClrLst>
     <dgm:effectClrLst/>
     <dgm:txLinClrLst/>
@@ -11824,12 +11683,13 @@
   </dgm:styleLbl>
   <dgm:styleLbl name="bgAcc1">
     <dgm:fillClrLst meth="repeat">
-      <a:schemeClr val="lt1">
+      <a:schemeClr val="dk1">
         <a:alpha val="90000"/>
+        <a:tint val="40000"/>
       </a:schemeClr>
     </dgm:fillClrLst>
     <dgm:linClrLst meth="repeat">
-      <a:schemeClr val="accent1"/>
+      <a:schemeClr val="dk1"/>
     </dgm:linClrLst>
     <dgm:effectClrLst/>
     <dgm:txLinClrLst/>
@@ -11843,7 +11703,7 @@
       <a:schemeClr val="lt1"/>
     </dgm:fillClrLst>
     <dgm:linClrLst meth="repeat">
-      <a:schemeClr val="accent1"/>
+      <a:schemeClr val="dk1"/>
     </dgm:linClrLst>
     <dgm:effectClrLst/>
     <dgm:txLinClrLst/>
@@ -11857,7 +11717,7 @@
       <a:schemeClr val="lt1"/>
     </dgm:fillClrLst>
     <dgm:linClrLst meth="repeat">
-      <a:schemeClr val="accent1"/>
+      <a:schemeClr val="dk1"/>
     </dgm:linClrLst>
     <dgm:effectClrLst/>
     <dgm:txLinClrLst/>
@@ -11871,7 +11731,7 @@
       <a:schemeClr val="lt1"/>
     </dgm:fillClrLst>
     <dgm:linClrLst meth="repeat">
-      <a:schemeClr val="accent1"/>
+      <a:schemeClr val="dk1"/>
     </dgm:linClrLst>
     <dgm:effectClrLst/>
     <dgm:txLinClrLst/>
@@ -11882,15 +11742,14 @@
   </dgm:styleLbl>
   <dgm:styleLbl name="fgAccFollowNode1">
     <dgm:fillClrLst meth="repeat">
-      <a:schemeClr val="accent1">
+      <a:schemeClr val="lt1">
         <a:alpha val="90000"/>
         <a:tint val="40000"/>
       </a:schemeClr>
     </dgm:fillClrLst>
     <dgm:linClrLst meth="repeat">
-      <a:schemeClr val="accent1">
+      <a:schemeClr val="dk1">
         <a:alpha val="90000"/>
-        <a:tint val="40000"/>
       </a:schemeClr>
     </dgm:linClrLst>
     <dgm:effectClrLst/>
@@ -11902,15 +11761,14 @@
   </dgm:styleLbl>
   <dgm:styleLbl name="alignAccFollowNode1">
     <dgm:fillClrLst meth="repeat">
-      <a:schemeClr val="accent1">
+      <a:schemeClr val="lt1">
         <a:alpha val="90000"/>
         <a:tint val="40000"/>
       </a:schemeClr>
     </dgm:fillClrLst>
     <dgm:linClrLst meth="repeat">
-      <a:schemeClr val="accent1">
+      <a:schemeClr val="dk1">
         <a:alpha val="90000"/>
-        <a:tint val="40000"/>
       </a:schemeClr>
     </dgm:linClrLst>
     <dgm:effectClrLst/>
@@ -11922,15 +11780,14 @@
   </dgm:styleLbl>
   <dgm:styleLbl name="bgAccFollowNode1">
     <dgm:fillClrLst meth="repeat">
-      <a:schemeClr val="accent1">
+      <a:schemeClr val="lt1">
         <a:alpha val="90000"/>
         <a:tint val="40000"/>
       </a:schemeClr>
     </dgm:fillClrLst>
     <dgm:linClrLst meth="repeat">
-      <a:schemeClr val="accent1">
+      <a:schemeClr val="dk1">
         <a:alpha val="90000"/>
-        <a:tint val="40000"/>
       </a:schemeClr>
     </dgm:linClrLst>
     <dgm:effectClrLst/>
@@ -11942,12 +11799,13 @@
   </dgm:styleLbl>
   <dgm:styleLbl name="fgAcc0">
     <dgm:fillClrLst meth="repeat">
-      <a:schemeClr val="lt1">
+      <a:schemeClr val="dk1">
         <a:alpha val="90000"/>
+        <a:tint val="40000"/>
       </a:schemeClr>
     </dgm:fillClrLst>
     <dgm:linClrLst meth="repeat">
-      <a:schemeClr val="accent1"/>
+      <a:schemeClr val="dk1"/>
     </dgm:linClrLst>
     <dgm:effectClrLst/>
     <dgm:txLinClrLst/>
@@ -11958,12 +11816,13 @@
   </dgm:styleLbl>
   <dgm:styleLbl name="fgAcc2">
     <dgm:fillClrLst meth="repeat">
-      <a:schemeClr val="lt1">
+      <a:schemeClr val="dk1">
         <a:alpha val="90000"/>
+        <a:tint val="40000"/>
       </a:schemeClr>
     </dgm:fillClrLst>
     <dgm:linClrLst meth="repeat">
-      <a:schemeClr val="accent1"/>
+      <a:schemeClr val="dk1"/>
     </dgm:linClrLst>
     <dgm:effectClrLst/>
     <dgm:txLinClrLst/>
@@ -11974,12 +11833,13 @@
   </dgm:styleLbl>
   <dgm:styleLbl name="fgAcc3">
     <dgm:fillClrLst meth="repeat">
-      <a:schemeClr val="lt1">
+      <a:schemeClr val="dk1">
         <a:alpha val="90000"/>
+        <a:tint val="40000"/>
       </a:schemeClr>
     </dgm:fillClrLst>
     <dgm:linClrLst meth="repeat">
-      <a:schemeClr val="accent1"/>
+      <a:schemeClr val="dk1"/>
     </dgm:linClrLst>
     <dgm:effectClrLst/>
     <dgm:txLinClrLst/>
@@ -11990,12 +11850,13 @@
   </dgm:styleLbl>
   <dgm:styleLbl name="fgAcc4">
     <dgm:fillClrLst meth="repeat">
-      <a:schemeClr val="lt1">
+      <a:schemeClr val="dk1">
         <a:alpha val="90000"/>
+        <a:tint val="40000"/>
       </a:schemeClr>
     </dgm:fillClrLst>
     <dgm:linClrLst meth="repeat">
-      <a:schemeClr val="accent1"/>
+      <a:schemeClr val="dk1"/>
     </dgm:linClrLst>
     <dgm:effectClrLst/>
     <dgm:txLinClrLst/>
@@ -12006,12 +11867,12 @@
   </dgm:styleLbl>
   <dgm:styleLbl name="bgShp">
     <dgm:fillClrLst meth="repeat">
-      <a:schemeClr val="accent1">
+      <a:schemeClr val="dk1">
         <a:tint val="40000"/>
       </a:schemeClr>
     </dgm:fillClrLst>
     <dgm:linClrLst meth="repeat">
-      <a:schemeClr val="accent1"/>
+      <a:schemeClr val="dk1"/>
     </dgm:linClrLst>
     <dgm:effectClrLst/>
     <dgm:txLinClrLst/>
@@ -12022,12 +11883,12 @@
   </dgm:styleLbl>
   <dgm:styleLbl name="dkBgShp">
     <dgm:fillClrLst meth="repeat">
-      <a:schemeClr val="accent1">
+      <a:schemeClr val="dk1">
         <a:shade val="80000"/>
       </a:schemeClr>
     </dgm:fillClrLst>
     <dgm:linClrLst meth="repeat">
-      <a:schemeClr val="accent1"/>
+      <a:schemeClr val="dk1"/>
     </dgm:linClrLst>
     <dgm:effectClrLst/>
     <dgm:txLinClrLst/>
@@ -12038,13 +11899,13 @@
   </dgm:styleLbl>
   <dgm:styleLbl name="trBgShp">
     <dgm:fillClrLst meth="repeat">
-      <a:schemeClr val="accent1">
+      <a:schemeClr val="dk1">
         <a:tint val="50000"/>
         <a:alpha val="40000"/>
       </a:schemeClr>
     </dgm:fillClrLst>
     <dgm:linClrLst meth="repeat">
-      <a:schemeClr val="accent1"/>
+      <a:schemeClr val="dk1"/>
     </dgm:linClrLst>
     <dgm:effectClrLst/>
     <dgm:txLinClrLst/>
@@ -12055,7 +11916,7 @@
   </dgm:styleLbl>
   <dgm:styleLbl name="fgShp">
     <dgm:fillClrLst meth="repeat">
-      <a:schemeClr val="accent1">
+      <a:schemeClr val="dk1">
         <a:tint val="60000"/>
       </a:schemeClr>
     </dgm:fillClrLst>
@@ -12093,8 +11954,8 @@
 <file path=word/diagrams/data1.xml><?xml version="1.0" encoding="utf-8"?>
 <dgm:dataModel xmlns:dgm="http://schemas.openxmlformats.org/drawingml/2006/diagram" xmlns:a="http://schemas.openxmlformats.org/drawingml/2006/main">
   <dgm:ptLst>
-    <dgm:pt modelId="{762ED0C3-85ED-4832-9786-9D6696329E05}" type="doc">
-      <dgm:prSet loTypeId="urn:microsoft.com/office/officeart/2005/8/layout/vList5" loCatId="list" qsTypeId="urn:microsoft.com/office/officeart/2005/8/quickstyle/simple1" qsCatId="simple" csTypeId="urn:microsoft.com/office/officeart/2005/8/colors/accent1_2" csCatId="accent1" phldr="0"/>
+    <dgm:pt modelId="{C26964BC-0A35-45B2-99C6-1A6B8D245F89}" type="doc">
+      <dgm:prSet loTypeId="urn:microsoft.com/office/officeart/2005/8/layout/vList5" loCatId="list" qsTypeId="urn:microsoft.com/office/officeart/2005/8/quickstyle/simple1" qsCatId="simple" csTypeId="urn:microsoft.com/office/officeart/2005/8/colors/accent0_1" csCatId="mainScheme" phldr="0"/>
       <dgm:spPr/>
       <dgm:t>
         <a:bodyPr/>
@@ -12104,7 +11965,7 @@
         </a:p>
       </dgm:t>
     </dgm:pt>
-    <dgm:pt modelId="{0EB65470-F3EA-4B05-9593-A15153A14EA2}">
+    <dgm:pt modelId="{A5C483E8-DB06-4703-BDAE-61A993FAEE32}">
       <dgm:prSet phldrT="[Text]"/>
       <dgm:spPr/>
       <dgm:t>
@@ -12118,7 +11979,7 @@
         </a:p>
       </dgm:t>
     </dgm:pt>
-    <dgm:pt modelId="{AAC033DB-9721-4827-B0B7-3D5FCC1DB301}" type="parTrans" cxnId="{DCDDE2F0-18C5-4356-BF8C-A2D70F4939F9}">
+    <dgm:pt modelId="{BDC55087-D74E-4C3F-8512-7A5A2736FFE3}" type="parTrans" cxnId="{4C104022-B5CD-4A64-9A4B-5C0071F2A984}">
       <dgm:prSet/>
       <dgm:spPr/>
       <dgm:t>
@@ -12129,7 +11990,7 @@
         </a:p>
       </dgm:t>
     </dgm:pt>
-    <dgm:pt modelId="{DF64A2AB-1E70-4D5A-BEDE-7ACF06E3EC55}" type="sibTrans" cxnId="{DCDDE2F0-18C5-4356-BF8C-A2D70F4939F9}">
+    <dgm:pt modelId="{61BBFB2B-9B88-4642-87BD-D3088AD94E21}" type="sibTrans" cxnId="{4C104022-B5CD-4A64-9A4B-5C0071F2A984}">
       <dgm:prSet/>
       <dgm:spPr/>
       <dgm:t>
@@ -12140,7 +12001,7 @@
         </a:p>
       </dgm:t>
     </dgm:pt>
-    <dgm:pt modelId="{EA0A1F4B-9CF4-42DC-A07C-9482A243CA07}">
+    <dgm:pt modelId="{1FA4B074-674D-45FC-A05F-963B51E32DEE}">
       <dgm:prSet phldrT="[Text]"/>
       <dgm:spPr/>
       <dgm:t>
@@ -12154,7 +12015,7 @@
         </a:p>
       </dgm:t>
     </dgm:pt>
-    <dgm:pt modelId="{B2B3E6E3-7F0E-45D3-8967-0A5CBBBDFE23}" type="parTrans" cxnId="{D227FDA0-CFCD-4045-9F19-D65D0CB9D0A8}">
+    <dgm:pt modelId="{A446BADE-2ABD-451C-9FBC-06D529485B54}" type="parTrans" cxnId="{A4D49CB0-CB3B-4C06-95C6-0038144C897B}">
       <dgm:prSet/>
       <dgm:spPr/>
       <dgm:t>
@@ -12165,7 +12026,7 @@
         </a:p>
       </dgm:t>
     </dgm:pt>
-    <dgm:pt modelId="{BB1F997C-BADB-4A06-9AC3-68413806479B}" type="sibTrans" cxnId="{D227FDA0-CFCD-4045-9F19-D65D0CB9D0A8}">
+    <dgm:pt modelId="{53B3EAA8-20D7-4564-8DB2-5982F8B49116}" type="sibTrans" cxnId="{A4D49CB0-CB3B-4C06-95C6-0038144C897B}">
       <dgm:prSet/>
       <dgm:spPr/>
       <dgm:t>
@@ -12176,7 +12037,7 @@
         </a:p>
       </dgm:t>
     </dgm:pt>
-    <dgm:pt modelId="{F3345BF6-09BB-4F88-9FD0-2125AAFC23A0}">
+    <dgm:pt modelId="{595F6B9F-3702-4EEF-9D6D-6F2948272FEE}">
       <dgm:prSet phldrT="[Text]"/>
       <dgm:spPr/>
       <dgm:t>
@@ -12190,7 +12051,7 @@
         </a:p>
       </dgm:t>
     </dgm:pt>
-    <dgm:pt modelId="{609BBFC2-8094-4AD7-B5C4-0EF75B48CD5E}" type="parTrans" cxnId="{78A491D1-AC17-4267-8AA7-4D8FD5321202}">
+    <dgm:pt modelId="{CF542903-3BA9-4320-AAEB-A55A8524123B}" type="parTrans" cxnId="{CC4498C6-90D9-4F44-AE29-C33E6938474F}">
       <dgm:prSet/>
       <dgm:spPr/>
       <dgm:t>
@@ -12201,7 +12062,7 @@
         </a:p>
       </dgm:t>
     </dgm:pt>
-    <dgm:pt modelId="{C92A2609-B484-4765-90A4-8ACA89095483}" type="sibTrans" cxnId="{78A491D1-AC17-4267-8AA7-4D8FD5321202}">
+    <dgm:pt modelId="{FD2C1209-D444-4351-999F-20F135378670}" type="sibTrans" cxnId="{CC4498C6-90D9-4F44-AE29-C33E6938474F}">
       <dgm:prSet/>
       <dgm:spPr/>
       <dgm:t>
@@ -12212,7 +12073,7 @@
         </a:p>
       </dgm:t>
     </dgm:pt>
-    <dgm:pt modelId="{430C2BEF-C7E6-42E7-A9D0-C0DB65917882}">
+    <dgm:pt modelId="{7E980AD9-B89E-4022-BCD6-D5C4EF4AB0B0}">
       <dgm:prSet phldrT="[Text]"/>
       <dgm:spPr/>
       <dgm:t>
@@ -12226,7 +12087,7 @@
         </a:p>
       </dgm:t>
     </dgm:pt>
-    <dgm:pt modelId="{D8092021-4C08-46F6-B429-BABA058135A3}" type="parTrans" cxnId="{88E5D47D-74D2-4640-B66D-2087D51260B0}">
+    <dgm:pt modelId="{33692F20-3F61-4167-BF38-9F9181C1E18A}" type="parTrans" cxnId="{D7CD54A9-DA38-4F50-AA9B-50B61D2CD46F}">
       <dgm:prSet/>
       <dgm:spPr/>
       <dgm:t>
@@ -12237,7 +12098,7 @@
         </a:p>
       </dgm:t>
     </dgm:pt>
-    <dgm:pt modelId="{3D21AF4E-AC15-4803-B2F4-885B8DC1CD1D}" type="sibTrans" cxnId="{88E5D47D-74D2-4640-B66D-2087D51260B0}">
+    <dgm:pt modelId="{8F2174F3-8CDB-4071-A415-DB437E1DEA58}" type="sibTrans" cxnId="{D7CD54A9-DA38-4F50-AA9B-50B61D2CD46F}">
       <dgm:prSet/>
       <dgm:spPr/>
       <dgm:t>
@@ -12248,7 +12109,7 @@
         </a:p>
       </dgm:t>
     </dgm:pt>
-    <dgm:pt modelId="{378C455C-D9C2-410A-97E2-4369E5F731A7}">
+    <dgm:pt modelId="{5CA2F275-63D8-4B36-A6AF-864CCD2D85A0}">
       <dgm:prSet phldrT="[Text]"/>
       <dgm:spPr/>
       <dgm:t>
@@ -12262,7 +12123,7 @@
         </a:p>
       </dgm:t>
     </dgm:pt>
-    <dgm:pt modelId="{46961351-F9E1-4649-A34F-E3EEE4C3D16F}" type="parTrans" cxnId="{399A10C2-3CD7-4BFE-9118-296B53E41A68}">
+    <dgm:pt modelId="{6AC703C4-005A-4800-B428-FAAB8DFFC3E8}" type="parTrans" cxnId="{4B7DE63D-5733-4C47-BBCE-C064FB99B8CE}">
       <dgm:prSet/>
       <dgm:spPr/>
       <dgm:t>
@@ -12273,7 +12134,7 @@
         </a:p>
       </dgm:t>
     </dgm:pt>
-    <dgm:pt modelId="{F6944D2A-DE06-43B9-B228-562E96C32CCC}" type="sibTrans" cxnId="{399A10C2-3CD7-4BFE-9118-296B53E41A68}">
+    <dgm:pt modelId="{34B97BCB-61AC-4609-9599-F049E9D7F892}" type="sibTrans" cxnId="{4B7DE63D-5733-4C47-BBCE-C064FB99B8CE}">
       <dgm:prSet/>
       <dgm:spPr/>
       <dgm:t>
@@ -12284,7 +12145,7 @@
         </a:p>
       </dgm:t>
     </dgm:pt>
-    <dgm:pt modelId="{13712D41-724E-46E5-83E7-3C943BBBC397}">
+    <dgm:pt modelId="{E139E7D9-36C5-433A-911D-48199D0E2EE7}">
       <dgm:prSet phldrT="[Text]"/>
       <dgm:spPr/>
       <dgm:t>
@@ -12298,7 +12159,7 @@
         </a:p>
       </dgm:t>
     </dgm:pt>
-    <dgm:pt modelId="{A0BD6D3B-4FE9-4416-9187-240621F81E45}" type="parTrans" cxnId="{F9673B42-4C50-4DFB-A105-BCF9082A1640}">
+    <dgm:pt modelId="{EE90EAE8-6438-461E-A87E-201866ED41D6}" type="parTrans" cxnId="{67215D6F-A184-4291-9719-3B61C537CC5D}">
       <dgm:prSet/>
       <dgm:spPr/>
       <dgm:t>
@@ -12309,7 +12170,7 @@
         </a:p>
       </dgm:t>
     </dgm:pt>
-    <dgm:pt modelId="{6ED11FC6-7477-4CE3-A494-CFD00C59E802}" type="sibTrans" cxnId="{F9673B42-4C50-4DFB-A105-BCF9082A1640}">
+    <dgm:pt modelId="{0352E5DE-0574-4753-99B4-564AF8774685}" type="sibTrans" cxnId="{67215D6F-A184-4291-9719-3B61C537CC5D}">
       <dgm:prSet/>
       <dgm:spPr/>
       <dgm:t>
@@ -12320,7 +12181,7 @@
         </a:p>
       </dgm:t>
     </dgm:pt>
-    <dgm:pt modelId="{B2A00503-CDA4-4A80-AE1C-B932C56489DF}">
+    <dgm:pt modelId="{C76DCE53-9801-4365-A10C-0EF1AD97E236}">
       <dgm:prSet phldrT="[Text]"/>
       <dgm:spPr/>
       <dgm:t>
@@ -12334,7 +12195,7 @@
         </a:p>
       </dgm:t>
     </dgm:pt>
-    <dgm:pt modelId="{F306712D-4C52-466C-97F7-160D7FB2A1FB}" type="parTrans" cxnId="{D42948DE-136E-4BE1-84FD-4C8CC8965F19}">
+    <dgm:pt modelId="{0A9CBFD5-45E3-4EB6-B3A3-F1CD6DEFF9F1}" type="parTrans" cxnId="{E00FA8CE-0080-40A1-AB02-83ADC03851D4}">
       <dgm:prSet/>
       <dgm:spPr/>
       <dgm:t>
@@ -12345,7 +12206,7 @@
         </a:p>
       </dgm:t>
     </dgm:pt>
-    <dgm:pt modelId="{EC73F814-0C37-4732-BD42-AB17D55EFC5A}" type="sibTrans" cxnId="{D42948DE-136E-4BE1-84FD-4C8CC8965F19}">
+    <dgm:pt modelId="{F557704B-211C-458F-A8FA-AFB1DF16A9AF}" type="sibTrans" cxnId="{E00FA8CE-0080-40A1-AB02-83ADC03851D4}">
       <dgm:prSet/>
       <dgm:spPr/>
       <dgm:t>
@@ -12356,7 +12217,7 @@
         </a:p>
       </dgm:t>
     </dgm:pt>
-    <dgm:pt modelId="{4D08AB6D-39A5-4604-9D56-C1538AFDF85C}">
+    <dgm:pt modelId="{BAC4BE08-CCF1-43DB-8E66-48C44699A626}">
       <dgm:prSet phldrT="[Text]"/>
       <dgm:spPr/>
       <dgm:t>
@@ -12370,7 +12231,7 @@
         </a:p>
       </dgm:t>
     </dgm:pt>
-    <dgm:pt modelId="{6E7960BF-367B-4D8E-93F9-7C4B81D6F5BB}" type="parTrans" cxnId="{8D6010F8-944A-4774-911D-31D3D5BA4AA4}">
+    <dgm:pt modelId="{4DED331E-4470-4840-B390-A501BED9A376}" type="parTrans" cxnId="{A2132C39-6AFC-4538-AC90-5AD4390D580E}">
       <dgm:prSet/>
       <dgm:spPr/>
       <dgm:t>
@@ -12381,7 +12242,7 @@
         </a:p>
       </dgm:t>
     </dgm:pt>
-    <dgm:pt modelId="{FE9E7642-0DF4-4D3E-AC0E-B16DBE910FA6}" type="sibTrans" cxnId="{8D6010F8-944A-4774-911D-31D3D5BA4AA4}">
+    <dgm:pt modelId="{132B8FD0-D194-4ADA-A15C-778381AFA98B}" type="sibTrans" cxnId="{A2132C39-6AFC-4538-AC90-5AD4390D580E}">
       <dgm:prSet/>
       <dgm:spPr/>
       <dgm:t>
@@ -12392,7 +12253,7 @@
         </a:p>
       </dgm:t>
     </dgm:pt>
-    <dgm:pt modelId="{1B29101A-CFC5-4E96-B348-1E93847B3876}">
+    <dgm:pt modelId="{D1F66228-5EDD-4086-ADEC-725717960FFE}">
       <dgm:prSet phldrT="[Text]"/>
       <dgm:spPr/>
       <dgm:t>
@@ -12406,7 +12267,7 @@
         </a:p>
       </dgm:t>
     </dgm:pt>
-    <dgm:pt modelId="{773A7A7B-2E0D-4D36-A51E-DA47255B4E3B}" type="parTrans" cxnId="{F06DF9E3-1CD4-4E1B-A31D-72BE128A2BE8}">
+    <dgm:pt modelId="{E04ACA23-86FF-471C-9A2F-F9B3E71805DD}" type="parTrans" cxnId="{FAEBB0D6-606D-4103-86AE-7B4BF96373D3}">
       <dgm:prSet/>
       <dgm:spPr/>
       <dgm:t>
@@ -12417,7 +12278,7 @@
         </a:p>
       </dgm:t>
     </dgm:pt>
-    <dgm:pt modelId="{16770430-8FB9-4413-A3A8-DA770C782CE3}" type="sibTrans" cxnId="{F06DF9E3-1CD4-4E1B-A31D-72BE128A2BE8}">
+    <dgm:pt modelId="{62B596D4-EFB0-43E1-802B-5CB2C00B81AF}" type="sibTrans" cxnId="{FAEBB0D6-606D-4103-86AE-7B4BF96373D3}">
       <dgm:prSet/>
       <dgm:spPr/>
       <dgm:t>
@@ -12428,7 +12289,7 @@
         </a:p>
       </dgm:t>
     </dgm:pt>
-    <dgm:pt modelId="{45313FFF-7309-4703-B663-523DA974D066}">
+    <dgm:pt modelId="{B112B494-1E89-4E52-9685-941094BA439A}">
       <dgm:prSet phldrT="[Text]"/>
       <dgm:spPr/>
       <dgm:t>
@@ -12442,7 +12303,7 @@
         </a:p>
       </dgm:t>
     </dgm:pt>
-    <dgm:pt modelId="{71EBC49E-7E8B-493C-941F-018B7FE50426}" type="parTrans" cxnId="{D3896A74-5A6B-4D10-9ACB-69E5524AA8B4}">
+    <dgm:pt modelId="{3995F361-6B20-46E0-A8B2-C5DABADDC68F}" type="parTrans" cxnId="{284F1821-FE09-4FE2-A80D-085045E38C6F}">
       <dgm:prSet/>
       <dgm:spPr/>
       <dgm:t>
@@ -12453,7 +12314,7 @@
         </a:p>
       </dgm:t>
     </dgm:pt>
-    <dgm:pt modelId="{D9EC390F-C2C6-4F90-A757-DBD7D14DE9DD}" type="sibTrans" cxnId="{D3896A74-5A6B-4D10-9ACB-69E5524AA8B4}">
+    <dgm:pt modelId="{B2C81CCD-27BE-423A-BCA4-8CFC9EDE8140}" type="sibTrans" cxnId="{284F1821-FE09-4FE2-A80D-085045E38C6F}">
       <dgm:prSet/>
       <dgm:spPr/>
       <dgm:t>
@@ -12464,7 +12325,7 @@
         </a:p>
       </dgm:t>
     </dgm:pt>
-    <dgm:pt modelId="{E1F5FD06-963E-4D80-8FA8-5E42FC2ED801}">
+    <dgm:pt modelId="{CB161991-CD13-49FF-A56D-E9414A3E69C4}">
       <dgm:prSet phldrT="[Text]"/>
       <dgm:spPr/>
       <dgm:t>
@@ -12478,7 +12339,7 @@
         </a:p>
       </dgm:t>
     </dgm:pt>
-    <dgm:pt modelId="{B173776A-D7BF-4C7A-B674-72E4BB7ED9B4}" type="parTrans" cxnId="{C67B32B8-2467-4956-BD0C-21E7023828E6}">
+    <dgm:pt modelId="{E8B0C497-2DB6-4073-AB7A-7B766E98AC26}" type="parTrans" cxnId="{29EB7A2B-E1ED-4384-8B86-8632E7AB0E07}">
       <dgm:prSet/>
       <dgm:spPr/>
       <dgm:t>
@@ -12489,7 +12350,7 @@
         </a:p>
       </dgm:t>
     </dgm:pt>
-    <dgm:pt modelId="{9E4790CC-2780-4C5F-A3A4-351E5E3B8436}" type="sibTrans" cxnId="{C67B32B8-2467-4956-BD0C-21E7023828E6}">
+    <dgm:pt modelId="{52BA2188-AD88-4521-81AD-3F586F584C7B}" type="sibTrans" cxnId="{29EB7A2B-E1ED-4384-8B86-8632E7AB0E07}">
       <dgm:prSet/>
       <dgm:spPr/>
       <dgm:t>
@@ -12500,7 +12361,7 @@
         </a:p>
       </dgm:t>
     </dgm:pt>
-    <dgm:pt modelId="{5F8992A7-A29A-40EE-A203-8DFCDE65A91E}">
+    <dgm:pt modelId="{15DEABF6-EB0F-4853-BBBE-FD9549953FC0}">
       <dgm:prSet phldrT="[Text]"/>
       <dgm:spPr/>
       <dgm:t>
@@ -12514,7 +12375,7 @@
         </a:p>
       </dgm:t>
     </dgm:pt>
-    <dgm:pt modelId="{8D063E24-F16E-4BAE-8AF3-5EDD4AAE3A1D}" type="parTrans" cxnId="{65D26242-3DF7-4190-91B4-C6982DC9A269}">
+    <dgm:pt modelId="{7A8D03FC-05E4-4ABB-9AA1-10DC9BA5B443}" type="parTrans" cxnId="{361D0C2D-91F9-49F2-A536-A13C94631580}">
       <dgm:prSet/>
       <dgm:spPr/>
       <dgm:t>
@@ -12525,7 +12386,7 @@
         </a:p>
       </dgm:t>
     </dgm:pt>
-    <dgm:pt modelId="{6E3937DD-FC1C-4A2C-BDDF-7CE16A01DBC9}" type="sibTrans" cxnId="{65D26242-3DF7-4190-91B4-C6982DC9A269}">
+    <dgm:pt modelId="{5930FA40-A9FC-4588-8ABF-4457585EE795}" type="sibTrans" cxnId="{361D0C2D-91F9-49F2-A536-A13C94631580}">
       <dgm:prSet/>
       <dgm:spPr/>
       <dgm:t>
@@ -12536,7 +12397,7 @@
         </a:p>
       </dgm:t>
     </dgm:pt>
-    <dgm:pt modelId="{C580D68A-61C6-422E-89FD-E4FB1FCCDC96}">
+    <dgm:pt modelId="{06C4CF1C-0D8E-41CD-A1F3-620925080707}">
       <dgm:prSet phldrT="[Text]"/>
       <dgm:spPr/>
       <dgm:t>
@@ -12550,7 +12411,7 @@
         </a:p>
       </dgm:t>
     </dgm:pt>
-    <dgm:pt modelId="{4B5AAAE1-8901-435D-8536-81F4DD939926}" type="parTrans" cxnId="{B9C60331-9B28-4A39-95CA-E4C16A929BC1}">
+    <dgm:pt modelId="{C4D66CCD-6276-42E9-9E80-CA28E3612E0E}" type="parTrans" cxnId="{7C2D2EF3-3F17-439D-91AD-736B18FCC3C4}">
       <dgm:prSet/>
       <dgm:spPr/>
       <dgm:t>
@@ -12561,7 +12422,7 @@
         </a:p>
       </dgm:t>
     </dgm:pt>
-    <dgm:pt modelId="{DB90FF79-6086-49BD-ADD6-24D4DB45B21C}" type="sibTrans" cxnId="{B9C60331-9B28-4A39-95CA-E4C16A929BC1}">
+    <dgm:pt modelId="{E740232D-8E0F-40AB-8015-6F50898EF26E}" type="sibTrans" cxnId="{7C2D2EF3-3F17-439D-91AD-736B18FCC3C4}">
       <dgm:prSet/>
       <dgm:spPr/>
       <dgm:t>
@@ -12572,7 +12433,7 @@
         </a:p>
       </dgm:t>
     </dgm:pt>
-    <dgm:pt modelId="{14B0F0E3-E83A-4A01-A99E-A1B44E50E4AB}">
+    <dgm:pt modelId="{BEE46EED-9A51-4205-8577-68C6BF240BE1}">
       <dgm:prSet phldrT="[Text]"/>
       <dgm:spPr/>
       <dgm:t>
@@ -12586,7 +12447,7 @@
         </a:p>
       </dgm:t>
     </dgm:pt>
-    <dgm:pt modelId="{587D42C4-B3AD-43AF-8D9C-165781AC49F7}" type="parTrans" cxnId="{2685CADB-025C-41DE-95F8-654B58FD1024}">
+    <dgm:pt modelId="{576686E1-7776-44A1-9178-4796D07502B7}" type="parTrans" cxnId="{143CC03B-DDF1-459F-910F-65247A1B0AB3}">
       <dgm:prSet/>
       <dgm:spPr/>
       <dgm:t>
@@ -12597,7 +12458,7 @@
         </a:p>
       </dgm:t>
     </dgm:pt>
-    <dgm:pt modelId="{9FE4A3B5-3099-41B2-8124-CBA56C758B61}" type="sibTrans" cxnId="{2685CADB-025C-41DE-95F8-654B58FD1024}">
+    <dgm:pt modelId="{E3C4175C-7F7F-4725-AE8F-C1C2A2B2A3F6}" type="sibTrans" cxnId="{143CC03B-DDF1-459F-910F-65247A1B0AB3}">
       <dgm:prSet/>
       <dgm:spPr/>
       <dgm:t>
@@ -12608,7 +12469,7 @@
         </a:p>
       </dgm:t>
     </dgm:pt>
-    <dgm:pt modelId="{F8E00290-8153-4153-98E9-9FB48BE84A85}">
+    <dgm:pt modelId="{800452A0-E83B-4DB1-AC53-C962E893190E}">
       <dgm:prSet phldrT="[Text]"/>
       <dgm:spPr/>
       <dgm:t>
@@ -12622,7 +12483,7 @@
         </a:p>
       </dgm:t>
     </dgm:pt>
-    <dgm:pt modelId="{61E385E3-5268-4605-A921-DA978DEEEF6F}" type="parTrans" cxnId="{43C21C51-A492-4941-8B12-A1CBEC26082D}">
+    <dgm:pt modelId="{0EECE19B-96AD-487A-A31F-1B91ACE8798C}" type="parTrans" cxnId="{7D09D6C8-C72A-4E13-99A6-BFC398BFFAB7}">
       <dgm:prSet/>
       <dgm:spPr/>
       <dgm:t>
@@ -12633,7 +12494,7 @@
         </a:p>
       </dgm:t>
     </dgm:pt>
-    <dgm:pt modelId="{E85FC0B4-FADA-4EAA-B3B4-7B7967823170}" type="sibTrans" cxnId="{43C21C51-A492-4941-8B12-A1CBEC26082D}">
+    <dgm:pt modelId="{B7C3D348-9BF0-4C39-845D-9FC89B085CEA}" type="sibTrans" cxnId="{7D09D6C8-C72A-4E13-99A6-BFC398BFFAB7}">
       <dgm:prSet/>
       <dgm:spPr/>
       <dgm:t>
@@ -12644,8 +12505,8 @@
         </a:p>
       </dgm:t>
     </dgm:pt>
-    <dgm:pt modelId="{089702FB-1BD3-4690-A614-BBCDF8BADDC1}" type="pres">
-      <dgm:prSet presAssocID="{762ED0C3-85ED-4832-9786-9D6696329E05}" presName="Name0" presStyleCnt="0">
+    <dgm:pt modelId="{96F4358F-C9DA-480B-AFE1-868246384B62}" type="pres">
+      <dgm:prSet presAssocID="{C26964BC-0A35-45B2-99C6-1A6B8D245F89}" presName="Name0" presStyleCnt="0">
         <dgm:presLayoutVars>
           <dgm:dir/>
           <dgm:animLvl val="lvl"/>
@@ -12654,12 +12515,12 @@
       </dgm:prSet>
       <dgm:spPr/>
     </dgm:pt>
-    <dgm:pt modelId="{24CC81AD-B055-4004-AF0F-9133BA513B3D}" type="pres">
-      <dgm:prSet presAssocID="{0EB65470-F3EA-4B05-9593-A15153A14EA2}" presName="linNode" presStyleCnt="0"/>
+    <dgm:pt modelId="{B8EDADDB-9C9E-4BF9-AF56-87592ED551AD}" type="pres">
+      <dgm:prSet presAssocID="{A5C483E8-DB06-4703-BDAE-61A993FAEE32}" presName="linNode" presStyleCnt="0"/>
       <dgm:spPr/>
     </dgm:pt>
-    <dgm:pt modelId="{7EE809B1-EA97-4D63-8145-4E8E2467A9E4}" type="pres">
-      <dgm:prSet presAssocID="{0EB65470-F3EA-4B05-9593-A15153A14EA2}" presName="parentText" presStyleLbl="node1" presStyleIdx="0" presStyleCnt="5">
+    <dgm:pt modelId="{8B915227-2E48-4F5E-A841-EADD20050073}" type="pres">
+      <dgm:prSet presAssocID="{A5C483E8-DB06-4703-BDAE-61A993FAEE32}" presName="parentText" presStyleLbl="node1" presStyleIdx="0" presStyleCnt="5">
         <dgm:presLayoutVars>
           <dgm:chMax val="1"/>
           <dgm:bulletEnabled val="1"/>
@@ -12667,24 +12528,24 @@
       </dgm:prSet>
       <dgm:spPr/>
     </dgm:pt>
-    <dgm:pt modelId="{3EDBAB70-F9D7-45D6-833D-C3015D7C8526}" type="pres">
-      <dgm:prSet presAssocID="{0EB65470-F3EA-4B05-9593-A15153A14EA2}" presName="descendantText" presStyleLbl="alignAccFollowNode1" presStyleIdx="0" presStyleCnt="5">
+    <dgm:pt modelId="{D68CAC0D-23CA-495E-825F-7F33FEFD8552}" type="pres">
+      <dgm:prSet presAssocID="{A5C483E8-DB06-4703-BDAE-61A993FAEE32}" presName="descendantText" presStyleLbl="alignAccFollowNode1" presStyleIdx="0" presStyleCnt="5">
         <dgm:presLayoutVars>
           <dgm:bulletEnabled val="1"/>
         </dgm:presLayoutVars>
       </dgm:prSet>
       <dgm:spPr/>
     </dgm:pt>
-    <dgm:pt modelId="{139593BB-5231-42B6-B61A-7220A4B0778C}" type="pres">
-      <dgm:prSet presAssocID="{DF64A2AB-1E70-4D5A-BEDE-7ACF06E3EC55}" presName="sp" presStyleCnt="0"/>
+    <dgm:pt modelId="{6DF618C4-C3AD-4CE5-9BAB-3E51F62038C5}" type="pres">
+      <dgm:prSet presAssocID="{61BBFB2B-9B88-4642-87BD-D3088AD94E21}" presName="sp" presStyleCnt="0"/>
       <dgm:spPr/>
     </dgm:pt>
-    <dgm:pt modelId="{5AE50D67-98BF-4A18-9CD4-F36C22C9095C}" type="pres">
-      <dgm:prSet presAssocID="{430C2BEF-C7E6-42E7-A9D0-C0DB65917882}" presName="linNode" presStyleCnt="0"/>
+    <dgm:pt modelId="{2DF99B9C-BFBF-48B2-80BF-00B7318823B2}" type="pres">
+      <dgm:prSet presAssocID="{7E980AD9-B89E-4022-BCD6-D5C4EF4AB0B0}" presName="linNode" presStyleCnt="0"/>
       <dgm:spPr/>
     </dgm:pt>
-    <dgm:pt modelId="{B2010C9C-0C95-47E6-A329-68E922BE7F96}" type="pres">
-      <dgm:prSet presAssocID="{430C2BEF-C7E6-42E7-A9D0-C0DB65917882}" presName="parentText" presStyleLbl="node1" presStyleIdx="1" presStyleCnt="5">
+    <dgm:pt modelId="{ADE12B2F-5D73-47A3-9ED7-271A4D2E951E}" type="pres">
+      <dgm:prSet presAssocID="{7E980AD9-B89E-4022-BCD6-D5C4EF4AB0B0}" presName="parentText" presStyleLbl="node1" presStyleIdx="1" presStyleCnt="5">
         <dgm:presLayoutVars>
           <dgm:chMax val="1"/>
           <dgm:bulletEnabled val="1"/>
@@ -12692,24 +12553,24 @@
       </dgm:prSet>
       <dgm:spPr/>
     </dgm:pt>
-    <dgm:pt modelId="{4418F0F0-9958-490B-A35C-3760A77FFBAA}" type="pres">
-      <dgm:prSet presAssocID="{430C2BEF-C7E6-42E7-A9D0-C0DB65917882}" presName="descendantText" presStyleLbl="alignAccFollowNode1" presStyleIdx="1" presStyleCnt="5">
+    <dgm:pt modelId="{E8737758-9D7A-4F67-B463-2234AD083BC2}" type="pres">
+      <dgm:prSet presAssocID="{7E980AD9-B89E-4022-BCD6-D5C4EF4AB0B0}" presName="descendantText" presStyleLbl="alignAccFollowNode1" presStyleIdx="1" presStyleCnt="5">
         <dgm:presLayoutVars>
           <dgm:bulletEnabled val="1"/>
         </dgm:presLayoutVars>
       </dgm:prSet>
       <dgm:spPr/>
     </dgm:pt>
-    <dgm:pt modelId="{4714EB74-10B8-4C8B-B219-EED208C0372B}" type="pres">
-      <dgm:prSet presAssocID="{3D21AF4E-AC15-4803-B2F4-885B8DC1CD1D}" presName="sp" presStyleCnt="0"/>
+    <dgm:pt modelId="{231FF83B-ED47-496B-87A5-DF1159D1A862}" type="pres">
+      <dgm:prSet presAssocID="{8F2174F3-8CDB-4071-A415-DB437E1DEA58}" presName="sp" presStyleCnt="0"/>
       <dgm:spPr/>
     </dgm:pt>
-    <dgm:pt modelId="{456436CA-8E26-4CD9-8CCF-AD658937235A}" type="pres">
-      <dgm:prSet presAssocID="{B2A00503-CDA4-4A80-AE1C-B932C56489DF}" presName="linNode" presStyleCnt="0"/>
+    <dgm:pt modelId="{C765DBC3-7AB3-4BFC-95FE-CBAD9ED207CE}" type="pres">
+      <dgm:prSet presAssocID="{C76DCE53-9801-4365-A10C-0EF1AD97E236}" presName="linNode" presStyleCnt="0"/>
       <dgm:spPr/>
     </dgm:pt>
-    <dgm:pt modelId="{8334EFAC-1FD2-4A29-983F-4726250A19FE}" type="pres">
-      <dgm:prSet presAssocID="{B2A00503-CDA4-4A80-AE1C-B932C56489DF}" presName="parentText" presStyleLbl="node1" presStyleIdx="2" presStyleCnt="5">
+    <dgm:pt modelId="{E867D77D-BF27-443E-B819-6D791C5D74E0}" type="pres">
+      <dgm:prSet presAssocID="{C76DCE53-9801-4365-A10C-0EF1AD97E236}" presName="parentText" presStyleLbl="node1" presStyleIdx="2" presStyleCnt="5">
         <dgm:presLayoutVars>
           <dgm:chMax val="1"/>
           <dgm:bulletEnabled val="1"/>
@@ -12717,24 +12578,24 @@
       </dgm:prSet>
       <dgm:spPr/>
     </dgm:pt>
-    <dgm:pt modelId="{E9BFCE12-136F-460E-8429-0F0181CD1BD7}" type="pres">
-      <dgm:prSet presAssocID="{B2A00503-CDA4-4A80-AE1C-B932C56489DF}" presName="descendantText" presStyleLbl="alignAccFollowNode1" presStyleIdx="2" presStyleCnt="5">
+    <dgm:pt modelId="{FB0AE907-C688-4C27-8A7D-628BBED45D7B}" type="pres">
+      <dgm:prSet presAssocID="{C76DCE53-9801-4365-A10C-0EF1AD97E236}" presName="descendantText" presStyleLbl="alignAccFollowNode1" presStyleIdx="2" presStyleCnt="5">
         <dgm:presLayoutVars>
           <dgm:bulletEnabled val="1"/>
         </dgm:presLayoutVars>
       </dgm:prSet>
       <dgm:spPr/>
     </dgm:pt>
-    <dgm:pt modelId="{0424CF57-025B-4E5C-9D9B-6491B2D7AF0B}" type="pres">
-      <dgm:prSet presAssocID="{EC73F814-0C37-4732-BD42-AB17D55EFC5A}" presName="sp" presStyleCnt="0"/>
+    <dgm:pt modelId="{F5AF84F2-D47D-41D0-8BF3-3475C58318A3}" type="pres">
+      <dgm:prSet presAssocID="{F557704B-211C-458F-A8FA-AFB1DF16A9AF}" presName="sp" presStyleCnt="0"/>
       <dgm:spPr/>
     </dgm:pt>
-    <dgm:pt modelId="{0E823259-01E3-43E6-87F1-527019D28D37}" type="pres">
-      <dgm:prSet presAssocID="{45313FFF-7309-4703-B663-523DA974D066}" presName="linNode" presStyleCnt="0"/>
+    <dgm:pt modelId="{3BD02453-78CE-4210-9E54-CA88019A3866}" type="pres">
+      <dgm:prSet presAssocID="{B112B494-1E89-4E52-9685-941094BA439A}" presName="linNode" presStyleCnt="0"/>
       <dgm:spPr/>
     </dgm:pt>
-    <dgm:pt modelId="{BE5BD5F9-DA26-4F0F-B1E5-6995A9CFACE2}" type="pres">
-      <dgm:prSet presAssocID="{45313FFF-7309-4703-B663-523DA974D066}" presName="parentText" presStyleLbl="node1" presStyleIdx="3" presStyleCnt="5">
+    <dgm:pt modelId="{24DCE27F-FA3A-4209-9080-332569220892}" type="pres">
+      <dgm:prSet presAssocID="{B112B494-1E89-4E52-9685-941094BA439A}" presName="parentText" presStyleLbl="node1" presStyleIdx="3" presStyleCnt="5">
         <dgm:presLayoutVars>
           <dgm:chMax val="1"/>
           <dgm:bulletEnabled val="1"/>
@@ -12742,24 +12603,24 @@
       </dgm:prSet>
       <dgm:spPr/>
     </dgm:pt>
-    <dgm:pt modelId="{4449D63E-DB80-404D-B44A-DDDE29EC43FA}" type="pres">
-      <dgm:prSet presAssocID="{45313FFF-7309-4703-B663-523DA974D066}" presName="descendantText" presStyleLbl="alignAccFollowNode1" presStyleIdx="3" presStyleCnt="5">
+    <dgm:pt modelId="{29D95BCC-196F-491F-8E51-F679952684E8}" type="pres">
+      <dgm:prSet presAssocID="{B112B494-1E89-4E52-9685-941094BA439A}" presName="descendantText" presStyleLbl="alignAccFollowNode1" presStyleIdx="3" presStyleCnt="5">
         <dgm:presLayoutVars>
           <dgm:bulletEnabled val="1"/>
         </dgm:presLayoutVars>
       </dgm:prSet>
       <dgm:spPr/>
     </dgm:pt>
-    <dgm:pt modelId="{5D451BF9-4B82-4DE8-9A22-78A31A510FCA}" type="pres">
-      <dgm:prSet presAssocID="{D9EC390F-C2C6-4F90-A757-DBD7D14DE9DD}" presName="sp" presStyleCnt="0"/>
+    <dgm:pt modelId="{9DEA7A0E-E6DE-4C08-BEDF-524D4BC74D75}" type="pres">
+      <dgm:prSet presAssocID="{B2C81CCD-27BE-423A-BCA4-8CFC9EDE8140}" presName="sp" presStyleCnt="0"/>
       <dgm:spPr/>
     </dgm:pt>
-    <dgm:pt modelId="{7FDB6CCD-2FCA-4AC0-9476-964099D23A27}" type="pres">
-      <dgm:prSet presAssocID="{C580D68A-61C6-422E-89FD-E4FB1FCCDC96}" presName="linNode" presStyleCnt="0"/>
+    <dgm:pt modelId="{242BC8AF-611E-4E42-88F2-DC31E6A2AC03}" type="pres">
+      <dgm:prSet presAssocID="{06C4CF1C-0D8E-41CD-A1F3-620925080707}" presName="linNode" presStyleCnt="0"/>
       <dgm:spPr/>
     </dgm:pt>
-    <dgm:pt modelId="{680442F7-ECC4-4AEA-9874-B3FAA18E2C35}" type="pres">
-      <dgm:prSet presAssocID="{C580D68A-61C6-422E-89FD-E4FB1FCCDC96}" presName="parentText" presStyleLbl="node1" presStyleIdx="4" presStyleCnt="5">
+    <dgm:pt modelId="{F1505148-9648-4C92-B6DA-3793427BBECF}" type="pres">
+      <dgm:prSet presAssocID="{06C4CF1C-0D8E-41CD-A1F3-620925080707}" presName="parentText" presStyleLbl="node1" presStyleIdx="4" presStyleCnt="5">
         <dgm:presLayoutVars>
           <dgm:chMax val="1"/>
           <dgm:bulletEnabled val="1"/>
@@ -12767,8 +12628,8 @@
       </dgm:prSet>
       <dgm:spPr/>
     </dgm:pt>
-    <dgm:pt modelId="{B8ED32F6-8784-4B6C-AD99-2937DFD3CAF5}" type="pres">
-      <dgm:prSet presAssocID="{C580D68A-61C6-422E-89FD-E4FB1FCCDC96}" presName="descendantText" presStyleLbl="alignAccFollowNode1" presStyleIdx="4" presStyleCnt="5">
+    <dgm:pt modelId="{F905424A-40A6-46D7-AD0C-7F0C8FF14190}" type="pres">
+      <dgm:prSet presAssocID="{06C4CF1C-0D8E-41CD-A1F3-620925080707}" presName="descendantText" presStyleLbl="alignAccFollowNode1" presStyleIdx="4" presStyleCnt="5">
         <dgm:presLayoutVars>
           <dgm:bulletEnabled val="1"/>
         </dgm:presLayoutVars>
@@ -12777,56 +12638,56 @@
     </dgm:pt>
   </dgm:ptLst>
   <dgm:cxnLst>
-    <dgm:cxn modelId="{DCDDE2F0-18C5-4356-BF8C-A2D70F4939F9}" srcId="{762ED0C3-85ED-4832-9786-9D6696329E05}" destId="{0EB65470-F3EA-4B05-9593-A15153A14EA2}" srcOrd="0" destOrd="0" parTransId="{AAC033DB-9721-4827-B0B7-3D5FCC1DB301}" sibTransId="{DF64A2AB-1E70-4D5A-BEDE-7ACF06E3EC55}"/>
-    <dgm:cxn modelId="{D227FDA0-CFCD-4045-9F19-D65D0CB9D0A8}" srcId="{0EB65470-F3EA-4B05-9593-A15153A14EA2}" destId="{EA0A1F4B-9CF4-42DC-A07C-9482A243CA07}" srcOrd="0" destOrd="0" parTransId="{B2B3E6E3-7F0E-45D3-8967-0A5CBBBDFE23}" sibTransId="{BB1F997C-BADB-4A06-9AC3-68413806479B}"/>
-    <dgm:cxn modelId="{78A491D1-AC17-4267-8AA7-4D8FD5321202}" srcId="{0EB65470-F3EA-4B05-9593-A15153A14EA2}" destId="{F3345BF6-09BB-4F88-9FD0-2125AAFC23A0}" srcOrd="1" destOrd="0" parTransId="{609BBFC2-8094-4AD7-B5C4-0EF75B48CD5E}" sibTransId="{C92A2609-B484-4765-90A4-8ACA89095483}"/>
-    <dgm:cxn modelId="{88E5D47D-74D2-4640-B66D-2087D51260B0}" srcId="{762ED0C3-85ED-4832-9786-9D6696329E05}" destId="{430C2BEF-C7E6-42E7-A9D0-C0DB65917882}" srcOrd="1" destOrd="0" parTransId="{D8092021-4C08-46F6-B429-BABA058135A3}" sibTransId="{3D21AF4E-AC15-4803-B2F4-885B8DC1CD1D}"/>
-    <dgm:cxn modelId="{399A10C2-3CD7-4BFE-9118-296B53E41A68}" srcId="{430C2BEF-C7E6-42E7-A9D0-C0DB65917882}" destId="{378C455C-D9C2-410A-97E2-4369E5F731A7}" srcOrd="0" destOrd="0" parTransId="{46961351-F9E1-4649-A34F-E3EEE4C3D16F}" sibTransId="{F6944D2A-DE06-43B9-B228-562E96C32CCC}"/>
-    <dgm:cxn modelId="{F9673B42-4C50-4DFB-A105-BCF9082A1640}" srcId="{430C2BEF-C7E6-42E7-A9D0-C0DB65917882}" destId="{13712D41-724E-46E5-83E7-3C943BBBC397}" srcOrd="1" destOrd="0" parTransId="{A0BD6D3B-4FE9-4416-9187-240621F81E45}" sibTransId="{6ED11FC6-7477-4CE3-A494-CFD00C59E802}"/>
-    <dgm:cxn modelId="{D42948DE-136E-4BE1-84FD-4C8CC8965F19}" srcId="{762ED0C3-85ED-4832-9786-9D6696329E05}" destId="{B2A00503-CDA4-4A80-AE1C-B932C56489DF}" srcOrd="2" destOrd="0" parTransId="{F306712D-4C52-466C-97F7-160D7FB2A1FB}" sibTransId="{EC73F814-0C37-4732-BD42-AB17D55EFC5A}"/>
-    <dgm:cxn modelId="{8D6010F8-944A-4774-911D-31D3D5BA4AA4}" srcId="{B2A00503-CDA4-4A80-AE1C-B932C56489DF}" destId="{4D08AB6D-39A5-4604-9D56-C1538AFDF85C}" srcOrd="0" destOrd="0" parTransId="{6E7960BF-367B-4D8E-93F9-7C4B81D6F5BB}" sibTransId="{FE9E7642-0DF4-4D3E-AC0E-B16DBE910FA6}"/>
-    <dgm:cxn modelId="{F06DF9E3-1CD4-4E1B-A31D-72BE128A2BE8}" srcId="{B2A00503-CDA4-4A80-AE1C-B932C56489DF}" destId="{1B29101A-CFC5-4E96-B348-1E93847B3876}" srcOrd="1" destOrd="0" parTransId="{773A7A7B-2E0D-4D36-A51E-DA47255B4E3B}" sibTransId="{16770430-8FB9-4413-A3A8-DA770C782CE3}"/>
-    <dgm:cxn modelId="{D3896A74-5A6B-4D10-9ACB-69E5524AA8B4}" srcId="{762ED0C3-85ED-4832-9786-9D6696329E05}" destId="{45313FFF-7309-4703-B663-523DA974D066}" srcOrd="3" destOrd="0" parTransId="{71EBC49E-7E8B-493C-941F-018B7FE50426}" sibTransId="{D9EC390F-C2C6-4F90-A757-DBD7D14DE9DD}"/>
-    <dgm:cxn modelId="{C67B32B8-2467-4956-BD0C-21E7023828E6}" srcId="{45313FFF-7309-4703-B663-523DA974D066}" destId="{E1F5FD06-963E-4D80-8FA8-5E42FC2ED801}" srcOrd="0" destOrd="0" parTransId="{B173776A-D7BF-4C7A-B674-72E4BB7ED9B4}" sibTransId="{9E4790CC-2780-4C5F-A3A4-351E5E3B8436}"/>
-    <dgm:cxn modelId="{65D26242-3DF7-4190-91B4-C6982DC9A269}" srcId="{45313FFF-7309-4703-B663-523DA974D066}" destId="{5F8992A7-A29A-40EE-A203-8DFCDE65A91E}" srcOrd="1" destOrd="0" parTransId="{8D063E24-F16E-4BAE-8AF3-5EDD4AAE3A1D}" sibTransId="{6E3937DD-FC1C-4A2C-BDDF-7CE16A01DBC9}"/>
-    <dgm:cxn modelId="{B9C60331-9B28-4A39-95CA-E4C16A929BC1}" srcId="{762ED0C3-85ED-4832-9786-9D6696329E05}" destId="{C580D68A-61C6-422E-89FD-E4FB1FCCDC96}" srcOrd="4" destOrd="0" parTransId="{4B5AAAE1-8901-435D-8536-81F4DD939926}" sibTransId="{DB90FF79-6086-49BD-ADD6-24D4DB45B21C}"/>
-    <dgm:cxn modelId="{2685CADB-025C-41DE-95F8-654B58FD1024}" srcId="{C580D68A-61C6-422E-89FD-E4FB1FCCDC96}" destId="{14B0F0E3-E83A-4A01-A99E-A1B44E50E4AB}" srcOrd="0" destOrd="0" parTransId="{587D42C4-B3AD-43AF-8D9C-165781AC49F7}" sibTransId="{9FE4A3B5-3099-41B2-8124-CBA56C758B61}"/>
-    <dgm:cxn modelId="{43C21C51-A492-4941-8B12-A1CBEC26082D}" srcId="{C580D68A-61C6-422E-89FD-E4FB1FCCDC96}" destId="{F8E00290-8153-4153-98E9-9FB48BE84A85}" srcOrd="1" destOrd="0" parTransId="{61E385E3-5268-4605-A921-DA978DEEEF6F}" sibTransId="{E85FC0B4-FADA-4EAA-B3B4-7B7967823170}"/>
-    <dgm:cxn modelId="{678B71D1-0F8B-443A-9A44-E5D85DAE0499}" type="presOf" srcId="{762ED0C3-85ED-4832-9786-9D6696329E05}" destId="{089702FB-1BD3-4690-A614-BBCDF8BADDC1}" srcOrd="0" destOrd="0" presId="urn:microsoft.com/office/officeart/2005/8/layout/vList5"/>
-    <dgm:cxn modelId="{057C9A7A-CD04-4151-9CC2-75AF51CFB23C}" type="presParOf" srcId="{089702FB-1BD3-4690-A614-BBCDF8BADDC1}" destId="{24CC81AD-B055-4004-AF0F-9133BA513B3D}" srcOrd="0" destOrd="0" presId="urn:microsoft.com/office/officeart/2005/8/layout/vList5"/>
-    <dgm:cxn modelId="{47CA2888-530B-4B7B-9C86-08ED8EDB7BEC}" type="presParOf" srcId="{24CC81AD-B055-4004-AF0F-9133BA513B3D}" destId="{7EE809B1-EA97-4D63-8145-4E8E2467A9E4}" srcOrd="0" destOrd="0" presId="urn:microsoft.com/office/officeart/2005/8/layout/vList5"/>
-    <dgm:cxn modelId="{1973B10E-70A6-4D6D-BD39-6FE5688E5006}" type="presOf" srcId="{0EB65470-F3EA-4B05-9593-A15153A14EA2}" destId="{7EE809B1-EA97-4D63-8145-4E8E2467A9E4}" srcOrd="0" destOrd="0" presId="urn:microsoft.com/office/officeart/2005/8/layout/vList5"/>
-    <dgm:cxn modelId="{42498F04-712F-4169-ACEA-B05815127B80}" type="presParOf" srcId="{24CC81AD-B055-4004-AF0F-9133BA513B3D}" destId="{3EDBAB70-F9D7-45D6-833D-C3015D7C8526}" srcOrd="1" destOrd="0" presId="urn:microsoft.com/office/officeart/2005/8/layout/vList5"/>
-    <dgm:cxn modelId="{E3DC5878-4573-494C-8D91-6427336CCFE7}" type="presOf" srcId="{EA0A1F4B-9CF4-42DC-A07C-9482A243CA07}" destId="{3EDBAB70-F9D7-45D6-833D-C3015D7C8526}" srcOrd="0" destOrd="0" presId="urn:microsoft.com/office/officeart/2005/8/layout/vList5"/>
-    <dgm:cxn modelId="{DA9B08DB-D3B4-41B1-ABE8-CEC95A3195EA}" type="presOf" srcId="{F3345BF6-09BB-4F88-9FD0-2125AAFC23A0}" destId="{3EDBAB70-F9D7-45D6-833D-C3015D7C8526}" srcOrd="0" destOrd="1" presId="urn:microsoft.com/office/officeart/2005/8/layout/vList5"/>
-    <dgm:cxn modelId="{2BA135CA-3A93-4AF7-B7AF-1338110EFB55}" type="presParOf" srcId="{089702FB-1BD3-4690-A614-BBCDF8BADDC1}" destId="{139593BB-5231-42B6-B61A-7220A4B0778C}" srcOrd="1" destOrd="0" presId="urn:microsoft.com/office/officeart/2005/8/layout/vList5"/>
-    <dgm:cxn modelId="{E03C1702-A7FD-472C-A1AF-A147BA40C654}" type="presParOf" srcId="{089702FB-1BD3-4690-A614-BBCDF8BADDC1}" destId="{5AE50D67-98BF-4A18-9CD4-F36C22C9095C}" srcOrd="2" destOrd="0" presId="urn:microsoft.com/office/officeart/2005/8/layout/vList5"/>
-    <dgm:cxn modelId="{32D01C09-E6FB-4E31-AB37-A115A3C1E686}" type="presParOf" srcId="{5AE50D67-98BF-4A18-9CD4-F36C22C9095C}" destId="{B2010C9C-0C95-47E6-A329-68E922BE7F96}" srcOrd="0" destOrd="0" presId="urn:microsoft.com/office/officeart/2005/8/layout/vList5"/>
-    <dgm:cxn modelId="{FEACC795-FA3C-40C9-A7B2-0FD9CA8B0685}" type="presOf" srcId="{430C2BEF-C7E6-42E7-A9D0-C0DB65917882}" destId="{B2010C9C-0C95-47E6-A329-68E922BE7F96}" srcOrd="0" destOrd="0" presId="urn:microsoft.com/office/officeart/2005/8/layout/vList5"/>
-    <dgm:cxn modelId="{B6C60267-D35D-4450-82CA-EDDB10EE0D2A}" type="presParOf" srcId="{5AE50D67-98BF-4A18-9CD4-F36C22C9095C}" destId="{4418F0F0-9958-490B-A35C-3760A77FFBAA}" srcOrd="1" destOrd="0" presId="urn:microsoft.com/office/officeart/2005/8/layout/vList5"/>
-    <dgm:cxn modelId="{393797E2-656D-4B55-A6E2-CA20A47B9CAE}" type="presOf" srcId="{378C455C-D9C2-410A-97E2-4369E5F731A7}" destId="{4418F0F0-9958-490B-A35C-3760A77FFBAA}" srcOrd="0" destOrd="0" presId="urn:microsoft.com/office/officeart/2005/8/layout/vList5"/>
-    <dgm:cxn modelId="{1C2C27C4-2B82-44C6-9FF7-2309340E6E68}" type="presOf" srcId="{13712D41-724E-46E5-83E7-3C943BBBC397}" destId="{4418F0F0-9958-490B-A35C-3760A77FFBAA}" srcOrd="0" destOrd="1" presId="urn:microsoft.com/office/officeart/2005/8/layout/vList5"/>
-    <dgm:cxn modelId="{AAD917E3-F171-44F2-9770-4BA5DCA3AB6E}" type="presParOf" srcId="{089702FB-1BD3-4690-A614-BBCDF8BADDC1}" destId="{4714EB74-10B8-4C8B-B219-EED208C0372B}" srcOrd="3" destOrd="0" presId="urn:microsoft.com/office/officeart/2005/8/layout/vList5"/>
-    <dgm:cxn modelId="{0AD1627E-FB51-4D5A-8B71-500362E9DA8E}" type="presParOf" srcId="{089702FB-1BD3-4690-A614-BBCDF8BADDC1}" destId="{456436CA-8E26-4CD9-8CCF-AD658937235A}" srcOrd="4" destOrd="0" presId="urn:microsoft.com/office/officeart/2005/8/layout/vList5"/>
-    <dgm:cxn modelId="{D80DA25C-FCF1-425C-AF1A-E963FAC6BD15}" type="presParOf" srcId="{456436CA-8E26-4CD9-8CCF-AD658937235A}" destId="{8334EFAC-1FD2-4A29-983F-4726250A19FE}" srcOrd="0" destOrd="0" presId="urn:microsoft.com/office/officeart/2005/8/layout/vList5"/>
-    <dgm:cxn modelId="{190BEE2C-327C-4FC3-886B-8D9240C949BE}" type="presOf" srcId="{B2A00503-CDA4-4A80-AE1C-B932C56489DF}" destId="{8334EFAC-1FD2-4A29-983F-4726250A19FE}" srcOrd="0" destOrd="0" presId="urn:microsoft.com/office/officeart/2005/8/layout/vList5"/>
-    <dgm:cxn modelId="{7A35B737-CFE9-432F-AB38-0764BD289E64}" type="presParOf" srcId="{456436CA-8E26-4CD9-8CCF-AD658937235A}" destId="{E9BFCE12-136F-460E-8429-0F0181CD1BD7}" srcOrd="1" destOrd="0" presId="urn:microsoft.com/office/officeart/2005/8/layout/vList5"/>
-    <dgm:cxn modelId="{506AA5DC-B0D4-446B-8B8F-427ABB05F8AB}" type="presOf" srcId="{4D08AB6D-39A5-4604-9D56-C1538AFDF85C}" destId="{E9BFCE12-136F-460E-8429-0F0181CD1BD7}" srcOrd="0" destOrd="0" presId="urn:microsoft.com/office/officeart/2005/8/layout/vList5"/>
-    <dgm:cxn modelId="{DF80661A-3948-45A7-B6AC-5E5F8E1D599D}" type="presOf" srcId="{1B29101A-CFC5-4E96-B348-1E93847B3876}" destId="{E9BFCE12-136F-460E-8429-0F0181CD1BD7}" srcOrd="0" destOrd="1" presId="urn:microsoft.com/office/officeart/2005/8/layout/vList5"/>
-    <dgm:cxn modelId="{239DD1D1-BE97-480E-B584-76CF50BA9326}" type="presParOf" srcId="{089702FB-1BD3-4690-A614-BBCDF8BADDC1}" destId="{0424CF57-025B-4E5C-9D9B-6491B2D7AF0B}" srcOrd="5" destOrd="0" presId="urn:microsoft.com/office/officeart/2005/8/layout/vList5"/>
-    <dgm:cxn modelId="{47E5C26E-506A-46E8-8FFB-2A174848CD2B}" type="presParOf" srcId="{089702FB-1BD3-4690-A614-BBCDF8BADDC1}" destId="{0E823259-01E3-43E6-87F1-527019D28D37}" srcOrd="6" destOrd="0" presId="urn:microsoft.com/office/officeart/2005/8/layout/vList5"/>
-    <dgm:cxn modelId="{0B225592-B460-47F6-9C13-A513F09EB828}" type="presParOf" srcId="{0E823259-01E3-43E6-87F1-527019D28D37}" destId="{BE5BD5F9-DA26-4F0F-B1E5-6995A9CFACE2}" srcOrd="0" destOrd="0" presId="urn:microsoft.com/office/officeart/2005/8/layout/vList5"/>
-    <dgm:cxn modelId="{1C2615D4-189B-4E33-B069-1D106DE59540}" type="presOf" srcId="{45313FFF-7309-4703-B663-523DA974D066}" destId="{BE5BD5F9-DA26-4F0F-B1E5-6995A9CFACE2}" srcOrd="0" destOrd="0" presId="urn:microsoft.com/office/officeart/2005/8/layout/vList5"/>
-    <dgm:cxn modelId="{277927D8-E6FC-4111-9693-D01CC92F2EB5}" type="presParOf" srcId="{0E823259-01E3-43E6-87F1-527019D28D37}" destId="{4449D63E-DB80-404D-B44A-DDDE29EC43FA}" srcOrd="1" destOrd="0" presId="urn:microsoft.com/office/officeart/2005/8/layout/vList5"/>
-    <dgm:cxn modelId="{B6C65C9B-00A0-441F-9E0C-267FB5E4192D}" type="presOf" srcId="{E1F5FD06-963E-4D80-8FA8-5E42FC2ED801}" destId="{4449D63E-DB80-404D-B44A-DDDE29EC43FA}" srcOrd="0" destOrd="0" presId="urn:microsoft.com/office/officeart/2005/8/layout/vList5"/>
-    <dgm:cxn modelId="{DA87C2BE-2281-484D-A76E-65D455B529F5}" type="presOf" srcId="{5F8992A7-A29A-40EE-A203-8DFCDE65A91E}" destId="{4449D63E-DB80-404D-B44A-DDDE29EC43FA}" srcOrd="0" destOrd="1" presId="urn:microsoft.com/office/officeart/2005/8/layout/vList5"/>
-    <dgm:cxn modelId="{E420FD6C-1A1F-4C6F-811D-1F078ED1A404}" type="presParOf" srcId="{089702FB-1BD3-4690-A614-BBCDF8BADDC1}" destId="{5D451BF9-4B82-4DE8-9A22-78A31A510FCA}" srcOrd="7" destOrd="0" presId="urn:microsoft.com/office/officeart/2005/8/layout/vList5"/>
-    <dgm:cxn modelId="{2D111CD9-4EB4-4011-8174-C2F886F1F7D1}" type="presParOf" srcId="{089702FB-1BD3-4690-A614-BBCDF8BADDC1}" destId="{7FDB6CCD-2FCA-4AC0-9476-964099D23A27}" srcOrd="8" destOrd="0" presId="urn:microsoft.com/office/officeart/2005/8/layout/vList5"/>
-    <dgm:cxn modelId="{68EDBB71-EF59-4EA9-AD9E-81382E4CD01F}" type="presParOf" srcId="{7FDB6CCD-2FCA-4AC0-9476-964099D23A27}" destId="{680442F7-ECC4-4AEA-9874-B3FAA18E2C35}" srcOrd="0" destOrd="0" presId="urn:microsoft.com/office/officeart/2005/8/layout/vList5"/>
-    <dgm:cxn modelId="{EFB8A236-C84D-4235-98A0-8F6CBC6D7709}" type="presOf" srcId="{C580D68A-61C6-422E-89FD-E4FB1FCCDC96}" destId="{680442F7-ECC4-4AEA-9874-B3FAA18E2C35}" srcOrd="0" destOrd="0" presId="urn:microsoft.com/office/officeart/2005/8/layout/vList5"/>
-    <dgm:cxn modelId="{6B8E394A-3597-4E28-AE36-10A2B9EBE6C5}" type="presParOf" srcId="{7FDB6CCD-2FCA-4AC0-9476-964099D23A27}" destId="{B8ED32F6-8784-4B6C-AD99-2937DFD3CAF5}" srcOrd="1" destOrd="0" presId="urn:microsoft.com/office/officeart/2005/8/layout/vList5"/>
-    <dgm:cxn modelId="{0483A4D5-BCDC-47F5-9FB9-1117346463AA}" type="presOf" srcId="{14B0F0E3-E83A-4A01-A99E-A1B44E50E4AB}" destId="{B8ED32F6-8784-4B6C-AD99-2937DFD3CAF5}" srcOrd="0" destOrd="0" presId="urn:microsoft.com/office/officeart/2005/8/layout/vList5"/>
-    <dgm:cxn modelId="{338C3E46-EF0C-4142-B8DD-64D9B548AC85}" type="presOf" srcId="{F8E00290-8153-4153-98E9-9FB48BE84A85}" destId="{B8ED32F6-8784-4B6C-AD99-2937DFD3CAF5}" srcOrd="0" destOrd="1" presId="urn:microsoft.com/office/officeart/2005/8/layout/vList5"/>
+    <dgm:cxn modelId="{4C104022-B5CD-4A64-9A4B-5C0071F2A984}" srcId="{C26964BC-0A35-45B2-99C6-1A6B8D245F89}" destId="{A5C483E8-DB06-4703-BDAE-61A993FAEE32}" srcOrd="0" destOrd="0" parTransId="{BDC55087-D74E-4C3F-8512-7A5A2736FFE3}" sibTransId="{61BBFB2B-9B88-4642-87BD-D3088AD94E21}"/>
+    <dgm:cxn modelId="{A4D49CB0-CB3B-4C06-95C6-0038144C897B}" srcId="{A5C483E8-DB06-4703-BDAE-61A993FAEE32}" destId="{1FA4B074-674D-45FC-A05F-963B51E32DEE}" srcOrd="0" destOrd="0" parTransId="{A446BADE-2ABD-451C-9FBC-06D529485B54}" sibTransId="{53B3EAA8-20D7-4564-8DB2-5982F8B49116}"/>
+    <dgm:cxn modelId="{CC4498C6-90D9-4F44-AE29-C33E6938474F}" srcId="{A5C483E8-DB06-4703-BDAE-61A993FAEE32}" destId="{595F6B9F-3702-4EEF-9D6D-6F2948272FEE}" srcOrd="1" destOrd="0" parTransId="{CF542903-3BA9-4320-AAEB-A55A8524123B}" sibTransId="{FD2C1209-D444-4351-999F-20F135378670}"/>
+    <dgm:cxn modelId="{D7CD54A9-DA38-4F50-AA9B-50B61D2CD46F}" srcId="{C26964BC-0A35-45B2-99C6-1A6B8D245F89}" destId="{7E980AD9-B89E-4022-BCD6-D5C4EF4AB0B0}" srcOrd="1" destOrd="0" parTransId="{33692F20-3F61-4167-BF38-9F9181C1E18A}" sibTransId="{8F2174F3-8CDB-4071-A415-DB437E1DEA58}"/>
+    <dgm:cxn modelId="{4B7DE63D-5733-4C47-BBCE-C064FB99B8CE}" srcId="{7E980AD9-B89E-4022-BCD6-D5C4EF4AB0B0}" destId="{5CA2F275-63D8-4B36-A6AF-864CCD2D85A0}" srcOrd="0" destOrd="0" parTransId="{6AC703C4-005A-4800-B428-FAAB8DFFC3E8}" sibTransId="{34B97BCB-61AC-4609-9599-F049E9D7F892}"/>
+    <dgm:cxn modelId="{67215D6F-A184-4291-9719-3B61C537CC5D}" srcId="{7E980AD9-B89E-4022-BCD6-D5C4EF4AB0B0}" destId="{E139E7D9-36C5-433A-911D-48199D0E2EE7}" srcOrd="1" destOrd="0" parTransId="{EE90EAE8-6438-461E-A87E-201866ED41D6}" sibTransId="{0352E5DE-0574-4753-99B4-564AF8774685}"/>
+    <dgm:cxn modelId="{E00FA8CE-0080-40A1-AB02-83ADC03851D4}" srcId="{C26964BC-0A35-45B2-99C6-1A6B8D245F89}" destId="{C76DCE53-9801-4365-A10C-0EF1AD97E236}" srcOrd="2" destOrd="0" parTransId="{0A9CBFD5-45E3-4EB6-B3A3-F1CD6DEFF9F1}" sibTransId="{F557704B-211C-458F-A8FA-AFB1DF16A9AF}"/>
+    <dgm:cxn modelId="{A2132C39-6AFC-4538-AC90-5AD4390D580E}" srcId="{C76DCE53-9801-4365-A10C-0EF1AD97E236}" destId="{BAC4BE08-CCF1-43DB-8E66-48C44699A626}" srcOrd="0" destOrd="0" parTransId="{4DED331E-4470-4840-B390-A501BED9A376}" sibTransId="{132B8FD0-D194-4ADA-A15C-778381AFA98B}"/>
+    <dgm:cxn modelId="{FAEBB0D6-606D-4103-86AE-7B4BF96373D3}" srcId="{C76DCE53-9801-4365-A10C-0EF1AD97E236}" destId="{D1F66228-5EDD-4086-ADEC-725717960FFE}" srcOrd="1" destOrd="0" parTransId="{E04ACA23-86FF-471C-9A2F-F9B3E71805DD}" sibTransId="{62B596D4-EFB0-43E1-802B-5CB2C00B81AF}"/>
+    <dgm:cxn modelId="{284F1821-FE09-4FE2-A80D-085045E38C6F}" srcId="{C26964BC-0A35-45B2-99C6-1A6B8D245F89}" destId="{B112B494-1E89-4E52-9685-941094BA439A}" srcOrd="3" destOrd="0" parTransId="{3995F361-6B20-46E0-A8B2-C5DABADDC68F}" sibTransId="{B2C81CCD-27BE-423A-BCA4-8CFC9EDE8140}"/>
+    <dgm:cxn modelId="{29EB7A2B-E1ED-4384-8B86-8632E7AB0E07}" srcId="{B112B494-1E89-4E52-9685-941094BA439A}" destId="{CB161991-CD13-49FF-A56D-E9414A3E69C4}" srcOrd="0" destOrd="0" parTransId="{E8B0C497-2DB6-4073-AB7A-7B766E98AC26}" sibTransId="{52BA2188-AD88-4521-81AD-3F586F584C7B}"/>
+    <dgm:cxn modelId="{361D0C2D-91F9-49F2-A536-A13C94631580}" srcId="{B112B494-1E89-4E52-9685-941094BA439A}" destId="{15DEABF6-EB0F-4853-BBBE-FD9549953FC0}" srcOrd="1" destOrd="0" parTransId="{7A8D03FC-05E4-4ABB-9AA1-10DC9BA5B443}" sibTransId="{5930FA40-A9FC-4588-8ABF-4457585EE795}"/>
+    <dgm:cxn modelId="{7C2D2EF3-3F17-439D-91AD-736B18FCC3C4}" srcId="{C26964BC-0A35-45B2-99C6-1A6B8D245F89}" destId="{06C4CF1C-0D8E-41CD-A1F3-620925080707}" srcOrd="4" destOrd="0" parTransId="{C4D66CCD-6276-42E9-9E80-CA28E3612E0E}" sibTransId="{E740232D-8E0F-40AB-8015-6F50898EF26E}"/>
+    <dgm:cxn modelId="{143CC03B-DDF1-459F-910F-65247A1B0AB3}" srcId="{06C4CF1C-0D8E-41CD-A1F3-620925080707}" destId="{BEE46EED-9A51-4205-8577-68C6BF240BE1}" srcOrd="0" destOrd="0" parTransId="{576686E1-7776-44A1-9178-4796D07502B7}" sibTransId="{E3C4175C-7F7F-4725-AE8F-C1C2A2B2A3F6}"/>
+    <dgm:cxn modelId="{7D09D6C8-C72A-4E13-99A6-BFC398BFFAB7}" srcId="{06C4CF1C-0D8E-41CD-A1F3-620925080707}" destId="{800452A0-E83B-4DB1-AC53-C962E893190E}" srcOrd="1" destOrd="0" parTransId="{0EECE19B-96AD-487A-A31F-1B91ACE8798C}" sibTransId="{B7C3D348-9BF0-4C39-845D-9FC89B085CEA}"/>
+    <dgm:cxn modelId="{9846F809-FC49-4B17-B9A5-BE00A0E4A942}" type="presOf" srcId="{C26964BC-0A35-45B2-99C6-1A6B8D245F89}" destId="{96F4358F-C9DA-480B-AFE1-868246384B62}" srcOrd="0" destOrd="0" presId="urn:microsoft.com/office/officeart/2005/8/layout/vList5"/>
+    <dgm:cxn modelId="{6D5CA4F1-803C-41C3-964E-D23B2623184A}" type="presParOf" srcId="{96F4358F-C9DA-480B-AFE1-868246384B62}" destId="{B8EDADDB-9C9E-4BF9-AF56-87592ED551AD}" srcOrd="0" destOrd="0" presId="urn:microsoft.com/office/officeart/2005/8/layout/vList5"/>
+    <dgm:cxn modelId="{67E275A0-03D6-430F-9E9A-7C2CBA59A338}" type="presParOf" srcId="{B8EDADDB-9C9E-4BF9-AF56-87592ED551AD}" destId="{8B915227-2E48-4F5E-A841-EADD20050073}" srcOrd="0" destOrd="0" presId="urn:microsoft.com/office/officeart/2005/8/layout/vList5"/>
+    <dgm:cxn modelId="{12C7A25A-FBB4-4781-8DAE-17879176D6B1}" type="presOf" srcId="{A5C483E8-DB06-4703-BDAE-61A993FAEE32}" destId="{8B915227-2E48-4F5E-A841-EADD20050073}" srcOrd="0" destOrd="0" presId="urn:microsoft.com/office/officeart/2005/8/layout/vList5"/>
+    <dgm:cxn modelId="{77F8A2E5-0F26-48BA-A47B-28B85E18B697}" type="presParOf" srcId="{B8EDADDB-9C9E-4BF9-AF56-87592ED551AD}" destId="{D68CAC0D-23CA-495E-825F-7F33FEFD8552}" srcOrd="1" destOrd="0" presId="urn:microsoft.com/office/officeart/2005/8/layout/vList5"/>
+    <dgm:cxn modelId="{3F2EC59F-2055-4B07-AB0B-194964C96566}" type="presOf" srcId="{1FA4B074-674D-45FC-A05F-963B51E32DEE}" destId="{D68CAC0D-23CA-495E-825F-7F33FEFD8552}" srcOrd="0" destOrd="0" presId="urn:microsoft.com/office/officeart/2005/8/layout/vList5"/>
+    <dgm:cxn modelId="{B31B0309-5F6D-4C75-8459-E53236BFF9F4}" type="presOf" srcId="{595F6B9F-3702-4EEF-9D6D-6F2948272FEE}" destId="{D68CAC0D-23CA-495E-825F-7F33FEFD8552}" srcOrd="0" destOrd="1" presId="urn:microsoft.com/office/officeart/2005/8/layout/vList5"/>
+    <dgm:cxn modelId="{55D804D4-8C8B-4D6C-BECB-A98BBA6446D6}" type="presParOf" srcId="{96F4358F-C9DA-480B-AFE1-868246384B62}" destId="{6DF618C4-C3AD-4CE5-9BAB-3E51F62038C5}" srcOrd="1" destOrd="0" presId="urn:microsoft.com/office/officeart/2005/8/layout/vList5"/>
+    <dgm:cxn modelId="{47188513-DE55-4288-8B13-5009644B0543}" type="presParOf" srcId="{96F4358F-C9DA-480B-AFE1-868246384B62}" destId="{2DF99B9C-BFBF-48B2-80BF-00B7318823B2}" srcOrd="2" destOrd="0" presId="urn:microsoft.com/office/officeart/2005/8/layout/vList5"/>
+    <dgm:cxn modelId="{D7E661E2-2D23-41D6-AE01-B8A5ED838E06}" type="presParOf" srcId="{2DF99B9C-BFBF-48B2-80BF-00B7318823B2}" destId="{ADE12B2F-5D73-47A3-9ED7-271A4D2E951E}" srcOrd="0" destOrd="0" presId="urn:microsoft.com/office/officeart/2005/8/layout/vList5"/>
+    <dgm:cxn modelId="{ECD49FE1-1BA7-46FA-869E-EFD9533966B0}" type="presOf" srcId="{7E980AD9-B89E-4022-BCD6-D5C4EF4AB0B0}" destId="{ADE12B2F-5D73-47A3-9ED7-271A4D2E951E}" srcOrd="0" destOrd="0" presId="urn:microsoft.com/office/officeart/2005/8/layout/vList5"/>
+    <dgm:cxn modelId="{2EFC1678-FEB0-416D-9093-67B58D44E77D}" type="presParOf" srcId="{2DF99B9C-BFBF-48B2-80BF-00B7318823B2}" destId="{E8737758-9D7A-4F67-B463-2234AD083BC2}" srcOrd="1" destOrd="0" presId="urn:microsoft.com/office/officeart/2005/8/layout/vList5"/>
+    <dgm:cxn modelId="{CC7B682B-F7A7-468B-9993-208F5CA7E6E2}" type="presOf" srcId="{5CA2F275-63D8-4B36-A6AF-864CCD2D85A0}" destId="{E8737758-9D7A-4F67-B463-2234AD083BC2}" srcOrd="0" destOrd="0" presId="urn:microsoft.com/office/officeart/2005/8/layout/vList5"/>
+    <dgm:cxn modelId="{01947221-4CA4-4236-A427-814D2AE86788}" type="presOf" srcId="{E139E7D9-36C5-433A-911D-48199D0E2EE7}" destId="{E8737758-9D7A-4F67-B463-2234AD083BC2}" srcOrd="0" destOrd="1" presId="urn:microsoft.com/office/officeart/2005/8/layout/vList5"/>
+    <dgm:cxn modelId="{E92745A4-A4CB-4561-A68D-3A2B380C8D18}" type="presParOf" srcId="{96F4358F-C9DA-480B-AFE1-868246384B62}" destId="{231FF83B-ED47-496B-87A5-DF1159D1A862}" srcOrd="3" destOrd="0" presId="urn:microsoft.com/office/officeart/2005/8/layout/vList5"/>
+    <dgm:cxn modelId="{C133E91B-176D-439B-AE68-6CE1EA612CA4}" type="presParOf" srcId="{96F4358F-C9DA-480B-AFE1-868246384B62}" destId="{C765DBC3-7AB3-4BFC-95FE-CBAD9ED207CE}" srcOrd="4" destOrd="0" presId="urn:microsoft.com/office/officeart/2005/8/layout/vList5"/>
+    <dgm:cxn modelId="{17EC72C8-F83E-4B37-88BB-B99E21E46E44}" type="presParOf" srcId="{C765DBC3-7AB3-4BFC-95FE-CBAD9ED207CE}" destId="{E867D77D-BF27-443E-B819-6D791C5D74E0}" srcOrd="0" destOrd="0" presId="urn:microsoft.com/office/officeart/2005/8/layout/vList5"/>
+    <dgm:cxn modelId="{B4A6B3FF-B49E-4014-94EB-FC03B463C4C0}" type="presOf" srcId="{C76DCE53-9801-4365-A10C-0EF1AD97E236}" destId="{E867D77D-BF27-443E-B819-6D791C5D74E0}" srcOrd="0" destOrd="0" presId="urn:microsoft.com/office/officeart/2005/8/layout/vList5"/>
+    <dgm:cxn modelId="{7A6C8DE7-D004-46FA-BEB2-BECE2A0996E1}" type="presParOf" srcId="{C765DBC3-7AB3-4BFC-95FE-CBAD9ED207CE}" destId="{FB0AE907-C688-4C27-8A7D-628BBED45D7B}" srcOrd="1" destOrd="0" presId="urn:microsoft.com/office/officeart/2005/8/layout/vList5"/>
+    <dgm:cxn modelId="{B0553E57-10B4-41D3-B12E-B316FDDDC6FD}" type="presOf" srcId="{BAC4BE08-CCF1-43DB-8E66-48C44699A626}" destId="{FB0AE907-C688-4C27-8A7D-628BBED45D7B}" srcOrd="0" destOrd="0" presId="urn:microsoft.com/office/officeart/2005/8/layout/vList5"/>
+    <dgm:cxn modelId="{17AD6F4E-AF8E-44C9-B42C-5F453685466B}" type="presOf" srcId="{D1F66228-5EDD-4086-ADEC-725717960FFE}" destId="{FB0AE907-C688-4C27-8A7D-628BBED45D7B}" srcOrd="0" destOrd="1" presId="urn:microsoft.com/office/officeart/2005/8/layout/vList5"/>
+    <dgm:cxn modelId="{109B71F8-0DB9-4220-8F7B-C15E7EA0FE74}" type="presParOf" srcId="{96F4358F-C9DA-480B-AFE1-868246384B62}" destId="{F5AF84F2-D47D-41D0-8BF3-3475C58318A3}" srcOrd="5" destOrd="0" presId="urn:microsoft.com/office/officeart/2005/8/layout/vList5"/>
+    <dgm:cxn modelId="{C6682495-13AD-48A3-9B6A-C11E38D1808A}" type="presParOf" srcId="{96F4358F-C9DA-480B-AFE1-868246384B62}" destId="{3BD02453-78CE-4210-9E54-CA88019A3866}" srcOrd="6" destOrd="0" presId="urn:microsoft.com/office/officeart/2005/8/layout/vList5"/>
+    <dgm:cxn modelId="{32E2DF2D-6C3E-4224-8916-EA8F8EC70585}" type="presParOf" srcId="{3BD02453-78CE-4210-9E54-CA88019A3866}" destId="{24DCE27F-FA3A-4209-9080-332569220892}" srcOrd="0" destOrd="0" presId="urn:microsoft.com/office/officeart/2005/8/layout/vList5"/>
+    <dgm:cxn modelId="{EBEEE90B-1192-439D-841F-D29EA8BA6776}" type="presOf" srcId="{B112B494-1E89-4E52-9685-941094BA439A}" destId="{24DCE27F-FA3A-4209-9080-332569220892}" srcOrd="0" destOrd="0" presId="urn:microsoft.com/office/officeart/2005/8/layout/vList5"/>
+    <dgm:cxn modelId="{7FC47102-9A32-4172-B59B-60983C9D30E4}" type="presParOf" srcId="{3BD02453-78CE-4210-9E54-CA88019A3866}" destId="{29D95BCC-196F-491F-8E51-F679952684E8}" srcOrd="1" destOrd="0" presId="urn:microsoft.com/office/officeart/2005/8/layout/vList5"/>
+    <dgm:cxn modelId="{B0C223EA-C1E8-4896-BB5A-F3F8D94E5FA0}" type="presOf" srcId="{CB161991-CD13-49FF-A56D-E9414A3E69C4}" destId="{29D95BCC-196F-491F-8E51-F679952684E8}" srcOrd="0" destOrd="0" presId="urn:microsoft.com/office/officeart/2005/8/layout/vList5"/>
+    <dgm:cxn modelId="{C8BF9439-2486-456D-8D17-6AD0E8CD86FB}" type="presOf" srcId="{15DEABF6-EB0F-4853-BBBE-FD9549953FC0}" destId="{29D95BCC-196F-491F-8E51-F679952684E8}" srcOrd="0" destOrd="1" presId="urn:microsoft.com/office/officeart/2005/8/layout/vList5"/>
+    <dgm:cxn modelId="{DA077838-F0EA-4102-842D-7A54C7244D29}" type="presParOf" srcId="{96F4358F-C9DA-480B-AFE1-868246384B62}" destId="{9DEA7A0E-E6DE-4C08-BEDF-524D4BC74D75}" srcOrd="7" destOrd="0" presId="urn:microsoft.com/office/officeart/2005/8/layout/vList5"/>
+    <dgm:cxn modelId="{3EEFB5AA-B963-4A68-9CE2-E23EECA08891}" type="presParOf" srcId="{96F4358F-C9DA-480B-AFE1-868246384B62}" destId="{242BC8AF-611E-4E42-88F2-DC31E6A2AC03}" srcOrd="8" destOrd="0" presId="urn:microsoft.com/office/officeart/2005/8/layout/vList5"/>
+    <dgm:cxn modelId="{3B3719A6-8558-4EB6-BB23-3BF4CCEAB80C}" type="presParOf" srcId="{242BC8AF-611E-4E42-88F2-DC31E6A2AC03}" destId="{F1505148-9648-4C92-B6DA-3793427BBECF}" srcOrd="0" destOrd="0" presId="urn:microsoft.com/office/officeart/2005/8/layout/vList5"/>
+    <dgm:cxn modelId="{52D11F46-006C-405E-B1C4-169AAF3DAAE5}" type="presOf" srcId="{06C4CF1C-0D8E-41CD-A1F3-620925080707}" destId="{F1505148-9648-4C92-B6DA-3793427BBECF}" srcOrd="0" destOrd="0" presId="urn:microsoft.com/office/officeart/2005/8/layout/vList5"/>
+    <dgm:cxn modelId="{50FB61E1-DD52-466F-9F56-FF92D05673E5}" type="presParOf" srcId="{242BC8AF-611E-4E42-88F2-DC31E6A2AC03}" destId="{F905424A-40A6-46D7-AD0C-7F0C8FF14190}" srcOrd="1" destOrd="0" presId="urn:microsoft.com/office/officeart/2005/8/layout/vList5"/>
+    <dgm:cxn modelId="{2FED0114-5999-4081-B929-0424C2988C98}" type="presOf" srcId="{BEE46EED-9A51-4205-8577-68C6BF240BE1}" destId="{F905424A-40A6-46D7-AD0C-7F0C8FF14190}" srcOrd="0" destOrd="0" presId="urn:microsoft.com/office/officeart/2005/8/layout/vList5"/>
+    <dgm:cxn modelId="{E27F5AE5-5FCE-44A0-BC57-88AE26D05A6B}" type="presOf" srcId="{800452A0-E83B-4DB1-AC53-C962E893190E}" destId="{F905424A-40A6-46D7-AD0C-7F0C8FF14190}" srcOrd="0" destOrd="1" presId="urn:microsoft.com/office/officeart/2005/8/layout/vList5"/>
   </dgm:cxnLst>
   <dgm:bg/>
   <dgm:whole/>

</xml_diff>

<commit_message>
Đề cương: viền bìa, danh mục bảng hình theo trường SEQ, font Hình 3, người hướng dẫn
Co-Authored-By: Claude Opus 5.5 <noreply@anthropic.com>
Claude-Session: https://claude.ai/code/session_01Jj9HfJt3spogVjREoAJ7gj
</commit_message>
<xml_diff>
--- a/de_cuong_tien_si/De_cuong_NCS_NguyenVanTrung.docx
+++ b/de_cuong_tien_si/De_cuong_NCS_NguyenVanTrung.docx
@@ -4,7 +4,7 @@
   <w:body>
     <w:p>
       <w:pPr>
-        <w:spacing w:before="0" w:after="0" w:line="240" w:lineRule="auto"/>
+        <w:spacing w:before="120" w:after="0" w:line="240" w:lineRule="auto"/>
         <w:ind w:firstLine="0"/>
         <w:jc w:val="center"/>
       </w:pPr>
@@ -18,7 +18,7 @@
     </w:p>
     <w:p>
       <w:pPr>
-        <w:spacing w:before="0" w:after="240" w:line="240" w:lineRule="auto"/>
+        <w:spacing w:before="0" w:after="360" w:line="240" w:lineRule="auto"/>
         <w:ind w:firstLine="0"/>
         <w:jc w:val="center"/>
       </w:pPr>
@@ -34,7 +34,7 @@
     </w:p>
     <w:p>
       <w:pPr>
-        <w:spacing w:before="0" w:after="480" w:line="240" w:lineRule="auto"/>
+        <w:spacing w:before="0" w:after="600" w:line="240" w:lineRule="auto"/>
         <w:ind w:firstLine="0"/>
         <w:jc w:val="center"/>
       </w:pPr>
@@ -183,7 +183,7 @@
           <w:sz w:val="26"/>
           <w:szCs w:val="26"/>
         </w:rPr>
-        <w:t xml:space="preserve">Cơ quan công tác: ……………………………………</w:t>
+        <w:t xml:space="preserve">Cơ quan công tác: Chưa có (tốt nghiệp cử nhân năm 2026)</w:t>
       </w:r>
     </w:p>
     <w:p>
@@ -198,34 +198,6 @@
           <w:szCs w:val="26"/>
         </w:rPr>
         <w:t xml:space="preserve">Người hướng dẫn khoa học (dự kiến):</w:t>
-      </w:r>
-    </w:p>
-    <w:p>
-      <w:pPr>
-        <w:spacing w:before="0" w:after="0" w:line="240" w:lineRule="auto"/>
-        <w:ind w:firstLine="0"/>
-        <w:jc w:val="center"/>
-      </w:pPr>
-      <w:r>
-        <w:rPr>
-          <w:sz w:val="26"/>
-          <w:szCs w:val="26"/>
-        </w:rPr>
-        <w:t xml:space="preserve">- ……………………………………</w:t>
-      </w:r>
-    </w:p>
-    <w:p>
-      <w:pPr>
-        <w:spacing w:before="0" w:after="1200" w:line="240" w:lineRule="auto"/>
-        <w:ind w:firstLine="0"/>
-        <w:jc w:val="center"/>
-      </w:pPr>
-      <w:r>
-        <w:rPr>
-          <w:sz w:val="26"/>
-          <w:szCs w:val="26"/>
-        </w:rPr>
-        <w:t xml:space="preserve">- ……………………………………</w:t>
       </w:r>
     </w:p>
     <w:p>
@@ -241,6 +213,38 @@
           <w:sz w:val="26"/>
           <w:szCs w:val="26"/>
         </w:rPr>
+        <w:t xml:space="preserve">- GS.TS. Nguyễn Đức Khương</w:t>
+      </w:r>
+    </w:p>
+    <w:p>
+      <w:pPr>
+        <w:spacing w:before="0" w:after="1500" w:line="240" w:lineRule="auto"/>
+        <w:ind w:firstLine="0"/>
+        <w:jc w:val="center"/>
+      </w:pPr>
+      <w:r>
+        <w:rPr>
+          <w:b/>
+          <w:bCs/>
+          <w:sz w:val="26"/>
+          <w:szCs w:val="26"/>
+        </w:rPr>
+        <w:t xml:space="preserve">- PGS.TS. Trần Thị Thanh Tú</w:t>
+      </w:r>
+    </w:p>
+    <w:p>
+      <w:pPr>
+        <w:spacing w:before="0" w:after="0" w:line="240" w:lineRule="auto"/>
+        <w:ind w:firstLine="0"/>
+        <w:jc w:val="center"/>
+      </w:pPr>
+      <w:r>
+        <w:rPr>
+          <w:b/>
+          <w:bCs/>
+          <w:sz w:val="26"/>
+          <w:szCs w:val="26"/>
+        </w:rPr>
         <w:t xml:space="preserve">HÀ NỘI – 2026</w:t>
       </w:r>
     </w:p>
@@ -250,6 +254,12 @@
           <w:footerReference w:type="default" r:id="rIdX107"/>
           <w:pgSz w:w="11906" w:h="16838"/>
           <w:pgMar w:top="1134" w:right="1134" w:bottom="1134" w:left="1984" w:header="567" w:footer="567" w:gutter="0"/>
+          <w:pgBorders w:offsetFrom="page">
+            <w:top w:val="thinThickSmallGap" w:sz="24" w:space="24" w:color="auto"/>
+            <w:left w:val="thinThickSmallGap" w:sz="24" w:space="24" w:color="auto"/>
+            <w:bottom w:val="thickThinSmallGap" w:sz="24" w:space="24" w:color="auto"/>
+            <w:right w:val="thickThinSmallGap" w:sz="24" w:space="24" w:color="auto"/>
+          </w:pgBorders>
           <w:cols w:space="720"/>
           <w:docGrid w:linePitch="360"/>
         </w:sectPr>
@@ -308,7 +318,7 @@
         <w:t xml:space="preserve"> </w:t>
       </w:r>
       <w:r>
-        <w:t xml:space="preserve">……………………………………</w:t>
+        <w:t xml:space="preserve">Chưa có (tốt nghiệp cử nhân năm 2026)</w:t>
       </w:r>
     </w:p>
     <w:p>
@@ -797,7 +807,7 @@
       </w:r>
       <w:r>
         <w:rPr/>
-        <w:t xml:space="preserve">23</w:t>
+        <w:t xml:space="preserve">24</w:t>
       </w:r>
     </w:p>
     <w:p>
@@ -833,7 +843,7 @@
         <w:fldChar w:fldCharType="begin"/>
       </w:r>
       <w:r>
-        <w:instrText xml:space="preserve"> TOC \h \z \t "TableCaption,1" </w:instrText>
+        <w:instrText xml:space="preserve"> TOC \h \z \c "Bảng" </w:instrText>
       </w:r>
       <w:r>
         <w:fldChar w:fldCharType="separate"/>
@@ -978,7 +988,7 @@
         <w:fldChar w:fldCharType="begin"/>
       </w:r>
       <w:r>
-        <w:instrText xml:space="preserve"> TOC \h \z \t "FigureCaption,1" </w:instrText>
+        <w:instrText xml:space="preserve"> TOC \h \z \c "Hình" </w:instrText>
       </w:r>
       <w:r>
         <w:fldChar w:fldCharType="separate"/>
@@ -1001,7 +1011,7 @@
       </w:pPr>
       <w:r>
         <w:rPr/>
-        <w:t xml:space="preserve">Hình 2. Thiết kế cửa sổ ước lượng, cửa sổ đánh giá và thời điểm chọn mô hình</w:t>
+        <w:t xml:space="preserve">Hình 2. Cửa sổ ước lượng, cửa sổ đánh giá và thời điểm chọn mô hình</w:t>
       </w:r>
       <w:r>
         <w:tab/>
@@ -1396,7 +1406,15 @@
         <w:pStyle w:val="TableCaption"/>
       </w:pPr>
       <w:r>
-        <w:t xml:space="preserve">Bảng 1. Các nhóm nghiên cứu gần nhất và khoảng trống nghiên cứu</w:t>
+        <w:t xml:space="preserve">Bảng </w:t>
+      </w:r>
+      <w:fldSimple w:instr=" SEQ Bảng \* ARABIC ">
+        <w:r>
+          <w:t>1</w:t>
+        </w:r>
+      </w:fldSimple>
+      <w:r>
+        <w:t xml:space="preserve">. Các nhóm nghiên cứu gần nhất và khoảng trống nghiên cứu</w:t>
       </w:r>
     </w:p>
     <w:tbl>
@@ -2455,7 +2473,15 @@
         <w:pStyle w:val="FigureCaption"/>
       </w:pPr>
       <w:r>
-        <w:t xml:space="preserve">Hình 1. Khung phân tích rủi ro lựa chọn mô hình theo chế độ thị trường</w:t>
+        <w:t xml:space="preserve">Hình </w:t>
+      </w:r>
+      <w:fldSimple w:instr=" SEQ Hình \* ARABIC ">
+        <w:r>
+          <w:t>1</w:t>
+        </w:r>
+      </w:fldSimple>
+      <w:r>
+        <w:t xml:space="preserve">. Khung phân tích rủi ro lựa chọn mô hình theo chế độ thị trường</w:t>
       </w:r>
     </w:p>
     <w:p>
@@ -2518,7 +2544,15 @@
         <w:pStyle w:val="TableCaption"/>
       </w:pPr>
       <w:r>
-        <w:t xml:space="preserve">Bảng 2. Giả thuyết, thước đo và cơ sở lý thuyết</w:t>
+        <w:t xml:space="preserve">Bảng </w:t>
+      </w:r>
+      <w:fldSimple w:instr=" SEQ Bảng \* ARABIC ">
+        <w:r>
+          <w:t>2</w:t>
+        </w:r>
+      </w:fldSimple>
+      <w:r>
+        <w:t xml:space="preserve">. Giả thuyết, thước đo và cơ sở lý thuyết</w:t>
       </w:r>
     </w:p>
     <w:tbl>
@@ -2958,7 +2992,15 @@
         <w:pStyle w:val="TableCaption"/>
       </w:pPr>
       <w:r>
-        <w:t xml:space="preserve">Bảng 3. Tập mô hình danh mục cạnh tranh</w:t>
+        <w:t xml:space="preserve">Bảng </w:t>
+      </w:r>
+      <w:fldSimple w:instr=" SEQ Bảng \* ARABIC ">
+        <w:r>
+          <w:t>3</w:t>
+        </w:r>
+      </w:fldSimple>
+      <w:r>
+        <w:t xml:space="preserve">. Tập mô hình danh mục cạnh tranh</w:t>
       </w:r>
     </w:p>
     <w:tbl>
@@ -5105,7 +5147,15 @@
         <w:pStyle w:val="FigureCaption"/>
       </w:pPr>
       <w:r>
-        <w:t xml:space="preserve">Hình 2. Thiết kế cửa sổ ước lượng, cửa sổ đánh giá và thời điểm chọn mô hình</w:t>
+        <w:t xml:space="preserve">Hình </w:t>
+      </w:r>
+      <w:fldSimple w:instr=" SEQ Hình \* ARABIC ">
+        <w:r>
+          <w:t>2</w:t>
+        </w:r>
+      </w:fldSimple>
+      <w:r>
+        <w:t xml:space="preserve">. Cửa sổ ước lượng, cửa sổ đánh giá và thời điểm chọn mô hình</w:t>
       </w:r>
     </w:p>
     <w:p>
@@ -6031,7 +6081,15 @@
         <w:pStyle w:val="FigureCaption"/>
       </w:pPr>
       <w:r>
-        <w:t xml:space="preserve">Hình 3. Quy trình nghiên cứu</w:t>
+        <w:t xml:space="preserve">Hình </w:t>
+      </w:r>
+      <w:fldSimple w:instr=" SEQ Hình \* ARABIC ">
+        <w:r>
+          <w:t>3</w:t>
+        </w:r>
+      </w:fldSimple>
+      <w:r>
+        <w:t xml:space="preserve">. Quy trình nghiên cứu</w:t>
       </w:r>
     </w:p>
     <w:p>
@@ -6229,7 +6287,15 @@
         <w:pStyle w:val="TableCaption"/>
       </w:pPr>
       <w:r>
-        <w:t xml:space="preserve">Bảng 4. Dự kiến bố cục các chương và tiểu mục của luận án</w:t>
+        <w:t xml:space="preserve">Bảng </w:t>
+      </w:r>
+      <w:fldSimple w:instr=" SEQ Bảng \* ARABIC ">
+        <w:r>
+          <w:t>4</w:t>
+        </w:r>
+      </w:fldSimple>
+      <w:r>
+        <w:t xml:space="preserve">. Dự kiến bố cục các chương và tiểu mục của luận án</w:t>
       </w:r>
     </w:p>
     <w:tbl>
@@ -6765,7 +6831,15 @@
         <w:pStyle w:val="TableCaption"/>
       </w:pPr>
       <w:r>
-        <w:t xml:space="preserve">Bảng 5. Kế hoạch thực hiện luận án theo bốn năm và sản phẩm dự kiến</w:t>
+        <w:t xml:space="preserve">Bảng </w:t>
+      </w:r>
+      <w:fldSimple w:instr=" SEQ Bảng \* ARABIC ">
+        <w:r>
+          <w:t>5</w:t>
+        </w:r>
+      </w:fldSimple>
+      <w:r>
+        <w:t xml:space="preserve">. Kế hoạch thực hiện luận án theo bốn năm và sản phẩm dự kiến</w:t>
       </w:r>
     </w:p>
     <w:tbl>
@@ -7095,7 +7169,15 @@
         <w:pStyle w:val="TableCaption"/>
       </w:pPr>
       <w:r>
-        <w:t xml:space="preserve">Bảng 6. Công trình đã công bố hoặc đã được chấp nhận đăng</w:t>
+        <w:t xml:space="preserve">Bảng </w:t>
+      </w:r>
+      <w:fldSimple w:instr=" SEQ Bảng \* ARABIC ">
+        <w:r>
+          <w:t>6</w:t>
+        </w:r>
+      </w:fldSimple>
+      <w:r>
+        <w:t xml:space="preserve">. Công trình đã công bố hoặc đã được chấp nhận đăng</w:t>
       </w:r>
     </w:p>
     <w:tbl>
@@ -7393,7 +7475,15 @@
         <w:pStyle w:val="TableCaption"/>
       </w:pPr>
       <w:r>
-        <w:t xml:space="preserve">Bảng 7. Bản thảo đã gửi tạp chí, chưa công bố tại ngày 30/09/2026</w:t>
+        <w:t xml:space="preserve">Bảng </w:t>
+      </w:r>
+      <w:fldSimple w:instr=" SEQ Bảng \* ARABIC ">
+        <w:r>
+          <w:t>7</w:t>
+        </w:r>
+      </w:fldSimple>
+      <w:r>
+        <w:t xml:space="preserve">. Bản thảo đã gửi tạp chí, chưa công bố tại ngày 30/09/2026</w:t>
       </w:r>
     </w:p>
     <w:tbl>
@@ -8267,7 +8357,25 @@
         <w:pStyle w:val="FirstParagraph"/>
       </w:pPr>
       <w:r>
-        <w:t xml:space="preserve">Người hướng dẫn chính (dự kiến): ……………………………………</w:t>
+        <w:t xml:space="preserve">Thí sinh đề xuất hai người hướng dẫn thuộc định hướng nghiên cứu</w:t>
+      </w:r>
+      <w:r>
+        <w:t xml:space="preserve"> </w:t>
+      </w:r>
+      <w:r>
+        <w:t xml:space="preserve">“</w:t>
+      </w:r>
+      <w:r>
+        <w:t xml:space="preserve">chính sách tài khóa, tài chính tiền tệ, phát triển thị trường tài chính, tái cấu trúc hệ thống ngân hàng, quản trị tài chính, quản trị ngân hàng</w:t>
+      </w:r>
+      <w:r>
+        <w:t xml:space="preserve">”</w:t>
+      </w:r>
+      <w:r>
+        <w:t xml:space="preserve"> </w:t>
+      </w:r>
+      <w:r>
+        <w:t xml:space="preserve">trong danh mục của Nhà trường năm 2026.</w:t>
       </w:r>
     </w:p>
     <w:p>
@@ -8275,7 +8383,15 @@
         <w:pStyle w:val="BodyText"/>
       </w:pPr>
       <w:r>
-        <w:t xml:space="preserve">Người hướng dẫn thứ hai (nếu có): ……………………………………</w:t>
+        <w:t xml:space="preserve">Người hướng dẫn chính (dự kiến): GS.TS. Nguyễn Đức Khương. Hướng nghiên cứu của người hướng dẫn gồm thị trường tài chính mới nổi, mô hình biến động và quản trị rủi ro trên thị trường vốn quốc tế, trùng với ba cấu phần của đề tài: chế độ biến động của thị trường, rủi ro mô hình và quyết định danh mục ở một thị trường mới nổi.</w:t>
+      </w:r>
+    </w:p>
+    <w:p>
+      <w:pPr>
+        <w:pStyle w:val="BodyText"/>
+      </w:pPr>
+      <w:r>
+        <w:t xml:space="preserve">Người hướng dẫn thứ hai (dự kiến): PGS.TS. Trần Thị Thanh Tú. Hướng nghiên cứu của người hướng dẫn gồm quản trị ngân hàng và quản trị rủi ro, gắn với phần thủ tục giám sát mô hình và hàm ý quản trị của đề tài trong bối cảnh khung quy định Việt Nam.</w:t>
       </w:r>
     </w:p>
     <w:bookmarkEnd w:id="47"/>
@@ -11954,7 +12070,7 @@
 <file path=word/diagrams/data1.xml><?xml version="1.0" encoding="utf-8"?>
 <dgm:dataModel xmlns:dgm="http://schemas.openxmlformats.org/drawingml/2006/diagram" xmlns:a="http://schemas.openxmlformats.org/drawingml/2006/main">
   <dgm:ptLst>
-    <dgm:pt modelId="{C26964BC-0A35-45B2-99C6-1A6B8D245F89}" type="doc">
+    <dgm:pt modelId="{A14790B2-4EC4-4611-906F-828EC5C5DA3B}" type="doc">
       <dgm:prSet loTypeId="urn:microsoft.com/office/officeart/2005/8/layout/vList5" loCatId="list" qsTypeId="urn:microsoft.com/office/officeart/2005/8/quickstyle/simple1" qsCatId="simple" csTypeId="urn:microsoft.com/office/officeart/2005/8/colors/accent0_1" csCatId="mainScheme" phldr="0"/>
       <dgm:spPr/>
       <dgm:t>
@@ -11965,21 +12081,25 @@
         </a:p>
       </dgm:t>
     </dgm:pt>
-    <dgm:pt modelId="{A5C483E8-DB06-4703-BDAE-61A993FAEE32}">
-      <dgm:prSet phldrT="[Text]"/>
+    <dgm:pt modelId="{2A249F52-7791-48FC-A7F7-9477B1598F9C}">
+      <dgm:prSet phldrT="[Text]" custT="1"/>
       <dgm:spPr/>
       <dgm:t>
         <a:bodyPr/>
         <a:lstStyle/>
         <a:p>
           <a:r>
-            <a:rPr lang="vi-VN"/>
+            <a:rPr lang="vi-VN" sz="1300" b="1">
+              <a:latin typeface="Times New Roman"/>
+              <a:ea typeface="Times New Roman"/>
+              <a:cs typeface="Times New Roman"/>
+            </a:rPr>
             <a:t>Bước 1. Dữ liệu</a:t>
           </a:r>
         </a:p>
       </dgm:t>
     </dgm:pt>
-    <dgm:pt modelId="{BDC55087-D74E-4C3F-8512-7A5A2736FFE3}" type="parTrans" cxnId="{4C104022-B5CD-4A64-9A4B-5C0071F2A984}">
+    <dgm:pt modelId="{24D21E4F-CE2D-4EC9-B225-5A8592F2009E}" type="parTrans" cxnId="{77BD46A4-9E0F-459B-B633-E359C905BECE}">
       <dgm:prSet/>
       <dgm:spPr/>
       <dgm:t>
@@ -11990,7 +12110,7 @@
         </a:p>
       </dgm:t>
     </dgm:pt>
-    <dgm:pt modelId="{61BBFB2B-9B88-4642-87BD-D3088AD94E21}" type="sibTrans" cxnId="{4C104022-B5CD-4A64-9A4B-5C0071F2A984}">
+    <dgm:pt modelId="{EFADC0CC-08A8-4903-9BC9-01D307E7D189}" type="sibTrans" cxnId="{77BD46A4-9E0F-459B-B633-E359C905BECE}">
       <dgm:prSet/>
       <dgm:spPr/>
       <dgm:t>
@@ -12001,21 +12121,25 @@
         </a:p>
       </dgm:t>
     </dgm:pt>
-    <dgm:pt modelId="{1FA4B074-674D-45FC-A05F-963B51E32DEE}">
-      <dgm:prSet phldrT="[Text]"/>
+    <dgm:pt modelId="{67DD0961-D45E-421B-AC27-AE9ED79D959C}">
+      <dgm:prSet phldrT="[Text]" custT="1"/>
       <dgm:spPr/>
       <dgm:t>
         <a:bodyPr/>
         <a:lstStyle/>
         <a:p>
           <a:r>
-            <a:rPr lang="vi-VN"/>
+            <a:rPr lang="vi-VN" sz="1100" b="0">
+              <a:latin typeface="Times New Roman"/>
+              <a:ea typeface="Times New Roman"/>
+              <a:cs typeface="Times New Roman"/>
+            </a:rPr>
             <a:t>Giá điều chỉnh, khối lượng, lãi suất phi rủi ro</a:t>
           </a:r>
         </a:p>
       </dgm:t>
     </dgm:pt>
-    <dgm:pt modelId="{A446BADE-2ABD-451C-9FBC-06D529485B54}" type="parTrans" cxnId="{A4D49CB0-CB3B-4C06-95C6-0038144C897B}">
+    <dgm:pt modelId="{D7BB1197-45E6-4EE6-B3AA-1D6EAF0BC349}" type="parTrans" cxnId="{12553DB7-CEFB-4043-9B10-60B1CA974367}">
       <dgm:prSet/>
       <dgm:spPr/>
       <dgm:t>
@@ -12026,7 +12150,7 @@
         </a:p>
       </dgm:t>
     </dgm:pt>
-    <dgm:pt modelId="{53B3EAA8-20D7-4564-8DB2-5982F8B49116}" type="sibTrans" cxnId="{A4D49CB0-CB3B-4C06-95C6-0038144C897B}">
+    <dgm:pt modelId="{D1880A73-CEBA-44D7-BBD5-2F15CBBA2D59}" type="sibTrans" cxnId="{12553DB7-CEFB-4043-9B10-60B1CA974367}">
       <dgm:prSet/>
       <dgm:spPr/>
       <dgm:t>
@@ -12037,21 +12161,25 @@
         </a:p>
       </dgm:t>
     </dgm:pt>
-    <dgm:pt modelId="{595F6B9F-3702-4EEF-9D6D-6F2948272FEE}">
-      <dgm:prSet phldrT="[Text]"/>
+    <dgm:pt modelId="{F63166CF-860A-47F8-AA2C-8FF6B43A2725}">
+      <dgm:prSet phldrT="[Text]" custT="1"/>
       <dgm:spPr/>
       <dgm:t>
         <a:bodyPr/>
         <a:lstStyle/>
         <a:p>
           <a:r>
-            <a:rPr lang="vi-VN"/>
+            <a:rPr lang="vi-VN" sz="1100" b="0">
+              <a:latin typeface="Times New Roman"/>
+              <a:ea typeface="Times New Roman"/>
+              <a:cs typeface="Times New Roman"/>
+            </a:rPr>
             <a:t>Rổ 30 cổ phiếu xác định tại từng ngày tái cân bằng</a:t>
           </a:r>
         </a:p>
       </dgm:t>
     </dgm:pt>
-    <dgm:pt modelId="{CF542903-3BA9-4320-AAEB-A55A8524123B}" type="parTrans" cxnId="{CC4498C6-90D9-4F44-AE29-C33E6938474F}">
+    <dgm:pt modelId="{F9EC04F9-9475-45A3-AEE3-DC88EEF42786}" type="parTrans" cxnId="{1793D2E6-52CC-42C7-8DC9-0F5DA3324B51}">
       <dgm:prSet/>
       <dgm:spPr/>
       <dgm:t>
@@ -12062,7 +12190,7 @@
         </a:p>
       </dgm:t>
     </dgm:pt>
-    <dgm:pt modelId="{FD2C1209-D444-4351-999F-20F135378670}" type="sibTrans" cxnId="{CC4498C6-90D9-4F44-AE29-C33E6938474F}">
+    <dgm:pt modelId="{942C9118-18D4-4B3C-8095-5D90ABFD69E5}" type="sibTrans" cxnId="{1793D2E6-52CC-42C7-8DC9-0F5DA3324B51}">
       <dgm:prSet/>
       <dgm:spPr/>
       <dgm:t>
@@ -12073,21 +12201,25 @@
         </a:p>
       </dgm:t>
     </dgm:pt>
-    <dgm:pt modelId="{7E980AD9-B89E-4022-BCD6-D5C4EF4AB0B0}">
-      <dgm:prSet phldrT="[Text]"/>
+    <dgm:pt modelId="{C9D1F496-E754-4268-8C64-30459A7D6709}">
+      <dgm:prSet phldrT="[Text]" custT="1"/>
       <dgm:spPr/>
       <dgm:t>
         <a:bodyPr/>
         <a:lstStyle/>
         <a:p>
           <a:r>
-            <a:rPr lang="vi-VN"/>
+            <a:rPr lang="vi-VN" sz="1300" b="1">
+              <a:latin typeface="Times New Roman"/>
+              <a:ea typeface="Times New Roman"/>
+              <a:cs typeface="Times New Roman"/>
+            </a:rPr>
             <a:t>Bước 2. Chế độ thị trường</a:t>
           </a:r>
         </a:p>
       </dgm:t>
     </dgm:pt>
-    <dgm:pt modelId="{33692F20-3F61-4167-BF38-9F9181C1E18A}" type="parTrans" cxnId="{D7CD54A9-DA38-4F50-AA9B-50B61D2CD46F}">
+    <dgm:pt modelId="{6FFE751D-FAB9-4F72-8996-B69AF28C170A}" type="parTrans" cxnId="{F61E9AE4-36B6-46E8-97C5-CC5767CE8156}">
       <dgm:prSet/>
       <dgm:spPr/>
       <dgm:t>
@@ -12098,7 +12230,7 @@
         </a:p>
       </dgm:t>
     </dgm:pt>
-    <dgm:pt modelId="{8F2174F3-8CDB-4071-A415-DB437E1DEA58}" type="sibTrans" cxnId="{D7CD54A9-DA38-4F50-AA9B-50B61D2CD46F}">
+    <dgm:pt modelId="{2DFDC93E-FA22-4D0A-9678-373F5F2623AA}" type="sibTrans" cxnId="{F61E9AE4-36B6-46E8-97C5-CC5767CE8156}">
       <dgm:prSet/>
       <dgm:spPr/>
       <dgm:t>
@@ -12109,21 +12241,25 @@
         </a:p>
       </dgm:t>
     </dgm:pt>
-    <dgm:pt modelId="{5CA2F275-63D8-4B36-A6AF-864CCD2D85A0}">
-      <dgm:prSet phldrT="[Text]"/>
+    <dgm:pt modelId="{4C9A6D7F-D448-48C4-8FE7-67E65549357A}">
+      <dgm:prSet phldrT="[Text]" custT="1"/>
       <dgm:spPr/>
       <dgm:t>
         <a:bodyPr/>
         <a:lstStyle/>
         <a:p>
           <a:r>
-            <a:rPr lang="vi-VN"/>
+            <a:rPr lang="vi-VN" sz="1100" b="0">
+              <a:latin typeface="Times New Roman"/>
+              <a:ea typeface="Times New Roman"/>
+              <a:cs typeface="Times New Roman"/>
+            </a:rPr>
             <a:t>Mô hình chuyển chế độ Markov, cửa sổ mở rộng</a:t>
           </a:r>
         </a:p>
       </dgm:t>
     </dgm:pt>
-    <dgm:pt modelId="{6AC703C4-005A-4800-B428-FAAB8DFFC3E8}" type="parTrans" cxnId="{4B7DE63D-5733-4C47-BBCE-C064FB99B8CE}">
+    <dgm:pt modelId="{3D64E841-0A73-4C38-9A43-D43B03B2BEB1}" type="parTrans" cxnId="{EEAABDA0-4E2B-4DDD-83C0-C9F583FAC17F}">
       <dgm:prSet/>
       <dgm:spPr/>
       <dgm:t>
@@ -12134,7 +12270,7 @@
         </a:p>
       </dgm:t>
     </dgm:pt>
-    <dgm:pt modelId="{34B97BCB-61AC-4609-9599-F049E9D7F892}" type="sibTrans" cxnId="{4B7DE63D-5733-4C47-BBCE-C064FB99B8CE}">
+    <dgm:pt modelId="{7241D431-F080-41C3-9828-E5669CC17B9F}" type="sibTrans" cxnId="{EEAABDA0-4E2B-4DDD-83C0-C9F583FAC17F}">
       <dgm:prSet/>
       <dgm:spPr/>
       <dgm:t>
@@ -12145,21 +12281,25 @@
         </a:p>
       </dgm:t>
     </dgm:pt>
-    <dgm:pt modelId="{E139E7D9-36C5-433A-911D-48199D0E2EE7}">
-      <dgm:prSet phldrT="[Text]"/>
+    <dgm:pt modelId="{910DAFFA-802D-4189-8EFE-9F1C4D28C641}">
+      <dgm:prSet phldrT="[Text]" custT="1"/>
       <dgm:spPr/>
       <dgm:t>
         <a:bodyPr/>
         <a:lstStyle/>
         <a:p>
           <a:r>
-            <a:rPr lang="vi-VN"/>
+            <a:rPr lang="vi-VN" sz="1100" b="0">
+              <a:latin typeface="Times New Roman"/>
+              <a:ea typeface="Times New Roman"/>
+              <a:cs typeface="Times New Roman"/>
+            </a:rPr>
             <a:t>Xác suất lọc của chế độ căng thẳng tại ngày t</a:t>
           </a:r>
         </a:p>
       </dgm:t>
     </dgm:pt>
-    <dgm:pt modelId="{EE90EAE8-6438-461E-A87E-201866ED41D6}" type="parTrans" cxnId="{67215D6F-A184-4291-9719-3B61C537CC5D}">
+    <dgm:pt modelId="{CA4100DA-1127-45D5-9966-DAD64502428D}" type="parTrans" cxnId="{A079E798-D226-4051-A460-C2A5D299DDAB}">
       <dgm:prSet/>
       <dgm:spPr/>
       <dgm:t>
@@ -12170,7 +12310,7 @@
         </a:p>
       </dgm:t>
     </dgm:pt>
-    <dgm:pt modelId="{0352E5DE-0574-4753-99B4-564AF8774685}" type="sibTrans" cxnId="{67215D6F-A184-4291-9719-3B61C537CC5D}">
+    <dgm:pt modelId="{CE7AC8C4-3130-4B80-81E6-6DEC77CB8A87}" type="sibTrans" cxnId="{A079E798-D226-4051-A460-C2A5D299DDAB}">
       <dgm:prSet/>
       <dgm:spPr/>
       <dgm:t>
@@ -12181,21 +12321,25 @@
         </a:p>
       </dgm:t>
     </dgm:pt>
-    <dgm:pt modelId="{C76DCE53-9801-4365-A10C-0EF1AD97E236}">
-      <dgm:prSet phldrT="[Text]"/>
+    <dgm:pt modelId="{A21BE0E5-9F89-42D9-89E8-508E411A75B4}">
+      <dgm:prSet phldrT="[Text]" custT="1"/>
       <dgm:spPr/>
       <dgm:t>
         <a:bodyPr/>
         <a:lstStyle/>
         <a:p>
           <a:r>
-            <a:rPr lang="vi-VN"/>
+            <a:rPr lang="vi-VN" sz="1300" b="1">
+              <a:latin typeface="Times New Roman"/>
+              <a:ea typeface="Times New Roman"/>
+              <a:cs typeface="Times New Roman"/>
+            </a:rPr>
             <a:t>Bước 3. Tập bảy mô hình</a:t>
           </a:r>
         </a:p>
       </dgm:t>
     </dgm:pt>
-    <dgm:pt modelId="{0A9CBFD5-45E3-4EB6-B3A3-F1CD6DEFF9F1}" type="parTrans" cxnId="{E00FA8CE-0080-40A1-AB02-83ADC03851D4}">
+    <dgm:pt modelId="{95484804-886B-41B1-93E5-BDD2CD6CEF8F}" type="parTrans" cxnId="{C8B7F2E7-2D8C-436F-A920-71D120802BEB}">
       <dgm:prSet/>
       <dgm:spPr/>
       <dgm:t>
@@ -12206,7 +12350,7 @@
         </a:p>
       </dgm:t>
     </dgm:pt>
-    <dgm:pt modelId="{F557704B-211C-458F-A8FA-AFB1DF16A9AF}" type="sibTrans" cxnId="{E00FA8CE-0080-40A1-AB02-83ADC03851D4}">
+    <dgm:pt modelId="{A9BDC510-E5A8-47EE-9DBB-984F4307D33B}" type="sibTrans" cxnId="{C8B7F2E7-2D8C-436F-A920-71D120802BEB}">
       <dgm:prSet/>
       <dgm:spPr/>
       <dgm:t>
@@ -12217,21 +12361,25 @@
         </a:p>
       </dgm:t>
     </dgm:pt>
-    <dgm:pt modelId="{BAC4BE08-CCF1-43DB-8E66-48C44699A626}">
-      <dgm:prSet phldrT="[Text]"/>
+    <dgm:pt modelId="{3A95B2CD-D13C-40FB-AD26-5672970C63CA}">
+      <dgm:prSet phldrT="[Text]" custT="1"/>
       <dgm:spPr/>
       <dgm:t>
         <a:bodyPr/>
         <a:lstStyle/>
         <a:p>
           <a:r>
-            <a:rPr lang="vi-VN"/>
+            <a:rPr lang="vi-VN" sz="1100" b="0">
+              <a:latin typeface="Times New Roman"/>
+              <a:ea typeface="Times New Roman"/>
+              <a:cs typeface="Times New Roman"/>
+            </a:rPr>
             <a:t>Đăng ký trước: cửa sổ, siêu tham số, ngưỡng, quy tắc kết luận</a:t>
           </a:r>
         </a:p>
       </dgm:t>
     </dgm:pt>
-    <dgm:pt modelId="{4DED331E-4470-4840-B390-A501BED9A376}" type="parTrans" cxnId="{A2132C39-6AFC-4538-AC90-5AD4390D580E}">
+    <dgm:pt modelId="{76D2A46B-4378-4C10-A7B6-C3FEFD7DA675}" type="parTrans" cxnId="{D42BD8C6-E3ED-4E7B-8686-8E0F04C8E779}">
       <dgm:prSet/>
       <dgm:spPr/>
       <dgm:t>
@@ -12242,7 +12390,7 @@
         </a:p>
       </dgm:t>
     </dgm:pt>
-    <dgm:pt modelId="{132B8FD0-D194-4ADA-A15C-778381AFA98B}" type="sibTrans" cxnId="{A2132C39-6AFC-4538-AC90-5AD4390D580E}">
+    <dgm:pt modelId="{A82ADFAD-2C9C-4EE1-BCAA-AE4A64EB655F}" type="sibTrans" cxnId="{D42BD8C6-E3ED-4E7B-8686-8E0F04C8E779}">
       <dgm:prSet/>
       <dgm:spPr/>
       <dgm:t>
@@ -12253,21 +12401,25 @@
         </a:p>
       </dgm:t>
     </dgm:pt>
-    <dgm:pt modelId="{D1F66228-5EDD-4086-ADEC-725717960FFE}">
-      <dgm:prSet phldrT="[Text]"/>
+    <dgm:pt modelId="{BBEF86E7-5B97-4B28-AA7F-E7C4E933CCCA}">
+      <dgm:prSet phldrT="[Text]" custT="1"/>
       <dgm:spPr/>
       <dgm:t>
         <a:bodyPr/>
         <a:lstStyle/>
         <a:p>
           <a:r>
-            <a:rPr lang="vi-VN"/>
+            <a:rPr lang="vi-VN" sz="1100" b="0">
+              <a:latin typeface="Times New Roman"/>
+              <a:ea typeface="Times New Roman"/>
+              <a:cs typeface="Times New Roman"/>
+            </a:rPr>
             <a:t>Ước lượng M1 đến M7, tái cân bằng hằng tháng</a:t>
           </a:r>
         </a:p>
       </dgm:t>
     </dgm:pt>
-    <dgm:pt modelId="{E04ACA23-86FF-471C-9A2F-F9B3E71805DD}" type="parTrans" cxnId="{FAEBB0D6-606D-4103-86AE-7B4BF96373D3}">
+    <dgm:pt modelId="{0FE6DDD2-A2CA-4F63-B254-58292DD055C7}" type="parTrans" cxnId="{8A7CD3E8-B37D-45C5-9FA8-47419B7E7BE8}">
       <dgm:prSet/>
       <dgm:spPr/>
       <dgm:t>
@@ -12278,7 +12430,7 @@
         </a:p>
       </dgm:t>
     </dgm:pt>
-    <dgm:pt modelId="{62B596D4-EFB0-43E1-802B-5CB2C00B81AF}" type="sibTrans" cxnId="{FAEBB0D6-606D-4103-86AE-7B4BF96373D3}">
+    <dgm:pt modelId="{918740FC-79A2-4108-94DF-A5039D22E381}" type="sibTrans" cxnId="{8A7CD3E8-B37D-45C5-9FA8-47419B7E7BE8}">
       <dgm:prSet/>
       <dgm:spPr/>
       <dgm:t>
@@ -12289,21 +12441,25 @@
         </a:p>
       </dgm:t>
     </dgm:pt>
-    <dgm:pt modelId="{B112B494-1E89-4E52-9685-941094BA439A}">
-      <dgm:prSet phldrT="[Text]"/>
+    <dgm:pt modelId="{8C4BF9D1-AFF8-4068-A2FE-E565A9FC4492}">
+      <dgm:prSet phldrT="[Text]" custT="1"/>
       <dgm:spPr/>
       <dgm:t>
         <a:bodyPr/>
         <a:lstStyle/>
         <a:p>
           <a:r>
-            <a:rPr lang="vi-VN"/>
+            <a:rPr lang="vi-VN" sz="1300" b="1">
+              <a:latin typeface="Times New Roman"/>
+              <a:ea typeface="Times New Roman"/>
+              <a:cs typeface="Times New Roman"/>
+            </a:rPr>
             <a:t>Bước 4. Đo lường và kiểm định</a:t>
           </a:r>
         </a:p>
       </dgm:t>
     </dgm:pt>
-    <dgm:pt modelId="{3995F361-6B20-46E0-A8B2-C5DABADDC68F}" type="parTrans" cxnId="{284F1821-FE09-4FE2-A80D-085045E38C6F}">
+    <dgm:pt modelId="{E8314AD0-3BEC-4A96-B4A9-7277BBFC9561}" type="parTrans" cxnId="{2AE94751-95DB-43C6-89D4-3366721D3258}">
       <dgm:prSet/>
       <dgm:spPr/>
       <dgm:t>
@@ -12314,7 +12470,7 @@
         </a:p>
       </dgm:t>
     </dgm:pt>
-    <dgm:pt modelId="{B2C81CCD-27BE-423A-BCA4-8CFC9EDE8140}" type="sibTrans" cxnId="{284F1821-FE09-4FE2-A80D-085045E38C6F}">
+    <dgm:pt modelId="{D7BB0C32-CBD8-4899-BEBF-4D13EB12563E}" type="sibTrans" cxnId="{2AE94751-95DB-43C6-89D4-3366721D3258}">
       <dgm:prSet/>
       <dgm:spPr/>
       <dgm:t>
@@ -12325,21 +12481,25 @@
         </a:p>
       </dgm:t>
     </dgm:pt>
-    <dgm:pt modelId="{CB161991-CD13-49FF-A56D-E9414A3E69C4}">
-      <dgm:prSet phldrT="[Text]"/>
+    <dgm:pt modelId="{06763911-0732-4232-877B-F155A7A7870D}">
+      <dgm:prSet phldrT="[Text]" custT="1"/>
       <dgm:spPr/>
       <dgm:t>
         <a:bodyPr/>
         <a:lstStyle/>
         <a:p>
           <a:r>
-            <a:rPr lang="vi-VN"/>
+            <a:rPr lang="vi-VN" sz="1100" b="0">
+              <a:latin typeface="Times New Roman"/>
+              <a:ea typeface="Times New Roman"/>
+              <a:cs typeface="Times New Roman"/>
+            </a:rPr>
             <a:t>Mức hối tiếc, độ phân tán, tập tin cậy mô hình</a:t>
           </a:r>
         </a:p>
       </dgm:t>
     </dgm:pt>
-    <dgm:pt modelId="{E8B0C497-2DB6-4073-AB7A-7B766E98AC26}" type="parTrans" cxnId="{29EB7A2B-E1ED-4384-8B86-8632E7AB0E07}">
+    <dgm:pt modelId="{86D0F2A7-1430-416B-9C05-97A18421C5E1}" type="parTrans" cxnId="{44B9B88C-53A3-4DFD-B580-F099C34162F2}">
       <dgm:prSet/>
       <dgm:spPr/>
       <dgm:t>
@@ -12350,7 +12510,7 @@
         </a:p>
       </dgm:t>
     </dgm:pt>
-    <dgm:pt modelId="{52BA2188-AD88-4521-81AD-3F586F584C7B}" type="sibTrans" cxnId="{29EB7A2B-E1ED-4384-8B86-8632E7AB0E07}">
+    <dgm:pt modelId="{56E0C3BE-E6C7-4156-A2A2-7AAC1EB77C45}" type="sibTrans" cxnId="{44B9B88C-53A3-4DFD-B580-F099C34162F2}">
       <dgm:prSet/>
       <dgm:spPr/>
       <dgm:t>
@@ -12361,21 +12521,25 @@
         </a:p>
       </dgm:t>
     </dgm:pt>
-    <dgm:pt modelId="{15DEABF6-EB0F-4853-BBBE-FD9549953FC0}">
-      <dgm:prSet phldrT="[Text]"/>
+    <dgm:pt modelId="{A6B92AB3-832A-492A-87B9-094FC23EE5C9}">
+      <dgm:prSet phldrT="[Text]" custT="1"/>
       <dgm:spPr/>
       <dgm:t>
         <a:bodyPr/>
         <a:lstStyle/>
         <a:p>
           <a:r>
-            <a:rPr lang="vi-VN"/>
+            <a:rPr lang="vi-VN" sz="1100" b="0">
+              <a:latin typeface="Times New Roman"/>
+              <a:ea typeface="Times New Roman"/>
+              <a:cs typeface="Times New Roman"/>
+            </a:rPr>
             <a:t>Hồi quy, phân phối rỗng bootstrap: H1, H2, H4</a:t>
           </a:r>
         </a:p>
       </dgm:t>
     </dgm:pt>
-    <dgm:pt modelId="{7A8D03FC-05E4-4ABB-9AA1-10DC9BA5B443}" type="parTrans" cxnId="{361D0C2D-91F9-49F2-A536-A13C94631580}">
+    <dgm:pt modelId="{DB67AF25-5729-41D5-BDBC-88859EBD659B}" type="parTrans" cxnId="{837969EB-13FE-425A-8EAF-A519952F1BBE}">
       <dgm:prSet/>
       <dgm:spPr/>
       <dgm:t>
@@ -12386,7 +12550,7 @@
         </a:p>
       </dgm:t>
     </dgm:pt>
-    <dgm:pt modelId="{5930FA40-A9FC-4588-8ABF-4457585EE795}" type="sibTrans" cxnId="{361D0C2D-91F9-49F2-A536-A13C94631580}">
+    <dgm:pt modelId="{E169BA2A-5E04-41C0-A15C-376D37D47E49}" type="sibTrans" cxnId="{837969EB-13FE-425A-8EAF-A519952F1BBE}">
       <dgm:prSet/>
       <dgm:spPr/>
       <dgm:t>
@@ -12397,21 +12561,25 @@
         </a:p>
       </dgm:t>
     </dgm:pt>
-    <dgm:pt modelId="{06C4CF1C-0D8E-41CD-A1F3-620925080707}">
-      <dgm:prSet phldrT="[Text]"/>
+    <dgm:pt modelId="{70D0D24A-C1D3-4A80-A54F-25A2F51DED4F}">
+      <dgm:prSet phldrT="[Text]" custT="1"/>
       <dgm:spPr/>
       <dgm:t>
         <a:bodyPr/>
         <a:lstStyle/>
         <a:p>
           <a:r>
-            <a:rPr lang="vi-VN"/>
+            <a:rPr lang="vi-VN" sz="1300" b="1">
+              <a:latin typeface="Times New Roman"/>
+              <a:ea typeface="Times New Roman"/>
+              <a:cs typeface="Times New Roman"/>
+            </a:rPr>
             <a:t>Bước 5. Cơ chế giảm thiểu</a:t>
           </a:r>
         </a:p>
       </dgm:t>
     </dgm:pt>
-    <dgm:pt modelId="{C4D66CCD-6276-42E9-9E80-CA28E3612E0E}" type="parTrans" cxnId="{7C2D2EF3-3F17-439D-91AD-736B18FCC3C4}">
+    <dgm:pt modelId="{411EE6CD-516D-48FF-A989-D13294492D6E}" type="parTrans" cxnId="{D67D5BBE-642C-4070-80CE-C487109C0FC4}">
       <dgm:prSet/>
       <dgm:spPr/>
       <dgm:t>
@@ -12422,7 +12590,7 @@
         </a:p>
       </dgm:t>
     </dgm:pt>
-    <dgm:pt modelId="{E740232D-8E0F-40AB-8015-6F50898EF26E}" type="sibTrans" cxnId="{7C2D2EF3-3F17-439D-91AD-736B18FCC3C4}">
+    <dgm:pt modelId="{77E10AD2-9BEA-4BCD-9ACD-947CA54A4467}" type="sibTrans" cxnId="{D67D5BBE-642C-4070-80CE-C487109C0FC4}">
       <dgm:prSet/>
       <dgm:spPr/>
       <dgm:t>
@@ -12433,21 +12601,25 @@
         </a:p>
       </dgm:t>
     </dgm:pt>
-    <dgm:pt modelId="{BEE46EED-9A51-4205-8577-68C6BF240BE1}">
-      <dgm:prSet phldrT="[Text]"/>
+    <dgm:pt modelId="{C642B835-EB96-4AE8-8DF3-729799204460}">
+      <dgm:prSet phldrT="[Text]" custT="1"/>
       <dgm:spPr/>
       <dgm:t>
         <a:bodyPr/>
         <a:lstStyle/>
         <a:p>
           <a:r>
-            <a:rPr lang="vi-VN"/>
+            <a:rPr lang="vi-VN" sz="1100" b="0">
+              <a:latin typeface="Times New Roman"/>
+              <a:ea typeface="Times New Roman"/>
+              <a:cs typeface="Times New Roman"/>
+            </a:rPr>
             <a:t>Kết hợp mô hình, danh mục vững chắc, quy tắc chế độ</a:t>
           </a:r>
         </a:p>
       </dgm:t>
     </dgm:pt>
-    <dgm:pt modelId="{576686E1-7776-44A1-9178-4796D07502B7}" type="parTrans" cxnId="{143CC03B-DDF1-459F-910F-65247A1B0AB3}">
+    <dgm:pt modelId="{D003C8E5-435A-47A6-A1BE-061692FC0DF4}" type="parTrans" cxnId="{B893C3D5-183D-41C4-8965-53F9689116F0}">
       <dgm:prSet/>
       <dgm:spPr/>
       <dgm:t>
@@ -12458,7 +12630,7 @@
         </a:p>
       </dgm:t>
     </dgm:pt>
-    <dgm:pt modelId="{E3C4175C-7F7F-4725-AE8F-C1C2A2B2A3F6}" type="sibTrans" cxnId="{143CC03B-DDF1-459F-910F-65247A1B0AB3}">
+    <dgm:pt modelId="{6CB4DF8F-E8D5-412E-AFF9-1494CB190FD9}" type="sibTrans" cxnId="{B893C3D5-183D-41C4-8965-53F9689116F0}">
       <dgm:prSet/>
       <dgm:spPr/>
       <dgm:t>
@@ -12469,21 +12641,25 @@
         </a:p>
       </dgm:t>
     </dgm:pt>
-    <dgm:pt modelId="{800452A0-E83B-4DB1-AC53-C962E893190E}">
-      <dgm:prSet phldrT="[Text]"/>
+    <dgm:pt modelId="{79DEB359-67AB-4C8A-B280-EF9466548259}">
+      <dgm:prSet phldrT="[Text]" custT="1"/>
       <dgm:spPr/>
       <dgm:t>
         <a:bodyPr/>
         <a:lstStyle/>
         <a:p>
           <a:r>
-            <a:rPr lang="vi-VN"/>
+            <a:rPr lang="vi-VN" sz="1100" b="0">
+              <a:latin typeface="Times New Roman"/>
+              <a:ea typeface="Times New Roman"/>
+              <a:cs typeface="Times New Roman"/>
+            </a:rPr>
             <a:t>So sánh sau chi phí giao dịch: H3</a:t>
           </a:r>
         </a:p>
       </dgm:t>
     </dgm:pt>
-    <dgm:pt modelId="{0EECE19B-96AD-487A-A31F-1B91ACE8798C}" type="parTrans" cxnId="{7D09D6C8-C72A-4E13-99A6-BFC398BFFAB7}">
+    <dgm:pt modelId="{37AA37DF-9AC3-4170-A8AE-B3D85B4AE1E0}" type="parTrans" cxnId="{08B9A0B1-0490-497A-8AF8-A3A0545C5057}">
       <dgm:prSet/>
       <dgm:spPr/>
       <dgm:t>
@@ -12494,7 +12670,7 @@
         </a:p>
       </dgm:t>
     </dgm:pt>
-    <dgm:pt modelId="{B7C3D348-9BF0-4C39-845D-9FC89B085CEA}" type="sibTrans" cxnId="{7D09D6C8-C72A-4E13-99A6-BFC398BFFAB7}">
+    <dgm:pt modelId="{468498F0-7E34-4614-8BA8-D7985D2A2C72}" type="sibTrans" cxnId="{08B9A0B1-0490-497A-8AF8-A3A0545C5057}">
       <dgm:prSet/>
       <dgm:spPr/>
       <dgm:t>
@@ -12505,8 +12681,8 @@
         </a:p>
       </dgm:t>
     </dgm:pt>
-    <dgm:pt modelId="{96F4358F-C9DA-480B-AFE1-868246384B62}" type="pres">
-      <dgm:prSet presAssocID="{C26964BC-0A35-45B2-99C6-1A6B8D245F89}" presName="Name0" presStyleCnt="0">
+    <dgm:pt modelId="{8B426841-9ED7-4717-9771-23BCF21D1DEF}" type="pres">
+      <dgm:prSet presAssocID="{A14790B2-4EC4-4611-906F-828EC5C5DA3B}" presName="Name0" presStyleCnt="0">
         <dgm:presLayoutVars>
           <dgm:dir/>
           <dgm:animLvl val="lvl"/>
@@ -12515,12 +12691,12 @@
       </dgm:prSet>
       <dgm:spPr/>
     </dgm:pt>
-    <dgm:pt modelId="{B8EDADDB-9C9E-4BF9-AF56-87592ED551AD}" type="pres">
-      <dgm:prSet presAssocID="{A5C483E8-DB06-4703-BDAE-61A993FAEE32}" presName="linNode" presStyleCnt="0"/>
+    <dgm:pt modelId="{B89E419B-8B2E-42F2-A252-61FE795F4FB7}" type="pres">
+      <dgm:prSet presAssocID="{2A249F52-7791-48FC-A7F7-9477B1598F9C}" presName="linNode" presStyleCnt="0"/>
       <dgm:spPr/>
     </dgm:pt>
-    <dgm:pt modelId="{8B915227-2E48-4F5E-A841-EADD20050073}" type="pres">
-      <dgm:prSet presAssocID="{A5C483E8-DB06-4703-BDAE-61A993FAEE32}" presName="parentText" presStyleLbl="node1" presStyleIdx="0" presStyleCnt="5">
+    <dgm:pt modelId="{AC234256-8D89-4949-AECE-60EAD511FD5D}" type="pres">
+      <dgm:prSet presAssocID="{2A249F52-7791-48FC-A7F7-9477B1598F9C}" presName="parentText" presStyleLbl="node1" presStyleIdx="0" presStyleCnt="5">
         <dgm:presLayoutVars>
           <dgm:chMax val="1"/>
           <dgm:bulletEnabled val="1"/>
@@ -12528,24 +12704,24 @@
       </dgm:prSet>
       <dgm:spPr/>
     </dgm:pt>
-    <dgm:pt modelId="{D68CAC0D-23CA-495E-825F-7F33FEFD8552}" type="pres">
-      <dgm:prSet presAssocID="{A5C483E8-DB06-4703-BDAE-61A993FAEE32}" presName="descendantText" presStyleLbl="alignAccFollowNode1" presStyleIdx="0" presStyleCnt="5">
+    <dgm:pt modelId="{22D20DDA-D0C1-410E-B380-40F1F26EE6EC}" type="pres">
+      <dgm:prSet presAssocID="{2A249F52-7791-48FC-A7F7-9477B1598F9C}" presName="descendantText" presStyleLbl="alignAccFollowNode1" presStyleIdx="0" presStyleCnt="5">
         <dgm:presLayoutVars>
           <dgm:bulletEnabled val="1"/>
         </dgm:presLayoutVars>
       </dgm:prSet>
       <dgm:spPr/>
     </dgm:pt>
-    <dgm:pt modelId="{6DF618C4-C3AD-4CE5-9BAB-3E51F62038C5}" type="pres">
-      <dgm:prSet presAssocID="{61BBFB2B-9B88-4642-87BD-D3088AD94E21}" presName="sp" presStyleCnt="0"/>
+    <dgm:pt modelId="{A5440042-F755-46D3-9677-BE64CB88FB1D}" type="pres">
+      <dgm:prSet presAssocID="{EFADC0CC-08A8-4903-9BC9-01D307E7D189}" presName="sp" presStyleCnt="0"/>
       <dgm:spPr/>
     </dgm:pt>
-    <dgm:pt modelId="{2DF99B9C-BFBF-48B2-80BF-00B7318823B2}" type="pres">
-      <dgm:prSet presAssocID="{7E980AD9-B89E-4022-BCD6-D5C4EF4AB0B0}" presName="linNode" presStyleCnt="0"/>
+    <dgm:pt modelId="{C5CDC2CD-DFC7-4A6B-9A79-53F6EB1AA5D9}" type="pres">
+      <dgm:prSet presAssocID="{C9D1F496-E754-4268-8C64-30459A7D6709}" presName="linNode" presStyleCnt="0"/>
       <dgm:spPr/>
     </dgm:pt>
-    <dgm:pt modelId="{ADE12B2F-5D73-47A3-9ED7-271A4D2E951E}" type="pres">
-      <dgm:prSet presAssocID="{7E980AD9-B89E-4022-BCD6-D5C4EF4AB0B0}" presName="parentText" presStyleLbl="node1" presStyleIdx="1" presStyleCnt="5">
+    <dgm:pt modelId="{D2152C0F-2F05-4E88-B77A-273198D9B1DE}" type="pres">
+      <dgm:prSet presAssocID="{C9D1F496-E754-4268-8C64-30459A7D6709}" presName="parentText" presStyleLbl="node1" presStyleIdx="1" presStyleCnt="5">
         <dgm:presLayoutVars>
           <dgm:chMax val="1"/>
           <dgm:bulletEnabled val="1"/>
@@ -12553,24 +12729,24 @@
       </dgm:prSet>
       <dgm:spPr/>
     </dgm:pt>
-    <dgm:pt modelId="{E8737758-9D7A-4F67-B463-2234AD083BC2}" type="pres">
-      <dgm:prSet presAssocID="{7E980AD9-B89E-4022-BCD6-D5C4EF4AB0B0}" presName="descendantText" presStyleLbl="alignAccFollowNode1" presStyleIdx="1" presStyleCnt="5">
+    <dgm:pt modelId="{E0EE8E6D-DFC2-4ABA-ACB0-D48EDC31B270}" type="pres">
+      <dgm:prSet presAssocID="{C9D1F496-E754-4268-8C64-30459A7D6709}" presName="descendantText" presStyleLbl="alignAccFollowNode1" presStyleIdx="1" presStyleCnt="5">
         <dgm:presLayoutVars>
           <dgm:bulletEnabled val="1"/>
         </dgm:presLayoutVars>
       </dgm:prSet>
       <dgm:spPr/>
     </dgm:pt>
-    <dgm:pt modelId="{231FF83B-ED47-496B-87A5-DF1159D1A862}" type="pres">
-      <dgm:prSet presAssocID="{8F2174F3-8CDB-4071-A415-DB437E1DEA58}" presName="sp" presStyleCnt="0"/>
+    <dgm:pt modelId="{5FC2771B-3979-4E43-A330-9BA4121C8C22}" type="pres">
+      <dgm:prSet presAssocID="{2DFDC93E-FA22-4D0A-9678-373F5F2623AA}" presName="sp" presStyleCnt="0"/>
       <dgm:spPr/>
     </dgm:pt>
-    <dgm:pt modelId="{C765DBC3-7AB3-4BFC-95FE-CBAD9ED207CE}" type="pres">
-      <dgm:prSet presAssocID="{C76DCE53-9801-4365-A10C-0EF1AD97E236}" presName="linNode" presStyleCnt="0"/>
+    <dgm:pt modelId="{AC6944A1-6F21-4A2A-A6BC-C57ADB94A660}" type="pres">
+      <dgm:prSet presAssocID="{A21BE0E5-9F89-42D9-89E8-508E411A75B4}" presName="linNode" presStyleCnt="0"/>
       <dgm:spPr/>
     </dgm:pt>
-    <dgm:pt modelId="{E867D77D-BF27-443E-B819-6D791C5D74E0}" type="pres">
-      <dgm:prSet presAssocID="{C76DCE53-9801-4365-A10C-0EF1AD97E236}" presName="parentText" presStyleLbl="node1" presStyleIdx="2" presStyleCnt="5">
+    <dgm:pt modelId="{37EB76B8-1EC8-450A-9760-29081E7D8068}" type="pres">
+      <dgm:prSet presAssocID="{A21BE0E5-9F89-42D9-89E8-508E411A75B4}" presName="parentText" presStyleLbl="node1" presStyleIdx="2" presStyleCnt="5">
         <dgm:presLayoutVars>
           <dgm:chMax val="1"/>
           <dgm:bulletEnabled val="1"/>
@@ -12578,24 +12754,24 @@
       </dgm:prSet>
       <dgm:spPr/>
     </dgm:pt>
-    <dgm:pt modelId="{FB0AE907-C688-4C27-8A7D-628BBED45D7B}" type="pres">
-      <dgm:prSet presAssocID="{C76DCE53-9801-4365-A10C-0EF1AD97E236}" presName="descendantText" presStyleLbl="alignAccFollowNode1" presStyleIdx="2" presStyleCnt="5">
+    <dgm:pt modelId="{4B74ABAA-97FF-438C-92FD-D94C8FB196AB}" type="pres">
+      <dgm:prSet presAssocID="{A21BE0E5-9F89-42D9-89E8-508E411A75B4}" presName="descendantText" presStyleLbl="alignAccFollowNode1" presStyleIdx="2" presStyleCnt="5">
         <dgm:presLayoutVars>
           <dgm:bulletEnabled val="1"/>
         </dgm:presLayoutVars>
       </dgm:prSet>
       <dgm:spPr/>
     </dgm:pt>
-    <dgm:pt modelId="{F5AF84F2-D47D-41D0-8BF3-3475C58318A3}" type="pres">
-      <dgm:prSet presAssocID="{F557704B-211C-458F-A8FA-AFB1DF16A9AF}" presName="sp" presStyleCnt="0"/>
+    <dgm:pt modelId="{957E4C35-5AAB-4E9B-BBD5-F81C07AC7895}" type="pres">
+      <dgm:prSet presAssocID="{A9BDC510-E5A8-47EE-9DBB-984F4307D33B}" presName="sp" presStyleCnt="0"/>
       <dgm:spPr/>
     </dgm:pt>
-    <dgm:pt modelId="{3BD02453-78CE-4210-9E54-CA88019A3866}" type="pres">
-      <dgm:prSet presAssocID="{B112B494-1E89-4E52-9685-941094BA439A}" presName="linNode" presStyleCnt="0"/>
+    <dgm:pt modelId="{F45DC3C4-A5D5-489B-994B-E6390D3DE178}" type="pres">
+      <dgm:prSet presAssocID="{8C4BF9D1-AFF8-4068-A2FE-E565A9FC4492}" presName="linNode" presStyleCnt="0"/>
       <dgm:spPr/>
     </dgm:pt>
-    <dgm:pt modelId="{24DCE27F-FA3A-4209-9080-332569220892}" type="pres">
-      <dgm:prSet presAssocID="{B112B494-1E89-4E52-9685-941094BA439A}" presName="parentText" presStyleLbl="node1" presStyleIdx="3" presStyleCnt="5">
+    <dgm:pt modelId="{30157204-0BF3-4419-B5BF-5B81C36F99F9}" type="pres">
+      <dgm:prSet presAssocID="{8C4BF9D1-AFF8-4068-A2FE-E565A9FC4492}" presName="parentText" presStyleLbl="node1" presStyleIdx="3" presStyleCnt="5">
         <dgm:presLayoutVars>
           <dgm:chMax val="1"/>
           <dgm:bulletEnabled val="1"/>
@@ -12603,24 +12779,24 @@
       </dgm:prSet>
       <dgm:spPr/>
     </dgm:pt>
-    <dgm:pt modelId="{29D95BCC-196F-491F-8E51-F679952684E8}" type="pres">
-      <dgm:prSet presAssocID="{B112B494-1E89-4E52-9685-941094BA439A}" presName="descendantText" presStyleLbl="alignAccFollowNode1" presStyleIdx="3" presStyleCnt="5">
+    <dgm:pt modelId="{D3E48A5A-F36E-43C5-BD53-37D7D169B9B4}" type="pres">
+      <dgm:prSet presAssocID="{8C4BF9D1-AFF8-4068-A2FE-E565A9FC4492}" presName="descendantText" presStyleLbl="alignAccFollowNode1" presStyleIdx="3" presStyleCnt="5">
         <dgm:presLayoutVars>
           <dgm:bulletEnabled val="1"/>
         </dgm:presLayoutVars>
       </dgm:prSet>
       <dgm:spPr/>
     </dgm:pt>
-    <dgm:pt modelId="{9DEA7A0E-E6DE-4C08-BEDF-524D4BC74D75}" type="pres">
-      <dgm:prSet presAssocID="{B2C81CCD-27BE-423A-BCA4-8CFC9EDE8140}" presName="sp" presStyleCnt="0"/>
+    <dgm:pt modelId="{DA67041B-8812-4253-9F25-474E21D4BDAD}" type="pres">
+      <dgm:prSet presAssocID="{D7BB0C32-CBD8-4899-BEBF-4D13EB12563E}" presName="sp" presStyleCnt="0"/>
       <dgm:spPr/>
     </dgm:pt>
-    <dgm:pt modelId="{242BC8AF-611E-4E42-88F2-DC31E6A2AC03}" type="pres">
-      <dgm:prSet presAssocID="{06C4CF1C-0D8E-41CD-A1F3-620925080707}" presName="linNode" presStyleCnt="0"/>
+    <dgm:pt modelId="{CB624201-E96A-4D74-A296-B8C37A359554}" type="pres">
+      <dgm:prSet presAssocID="{70D0D24A-C1D3-4A80-A54F-25A2F51DED4F}" presName="linNode" presStyleCnt="0"/>
       <dgm:spPr/>
     </dgm:pt>
-    <dgm:pt modelId="{F1505148-9648-4C92-B6DA-3793427BBECF}" type="pres">
-      <dgm:prSet presAssocID="{06C4CF1C-0D8E-41CD-A1F3-620925080707}" presName="parentText" presStyleLbl="node1" presStyleIdx="4" presStyleCnt="5">
+    <dgm:pt modelId="{D5FD0FDD-D624-4659-8257-3C4FA3FA6F4B}" type="pres">
+      <dgm:prSet presAssocID="{70D0D24A-C1D3-4A80-A54F-25A2F51DED4F}" presName="parentText" presStyleLbl="node1" presStyleIdx="4" presStyleCnt="5">
         <dgm:presLayoutVars>
           <dgm:chMax val="1"/>
           <dgm:bulletEnabled val="1"/>
@@ -12628,8 +12804,8 @@
       </dgm:prSet>
       <dgm:spPr/>
     </dgm:pt>
-    <dgm:pt modelId="{F905424A-40A6-46D7-AD0C-7F0C8FF14190}" type="pres">
-      <dgm:prSet presAssocID="{06C4CF1C-0D8E-41CD-A1F3-620925080707}" presName="descendantText" presStyleLbl="alignAccFollowNode1" presStyleIdx="4" presStyleCnt="5">
+    <dgm:pt modelId="{3188898B-0B6F-45DA-9B1C-C255B71B9029}" type="pres">
+      <dgm:prSet presAssocID="{70D0D24A-C1D3-4A80-A54F-25A2F51DED4F}" presName="descendantText" presStyleLbl="alignAccFollowNode1" presStyleIdx="4" presStyleCnt="5">
         <dgm:presLayoutVars>
           <dgm:bulletEnabled val="1"/>
         </dgm:presLayoutVars>
@@ -12638,56 +12814,56 @@
     </dgm:pt>
   </dgm:ptLst>
   <dgm:cxnLst>
-    <dgm:cxn modelId="{4C104022-B5CD-4A64-9A4B-5C0071F2A984}" srcId="{C26964BC-0A35-45B2-99C6-1A6B8D245F89}" destId="{A5C483E8-DB06-4703-BDAE-61A993FAEE32}" srcOrd="0" destOrd="0" parTransId="{BDC55087-D74E-4C3F-8512-7A5A2736FFE3}" sibTransId="{61BBFB2B-9B88-4642-87BD-D3088AD94E21}"/>
-    <dgm:cxn modelId="{A4D49CB0-CB3B-4C06-95C6-0038144C897B}" srcId="{A5C483E8-DB06-4703-BDAE-61A993FAEE32}" destId="{1FA4B074-674D-45FC-A05F-963B51E32DEE}" srcOrd="0" destOrd="0" parTransId="{A446BADE-2ABD-451C-9FBC-06D529485B54}" sibTransId="{53B3EAA8-20D7-4564-8DB2-5982F8B49116}"/>
-    <dgm:cxn modelId="{CC4498C6-90D9-4F44-AE29-C33E6938474F}" srcId="{A5C483E8-DB06-4703-BDAE-61A993FAEE32}" destId="{595F6B9F-3702-4EEF-9D6D-6F2948272FEE}" srcOrd="1" destOrd="0" parTransId="{CF542903-3BA9-4320-AAEB-A55A8524123B}" sibTransId="{FD2C1209-D444-4351-999F-20F135378670}"/>
-    <dgm:cxn modelId="{D7CD54A9-DA38-4F50-AA9B-50B61D2CD46F}" srcId="{C26964BC-0A35-45B2-99C6-1A6B8D245F89}" destId="{7E980AD9-B89E-4022-BCD6-D5C4EF4AB0B0}" srcOrd="1" destOrd="0" parTransId="{33692F20-3F61-4167-BF38-9F9181C1E18A}" sibTransId="{8F2174F3-8CDB-4071-A415-DB437E1DEA58}"/>
-    <dgm:cxn modelId="{4B7DE63D-5733-4C47-BBCE-C064FB99B8CE}" srcId="{7E980AD9-B89E-4022-BCD6-D5C4EF4AB0B0}" destId="{5CA2F275-63D8-4B36-A6AF-864CCD2D85A0}" srcOrd="0" destOrd="0" parTransId="{6AC703C4-005A-4800-B428-FAAB8DFFC3E8}" sibTransId="{34B97BCB-61AC-4609-9599-F049E9D7F892}"/>
-    <dgm:cxn modelId="{67215D6F-A184-4291-9719-3B61C537CC5D}" srcId="{7E980AD9-B89E-4022-BCD6-D5C4EF4AB0B0}" destId="{E139E7D9-36C5-433A-911D-48199D0E2EE7}" srcOrd="1" destOrd="0" parTransId="{EE90EAE8-6438-461E-A87E-201866ED41D6}" sibTransId="{0352E5DE-0574-4753-99B4-564AF8774685}"/>
-    <dgm:cxn modelId="{E00FA8CE-0080-40A1-AB02-83ADC03851D4}" srcId="{C26964BC-0A35-45B2-99C6-1A6B8D245F89}" destId="{C76DCE53-9801-4365-A10C-0EF1AD97E236}" srcOrd="2" destOrd="0" parTransId="{0A9CBFD5-45E3-4EB6-B3A3-F1CD6DEFF9F1}" sibTransId="{F557704B-211C-458F-A8FA-AFB1DF16A9AF}"/>
-    <dgm:cxn modelId="{A2132C39-6AFC-4538-AC90-5AD4390D580E}" srcId="{C76DCE53-9801-4365-A10C-0EF1AD97E236}" destId="{BAC4BE08-CCF1-43DB-8E66-48C44699A626}" srcOrd="0" destOrd="0" parTransId="{4DED331E-4470-4840-B390-A501BED9A376}" sibTransId="{132B8FD0-D194-4ADA-A15C-778381AFA98B}"/>
-    <dgm:cxn modelId="{FAEBB0D6-606D-4103-86AE-7B4BF96373D3}" srcId="{C76DCE53-9801-4365-A10C-0EF1AD97E236}" destId="{D1F66228-5EDD-4086-ADEC-725717960FFE}" srcOrd="1" destOrd="0" parTransId="{E04ACA23-86FF-471C-9A2F-F9B3E71805DD}" sibTransId="{62B596D4-EFB0-43E1-802B-5CB2C00B81AF}"/>
-    <dgm:cxn modelId="{284F1821-FE09-4FE2-A80D-085045E38C6F}" srcId="{C26964BC-0A35-45B2-99C6-1A6B8D245F89}" destId="{B112B494-1E89-4E52-9685-941094BA439A}" srcOrd="3" destOrd="0" parTransId="{3995F361-6B20-46E0-A8B2-C5DABADDC68F}" sibTransId="{B2C81CCD-27BE-423A-BCA4-8CFC9EDE8140}"/>
-    <dgm:cxn modelId="{29EB7A2B-E1ED-4384-8B86-8632E7AB0E07}" srcId="{B112B494-1E89-4E52-9685-941094BA439A}" destId="{CB161991-CD13-49FF-A56D-E9414A3E69C4}" srcOrd="0" destOrd="0" parTransId="{E8B0C497-2DB6-4073-AB7A-7B766E98AC26}" sibTransId="{52BA2188-AD88-4521-81AD-3F586F584C7B}"/>
-    <dgm:cxn modelId="{361D0C2D-91F9-49F2-A536-A13C94631580}" srcId="{B112B494-1E89-4E52-9685-941094BA439A}" destId="{15DEABF6-EB0F-4853-BBBE-FD9549953FC0}" srcOrd="1" destOrd="0" parTransId="{7A8D03FC-05E4-4ABB-9AA1-10DC9BA5B443}" sibTransId="{5930FA40-A9FC-4588-8ABF-4457585EE795}"/>
-    <dgm:cxn modelId="{7C2D2EF3-3F17-439D-91AD-736B18FCC3C4}" srcId="{C26964BC-0A35-45B2-99C6-1A6B8D245F89}" destId="{06C4CF1C-0D8E-41CD-A1F3-620925080707}" srcOrd="4" destOrd="0" parTransId="{C4D66CCD-6276-42E9-9E80-CA28E3612E0E}" sibTransId="{E740232D-8E0F-40AB-8015-6F50898EF26E}"/>
-    <dgm:cxn modelId="{143CC03B-DDF1-459F-910F-65247A1B0AB3}" srcId="{06C4CF1C-0D8E-41CD-A1F3-620925080707}" destId="{BEE46EED-9A51-4205-8577-68C6BF240BE1}" srcOrd="0" destOrd="0" parTransId="{576686E1-7776-44A1-9178-4796D07502B7}" sibTransId="{E3C4175C-7F7F-4725-AE8F-C1C2A2B2A3F6}"/>
-    <dgm:cxn modelId="{7D09D6C8-C72A-4E13-99A6-BFC398BFFAB7}" srcId="{06C4CF1C-0D8E-41CD-A1F3-620925080707}" destId="{800452A0-E83B-4DB1-AC53-C962E893190E}" srcOrd="1" destOrd="0" parTransId="{0EECE19B-96AD-487A-A31F-1B91ACE8798C}" sibTransId="{B7C3D348-9BF0-4C39-845D-9FC89B085CEA}"/>
-    <dgm:cxn modelId="{9846F809-FC49-4B17-B9A5-BE00A0E4A942}" type="presOf" srcId="{C26964BC-0A35-45B2-99C6-1A6B8D245F89}" destId="{96F4358F-C9DA-480B-AFE1-868246384B62}" srcOrd="0" destOrd="0" presId="urn:microsoft.com/office/officeart/2005/8/layout/vList5"/>
-    <dgm:cxn modelId="{6D5CA4F1-803C-41C3-964E-D23B2623184A}" type="presParOf" srcId="{96F4358F-C9DA-480B-AFE1-868246384B62}" destId="{B8EDADDB-9C9E-4BF9-AF56-87592ED551AD}" srcOrd="0" destOrd="0" presId="urn:microsoft.com/office/officeart/2005/8/layout/vList5"/>
-    <dgm:cxn modelId="{67E275A0-03D6-430F-9E9A-7C2CBA59A338}" type="presParOf" srcId="{B8EDADDB-9C9E-4BF9-AF56-87592ED551AD}" destId="{8B915227-2E48-4F5E-A841-EADD20050073}" srcOrd="0" destOrd="0" presId="urn:microsoft.com/office/officeart/2005/8/layout/vList5"/>
-    <dgm:cxn modelId="{12C7A25A-FBB4-4781-8DAE-17879176D6B1}" type="presOf" srcId="{A5C483E8-DB06-4703-BDAE-61A993FAEE32}" destId="{8B915227-2E48-4F5E-A841-EADD20050073}" srcOrd="0" destOrd="0" presId="urn:microsoft.com/office/officeart/2005/8/layout/vList5"/>
-    <dgm:cxn modelId="{77F8A2E5-0F26-48BA-A47B-28B85E18B697}" type="presParOf" srcId="{B8EDADDB-9C9E-4BF9-AF56-87592ED551AD}" destId="{D68CAC0D-23CA-495E-825F-7F33FEFD8552}" srcOrd="1" destOrd="0" presId="urn:microsoft.com/office/officeart/2005/8/layout/vList5"/>
-    <dgm:cxn modelId="{3F2EC59F-2055-4B07-AB0B-194964C96566}" type="presOf" srcId="{1FA4B074-674D-45FC-A05F-963B51E32DEE}" destId="{D68CAC0D-23CA-495E-825F-7F33FEFD8552}" srcOrd="0" destOrd="0" presId="urn:microsoft.com/office/officeart/2005/8/layout/vList5"/>
-    <dgm:cxn modelId="{B31B0309-5F6D-4C75-8459-E53236BFF9F4}" type="presOf" srcId="{595F6B9F-3702-4EEF-9D6D-6F2948272FEE}" destId="{D68CAC0D-23CA-495E-825F-7F33FEFD8552}" srcOrd="0" destOrd="1" presId="urn:microsoft.com/office/officeart/2005/8/layout/vList5"/>
-    <dgm:cxn modelId="{55D804D4-8C8B-4D6C-BECB-A98BBA6446D6}" type="presParOf" srcId="{96F4358F-C9DA-480B-AFE1-868246384B62}" destId="{6DF618C4-C3AD-4CE5-9BAB-3E51F62038C5}" srcOrd="1" destOrd="0" presId="urn:microsoft.com/office/officeart/2005/8/layout/vList5"/>
-    <dgm:cxn modelId="{47188513-DE55-4288-8B13-5009644B0543}" type="presParOf" srcId="{96F4358F-C9DA-480B-AFE1-868246384B62}" destId="{2DF99B9C-BFBF-48B2-80BF-00B7318823B2}" srcOrd="2" destOrd="0" presId="urn:microsoft.com/office/officeart/2005/8/layout/vList5"/>
-    <dgm:cxn modelId="{D7E661E2-2D23-41D6-AE01-B8A5ED838E06}" type="presParOf" srcId="{2DF99B9C-BFBF-48B2-80BF-00B7318823B2}" destId="{ADE12B2F-5D73-47A3-9ED7-271A4D2E951E}" srcOrd="0" destOrd="0" presId="urn:microsoft.com/office/officeart/2005/8/layout/vList5"/>
-    <dgm:cxn modelId="{ECD49FE1-1BA7-46FA-869E-EFD9533966B0}" type="presOf" srcId="{7E980AD9-B89E-4022-BCD6-D5C4EF4AB0B0}" destId="{ADE12B2F-5D73-47A3-9ED7-271A4D2E951E}" srcOrd="0" destOrd="0" presId="urn:microsoft.com/office/officeart/2005/8/layout/vList5"/>
-    <dgm:cxn modelId="{2EFC1678-FEB0-416D-9093-67B58D44E77D}" type="presParOf" srcId="{2DF99B9C-BFBF-48B2-80BF-00B7318823B2}" destId="{E8737758-9D7A-4F67-B463-2234AD083BC2}" srcOrd="1" destOrd="0" presId="urn:microsoft.com/office/officeart/2005/8/layout/vList5"/>
-    <dgm:cxn modelId="{CC7B682B-F7A7-468B-9993-208F5CA7E6E2}" type="presOf" srcId="{5CA2F275-63D8-4B36-A6AF-864CCD2D85A0}" destId="{E8737758-9D7A-4F67-B463-2234AD083BC2}" srcOrd="0" destOrd="0" presId="urn:microsoft.com/office/officeart/2005/8/layout/vList5"/>
-    <dgm:cxn modelId="{01947221-4CA4-4236-A427-814D2AE86788}" type="presOf" srcId="{E139E7D9-36C5-433A-911D-48199D0E2EE7}" destId="{E8737758-9D7A-4F67-B463-2234AD083BC2}" srcOrd="0" destOrd="1" presId="urn:microsoft.com/office/officeart/2005/8/layout/vList5"/>
-    <dgm:cxn modelId="{E92745A4-A4CB-4561-A68D-3A2B380C8D18}" type="presParOf" srcId="{96F4358F-C9DA-480B-AFE1-868246384B62}" destId="{231FF83B-ED47-496B-87A5-DF1159D1A862}" srcOrd="3" destOrd="0" presId="urn:microsoft.com/office/officeart/2005/8/layout/vList5"/>
-    <dgm:cxn modelId="{C133E91B-176D-439B-AE68-6CE1EA612CA4}" type="presParOf" srcId="{96F4358F-C9DA-480B-AFE1-868246384B62}" destId="{C765DBC3-7AB3-4BFC-95FE-CBAD9ED207CE}" srcOrd="4" destOrd="0" presId="urn:microsoft.com/office/officeart/2005/8/layout/vList5"/>
-    <dgm:cxn modelId="{17EC72C8-F83E-4B37-88BB-B99E21E46E44}" type="presParOf" srcId="{C765DBC3-7AB3-4BFC-95FE-CBAD9ED207CE}" destId="{E867D77D-BF27-443E-B819-6D791C5D74E0}" srcOrd="0" destOrd="0" presId="urn:microsoft.com/office/officeart/2005/8/layout/vList5"/>
-    <dgm:cxn modelId="{B4A6B3FF-B49E-4014-94EB-FC03B463C4C0}" type="presOf" srcId="{C76DCE53-9801-4365-A10C-0EF1AD97E236}" destId="{E867D77D-BF27-443E-B819-6D791C5D74E0}" srcOrd="0" destOrd="0" presId="urn:microsoft.com/office/officeart/2005/8/layout/vList5"/>
-    <dgm:cxn modelId="{7A6C8DE7-D004-46FA-BEB2-BECE2A0996E1}" type="presParOf" srcId="{C765DBC3-7AB3-4BFC-95FE-CBAD9ED207CE}" destId="{FB0AE907-C688-4C27-8A7D-628BBED45D7B}" srcOrd="1" destOrd="0" presId="urn:microsoft.com/office/officeart/2005/8/layout/vList5"/>
-    <dgm:cxn modelId="{B0553E57-10B4-41D3-B12E-B316FDDDC6FD}" type="presOf" srcId="{BAC4BE08-CCF1-43DB-8E66-48C44699A626}" destId="{FB0AE907-C688-4C27-8A7D-628BBED45D7B}" srcOrd="0" destOrd="0" presId="urn:microsoft.com/office/officeart/2005/8/layout/vList5"/>
-    <dgm:cxn modelId="{17AD6F4E-AF8E-44C9-B42C-5F453685466B}" type="presOf" srcId="{D1F66228-5EDD-4086-ADEC-725717960FFE}" destId="{FB0AE907-C688-4C27-8A7D-628BBED45D7B}" srcOrd="0" destOrd="1" presId="urn:microsoft.com/office/officeart/2005/8/layout/vList5"/>
-    <dgm:cxn modelId="{109B71F8-0DB9-4220-8F7B-C15E7EA0FE74}" type="presParOf" srcId="{96F4358F-C9DA-480B-AFE1-868246384B62}" destId="{F5AF84F2-D47D-41D0-8BF3-3475C58318A3}" srcOrd="5" destOrd="0" presId="urn:microsoft.com/office/officeart/2005/8/layout/vList5"/>
-    <dgm:cxn modelId="{C6682495-13AD-48A3-9B6A-C11E38D1808A}" type="presParOf" srcId="{96F4358F-C9DA-480B-AFE1-868246384B62}" destId="{3BD02453-78CE-4210-9E54-CA88019A3866}" srcOrd="6" destOrd="0" presId="urn:microsoft.com/office/officeart/2005/8/layout/vList5"/>
-    <dgm:cxn modelId="{32E2DF2D-6C3E-4224-8916-EA8F8EC70585}" type="presParOf" srcId="{3BD02453-78CE-4210-9E54-CA88019A3866}" destId="{24DCE27F-FA3A-4209-9080-332569220892}" srcOrd="0" destOrd="0" presId="urn:microsoft.com/office/officeart/2005/8/layout/vList5"/>
-    <dgm:cxn modelId="{EBEEE90B-1192-439D-841F-D29EA8BA6776}" type="presOf" srcId="{B112B494-1E89-4E52-9685-941094BA439A}" destId="{24DCE27F-FA3A-4209-9080-332569220892}" srcOrd="0" destOrd="0" presId="urn:microsoft.com/office/officeart/2005/8/layout/vList5"/>
-    <dgm:cxn modelId="{7FC47102-9A32-4172-B59B-60983C9D30E4}" type="presParOf" srcId="{3BD02453-78CE-4210-9E54-CA88019A3866}" destId="{29D95BCC-196F-491F-8E51-F679952684E8}" srcOrd="1" destOrd="0" presId="urn:microsoft.com/office/officeart/2005/8/layout/vList5"/>
-    <dgm:cxn modelId="{B0C223EA-C1E8-4896-BB5A-F3F8D94E5FA0}" type="presOf" srcId="{CB161991-CD13-49FF-A56D-E9414A3E69C4}" destId="{29D95BCC-196F-491F-8E51-F679952684E8}" srcOrd="0" destOrd="0" presId="urn:microsoft.com/office/officeart/2005/8/layout/vList5"/>
-    <dgm:cxn modelId="{C8BF9439-2486-456D-8D17-6AD0E8CD86FB}" type="presOf" srcId="{15DEABF6-EB0F-4853-BBBE-FD9549953FC0}" destId="{29D95BCC-196F-491F-8E51-F679952684E8}" srcOrd="0" destOrd="1" presId="urn:microsoft.com/office/officeart/2005/8/layout/vList5"/>
-    <dgm:cxn modelId="{DA077838-F0EA-4102-842D-7A54C7244D29}" type="presParOf" srcId="{96F4358F-C9DA-480B-AFE1-868246384B62}" destId="{9DEA7A0E-E6DE-4C08-BEDF-524D4BC74D75}" srcOrd="7" destOrd="0" presId="urn:microsoft.com/office/officeart/2005/8/layout/vList5"/>
-    <dgm:cxn modelId="{3EEFB5AA-B963-4A68-9CE2-E23EECA08891}" type="presParOf" srcId="{96F4358F-C9DA-480B-AFE1-868246384B62}" destId="{242BC8AF-611E-4E42-88F2-DC31E6A2AC03}" srcOrd="8" destOrd="0" presId="urn:microsoft.com/office/officeart/2005/8/layout/vList5"/>
-    <dgm:cxn modelId="{3B3719A6-8558-4EB6-BB23-3BF4CCEAB80C}" type="presParOf" srcId="{242BC8AF-611E-4E42-88F2-DC31E6A2AC03}" destId="{F1505148-9648-4C92-B6DA-3793427BBECF}" srcOrd="0" destOrd="0" presId="urn:microsoft.com/office/officeart/2005/8/layout/vList5"/>
-    <dgm:cxn modelId="{52D11F46-006C-405E-B1C4-169AAF3DAAE5}" type="presOf" srcId="{06C4CF1C-0D8E-41CD-A1F3-620925080707}" destId="{F1505148-9648-4C92-B6DA-3793427BBECF}" srcOrd="0" destOrd="0" presId="urn:microsoft.com/office/officeart/2005/8/layout/vList5"/>
-    <dgm:cxn modelId="{50FB61E1-DD52-466F-9F56-FF92D05673E5}" type="presParOf" srcId="{242BC8AF-611E-4E42-88F2-DC31E6A2AC03}" destId="{F905424A-40A6-46D7-AD0C-7F0C8FF14190}" srcOrd="1" destOrd="0" presId="urn:microsoft.com/office/officeart/2005/8/layout/vList5"/>
-    <dgm:cxn modelId="{2FED0114-5999-4081-B929-0424C2988C98}" type="presOf" srcId="{BEE46EED-9A51-4205-8577-68C6BF240BE1}" destId="{F905424A-40A6-46D7-AD0C-7F0C8FF14190}" srcOrd="0" destOrd="0" presId="urn:microsoft.com/office/officeart/2005/8/layout/vList5"/>
-    <dgm:cxn modelId="{E27F5AE5-5FCE-44A0-BC57-88AE26D05A6B}" type="presOf" srcId="{800452A0-E83B-4DB1-AC53-C962E893190E}" destId="{F905424A-40A6-46D7-AD0C-7F0C8FF14190}" srcOrd="0" destOrd="1" presId="urn:microsoft.com/office/officeart/2005/8/layout/vList5"/>
+    <dgm:cxn modelId="{77BD46A4-9E0F-459B-B633-E359C905BECE}" srcId="{A14790B2-4EC4-4611-906F-828EC5C5DA3B}" destId="{2A249F52-7791-48FC-A7F7-9477B1598F9C}" srcOrd="0" destOrd="0" parTransId="{24D21E4F-CE2D-4EC9-B225-5A8592F2009E}" sibTransId="{EFADC0CC-08A8-4903-9BC9-01D307E7D189}"/>
+    <dgm:cxn modelId="{12553DB7-CEFB-4043-9B10-60B1CA974367}" srcId="{2A249F52-7791-48FC-A7F7-9477B1598F9C}" destId="{67DD0961-D45E-421B-AC27-AE9ED79D959C}" srcOrd="0" destOrd="0" parTransId="{D7BB1197-45E6-4EE6-B3AA-1D6EAF0BC349}" sibTransId="{D1880A73-CEBA-44D7-BBD5-2F15CBBA2D59}"/>
+    <dgm:cxn modelId="{1793D2E6-52CC-42C7-8DC9-0F5DA3324B51}" srcId="{2A249F52-7791-48FC-A7F7-9477B1598F9C}" destId="{F63166CF-860A-47F8-AA2C-8FF6B43A2725}" srcOrd="1" destOrd="0" parTransId="{F9EC04F9-9475-45A3-AEE3-DC88EEF42786}" sibTransId="{942C9118-18D4-4B3C-8095-5D90ABFD69E5}"/>
+    <dgm:cxn modelId="{F61E9AE4-36B6-46E8-97C5-CC5767CE8156}" srcId="{A14790B2-4EC4-4611-906F-828EC5C5DA3B}" destId="{C9D1F496-E754-4268-8C64-30459A7D6709}" srcOrd="1" destOrd="0" parTransId="{6FFE751D-FAB9-4F72-8996-B69AF28C170A}" sibTransId="{2DFDC93E-FA22-4D0A-9678-373F5F2623AA}"/>
+    <dgm:cxn modelId="{EEAABDA0-4E2B-4DDD-83C0-C9F583FAC17F}" srcId="{C9D1F496-E754-4268-8C64-30459A7D6709}" destId="{4C9A6D7F-D448-48C4-8FE7-67E65549357A}" srcOrd="0" destOrd="0" parTransId="{3D64E841-0A73-4C38-9A43-D43B03B2BEB1}" sibTransId="{7241D431-F080-41C3-9828-E5669CC17B9F}"/>
+    <dgm:cxn modelId="{A079E798-D226-4051-A460-C2A5D299DDAB}" srcId="{C9D1F496-E754-4268-8C64-30459A7D6709}" destId="{910DAFFA-802D-4189-8EFE-9F1C4D28C641}" srcOrd="1" destOrd="0" parTransId="{CA4100DA-1127-45D5-9966-DAD64502428D}" sibTransId="{CE7AC8C4-3130-4B80-81E6-6DEC77CB8A87}"/>
+    <dgm:cxn modelId="{C8B7F2E7-2D8C-436F-A920-71D120802BEB}" srcId="{A14790B2-4EC4-4611-906F-828EC5C5DA3B}" destId="{A21BE0E5-9F89-42D9-89E8-508E411A75B4}" srcOrd="2" destOrd="0" parTransId="{95484804-886B-41B1-93E5-BDD2CD6CEF8F}" sibTransId="{A9BDC510-E5A8-47EE-9DBB-984F4307D33B}"/>
+    <dgm:cxn modelId="{D42BD8C6-E3ED-4E7B-8686-8E0F04C8E779}" srcId="{A21BE0E5-9F89-42D9-89E8-508E411A75B4}" destId="{3A95B2CD-D13C-40FB-AD26-5672970C63CA}" srcOrd="0" destOrd="0" parTransId="{76D2A46B-4378-4C10-A7B6-C3FEFD7DA675}" sibTransId="{A82ADFAD-2C9C-4EE1-BCAA-AE4A64EB655F}"/>
+    <dgm:cxn modelId="{8A7CD3E8-B37D-45C5-9FA8-47419B7E7BE8}" srcId="{A21BE0E5-9F89-42D9-89E8-508E411A75B4}" destId="{BBEF86E7-5B97-4B28-AA7F-E7C4E933CCCA}" srcOrd="1" destOrd="0" parTransId="{0FE6DDD2-A2CA-4F63-B254-58292DD055C7}" sibTransId="{918740FC-79A2-4108-94DF-A5039D22E381}"/>
+    <dgm:cxn modelId="{2AE94751-95DB-43C6-89D4-3366721D3258}" srcId="{A14790B2-4EC4-4611-906F-828EC5C5DA3B}" destId="{8C4BF9D1-AFF8-4068-A2FE-E565A9FC4492}" srcOrd="3" destOrd="0" parTransId="{E8314AD0-3BEC-4A96-B4A9-7277BBFC9561}" sibTransId="{D7BB0C32-CBD8-4899-BEBF-4D13EB12563E}"/>
+    <dgm:cxn modelId="{44B9B88C-53A3-4DFD-B580-F099C34162F2}" srcId="{8C4BF9D1-AFF8-4068-A2FE-E565A9FC4492}" destId="{06763911-0732-4232-877B-F155A7A7870D}" srcOrd="0" destOrd="0" parTransId="{86D0F2A7-1430-416B-9C05-97A18421C5E1}" sibTransId="{56E0C3BE-E6C7-4156-A2A2-7AAC1EB77C45}"/>
+    <dgm:cxn modelId="{837969EB-13FE-425A-8EAF-A519952F1BBE}" srcId="{8C4BF9D1-AFF8-4068-A2FE-E565A9FC4492}" destId="{A6B92AB3-832A-492A-87B9-094FC23EE5C9}" srcOrd="1" destOrd="0" parTransId="{DB67AF25-5729-41D5-BDBC-88859EBD659B}" sibTransId="{E169BA2A-5E04-41C0-A15C-376D37D47E49}"/>
+    <dgm:cxn modelId="{D67D5BBE-642C-4070-80CE-C487109C0FC4}" srcId="{A14790B2-4EC4-4611-906F-828EC5C5DA3B}" destId="{70D0D24A-C1D3-4A80-A54F-25A2F51DED4F}" srcOrd="4" destOrd="0" parTransId="{411EE6CD-516D-48FF-A989-D13294492D6E}" sibTransId="{77E10AD2-9BEA-4BCD-9ACD-947CA54A4467}"/>
+    <dgm:cxn modelId="{B893C3D5-183D-41C4-8965-53F9689116F0}" srcId="{70D0D24A-C1D3-4A80-A54F-25A2F51DED4F}" destId="{C642B835-EB96-4AE8-8DF3-729799204460}" srcOrd="0" destOrd="0" parTransId="{D003C8E5-435A-47A6-A1BE-061692FC0DF4}" sibTransId="{6CB4DF8F-E8D5-412E-AFF9-1494CB190FD9}"/>
+    <dgm:cxn modelId="{08B9A0B1-0490-497A-8AF8-A3A0545C5057}" srcId="{70D0D24A-C1D3-4A80-A54F-25A2F51DED4F}" destId="{79DEB359-67AB-4C8A-B280-EF9466548259}" srcOrd="1" destOrd="0" parTransId="{37AA37DF-9AC3-4170-A8AE-B3D85B4AE1E0}" sibTransId="{468498F0-7E34-4614-8BA8-D7985D2A2C72}"/>
+    <dgm:cxn modelId="{934CA4AF-3788-441D-976C-DB2675B8577E}" type="presOf" srcId="{A14790B2-4EC4-4611-906F-828EC5C5DA3B}" destId="{8B426841-9ED7-4717-9771-23BCF21D1DEF}" srcOrd="0" destOrd="0" presId="urn:microsoft.com/office/officeart/2005/8/layout/vList5"/>
+    <dgm:cxn modelId="{42BFC064-13FC-4821-972F-00375C570C79}" type="presParOf" srcId="{8B426841-9ED7-4717-9771-23BCF21D1DEF}" destId="{B89E419B-8B2E-42F2-A252-61FE795F4FB7}" srcOrd="0" destOrd="0" presId="urn:microsoft.com/office/officeart/2005/8/layout/vList5"/>
+    <dgm:cxn modelId="{D5CB5C4D-A0DF-47AC-B9F2-EDF0B55BF2CD}" type="presParOf" srcId="{B89E419B-8B2E-42F2-A252-61FE795F4FB7}" destId="{AC234256-8D89-4949-AECE-60EAD511FD5D}" srcOrd="0" destOrd="0" presId="urn:microsoft.com/office/officeart/2005/8/layout/vList5"/>
+    <dgm:cxn modelId="{20B90B99-2195-4D85-B888-10EAE300F5A1}" type="presOf" srcId="{2A249F52-7791-48FC-A7F7-9477B1598F9C}" destId="{AC234256-8D89-4949-AECE-60EAD511FD5D}" srcOrd="0" destOrd="0" presId="urn:microsoft.com/office/officeart/2005/8/layout/vList5"/>
+    <dgm:cxn modelId="{157D82EC-35D7-4E5F-9015-29B535DBF93E}" type="presParOf" srcId="{B89E419B-8B2E-42F2-A252-61FE795F4FB7}" destId="{22D20DDA-D0C1-410E-B380-40F1F26EE6EC}" srcOrd="1" destOrd="0" presId="urn:microsoft.com/office/officeart/2005/8/layout/vList5"/>
+    <dgm:cxn modelId="{7C4A7A08-4B98-4BC9-BFDB-C0D03E4F2810}" type="presOf" srcId="{67DD0961-D45E-421B-AC27-AE9ED79D959C}" destId="{22D20DDA-D0C1-410E-B380-40F1F26EE6EC}" srcOrd="0" destOrd="0" presId="urn:microsoft.com/office/officeart/2005/8/layout/vList5"/>
+    <dgm:cxn modelId="{ED5EB3BF-5561-4C5C-B68E-218AEF0D7B3B}" type="presOf" srcId="{F63166CF-860A-47F8-AA2C-8FF6B43A2725}" destId="{22D20DDA-D0C1-410E-B380-40F1F26EE6EC}" srcOrd="0" destOrd="1" presId="urn:microsoft.com/office/officeart/2005/8/layout/vList5"/>
+    <dgm:cxn modelId="{6BB4FE1F-57AC-4872-83E0-FFA815530F78}" type="presParOf" srcId="{8B426841-9ED7-4717-9771-23BCF21D1DEF}" destId="{A5440042-F755-46D3-9677-BE64CB88FB1D}" srcOrd="1" destOrd="0" presId="urn:microsoft.com/office/officeart/2005/8/layout/vList5"/>
+    <dgm:cxn modelId="{24E065DC-9A65-4EBF-A823-F76FAAACD5DE}" type="presParOf" srcId="{8B426841-9ED7-4717-9771-23BCF21D1DEF}" destId="{C5CDC2CD-DFC7-4A6B-9A79-53F6EB1AA5D9}" srcOrd="2" destOrd="0" presId="urn:microsoft.com/office/officeart/2005/8/layout/vList5"/>
+    <dgm:cxn modelId="{0F6D554A-BFFE-4AC6-8ABA-2C2DE4439751}" type="presParOf" srcId="{C5CDC2CD-DFC7-4A6B-9A79-53F6EB1AA5D9}" destId="{D2152C0F-2F05-4E88-B77A-273198D9B1DE}" srcOrd="0" destOrd="0" presId="urn:microsoft.com/office/officeart/2005/8/layout/vList5"/>
+    <dgm:cxn modelId="{D8E2FE63-E6A6-4F7B-BE03-0C0E2B8C0126}" type="presOf" srcId="{C9D1F496-E754-4268-8C64-30459A7D6709}" destId="{D2152C0F-2F05-4E88-B77A-273198D9B1DE}" srcOrd="0" destOrd="0" presId="urn:microsoft.com/office/officeart/2005/8/layout/vList5"/>
+    <dgm:cxn modelId="{594A5F87-D90B-4A88-B84D-41D37A40D64E}" type="presParOf" srcId="{C5CDC2CD-DFC7-4A6B-9A79-53F6EB1AA5D9}" destId="{E0EE8E6D-DFC2-4ABA-ACB0-D48EDC31B270}" srcOrd="1" destOrd="0" presId="urn:microsoft.com/office/officeart/2005/8/layout/vList5"/>
+    <dgm:cxn modelId="{5A2D33B1-EAC4-4297-9D0F-1F709194184D}" type="presOf" srcId="{4C9A6D7F-D448-48C4-8FE7-67E65549357A}" destId="{E0EE8E6D-DFC2-4ABA-ACB0-D48EDC31B270}" srcOrd="0" destOrd="0" presId="urn:microsoft.com/office/officeart/2005/8/layout/vList5"/>
+    <dgm:cxn modelId="{0F3FA6C3-38E2-4B64-97FD-53179261958C}" type="presOf" srcId="{910DAFFA-802D-4189-8EFE-9F1C4D28C641}" destId="{E0EE8E6D-DFC2-4ABA-ACB0-D48EDC31B270}" srcOrd="0" destOrd="1" presId="urn:microsoft.com/office/officeart/2005/8/layout/vList5"/>
+    <dgm:cxn modelId="{8C6696D6-0327-4321-B2C0-723EDAE1F031}" type="presParOf" srcId="{8B426841-9ED7-4717-9771-23BCF21D1DEF}" destId="{5FC2771B-3979-4E43-A330-9BA4121C8C22}" srcOrd="3" destOrd="0" presId="urn:microsoft.com/office/officeart/2005/8/layout/vList5"/>
+    <dgm:cxn modelId="{93BE6596-A7F3-4456-B8F6-5D72AF060FE9}" type="presParOf" srcId="{8B426841-9ED7-4717-9771-23BCF21D1DEF}" destId="{AC6944A1-6F21-4A2A-A6BC-C57ADB94A660}" srcOrd="4" destOrd="0" presId="urn:microsoft.com/office/officeart/2005/8/layout/vList5"/>
+    <dgm:cxn modelId="{74D42A7C-6ED5-4D3A-AC17-E8A389D488D6}" type="presParOf" srcId="{AC6944A1-6F21-4A2A-A6BC-C57ADB94A660}" destId="{37EB76B8-1EC8-450A-9760-29081E7D8068}" srcOrd="0" destOrd="0" presId="urn:microsoft.com/office/officeart/2005/8/layout/vList5"/>
+    <dgm:cxn modelId="{F02034F3-487B-4C62-8D58-5ED4320ECDFD}" type="presOf" srcId="{A21BE0E5-9F89-42D9-89E8-508E411A75B4}" destId="{37EB76B8-1EC8-450A-9760-29081E7D8068}" srcOrd="0" destOrd="0" presId="urn:microsoft.com/office/officeart/2005/8/layout/vList5"/>
+    <dgm:cxn modelId="{BC807D4E-2F44-4A6D-9C4E-E6E90BDFF8FE}" type="presParOf" srcId="{AC6944A1-6F21-4A2A-A6BC-C57ADB94A660}" destId="{4B74ABAA-97FF-438C-92FD-D94C8FB196AB}" srcOrd="1" destOrd="0" presId="urn:microsoft.com/office/officeart/2005/8/layout/vList5"/>
+    <dgm:cxn modelId="{6482DA17-1AFB-4CB4-85EF-A8E42FECE681}" type="presOf" srcId="{3A95B2CD-D13C-40FB-AD26-5672970C63CA}" destId="{4B74ABAA-97FF-438C-92FD-D94C8FB196AB}" srcOrd="0" destOrd="0" presId="urn:microsoft.com/office/officeart/2005/8/layout/vList5"/>
+    <dgm:cxn modelId="{C9D36FCA-AA84-4DA5-AF34-EBA08721F910}" type="presOf" srcId="{BBEF86E7-5B97-4B28-AA7F-E7C4E933CCCA}" destId="{4B74ABAA-97FF-438C-92FD-D94C8FB196AB}" srcOrd="0" destOrd="1" presId="urn:microsoft.com/office/officeart/2005/8/layout/vList5"/>
+    <dgm:cxn modelId="{3A5C0F08-CD1B-41BC-8666-1E39C015B9D8}" type="presParOf" srcId="{8B426841-9ED7-4717-9771-23BCF21D1DEF}" destId="{957E4C35-5AAB-4E9B-BBD5-F81C07AC7895}" srcOrd="5" destOrd="0" presId="urn:microsoft.com/office/officeart/2005/8/layout/vList5"/>
+    <dgm:cxn modelId="{58812B7E-331C-4F94-A138-6D4897800458}" type="presParOf" srcId="{8B426841-9ED7-4717-9771-23BCF21D1DEF}" destId="{F45DC3C4-A5D5-489B-994B-E6390D3DE178}" srcOrd="6" destOrd="0" presId="urn:microsoft.com/office/officeart/2005/8/layout/vList5"/>
+    <dgm:cxn modelId="{3D2A303F-11B8-475D-BA3C-B2BD82FD33D5}" type="presParOf" srcId="{F45DC3C4-A5D5-489B-994B-E6390D3DE178}" destId="{30157204-0BF3-4419-B5BF-5B81C36F99F9}" srcOrd="0" destOrd="0" presId="urn:microsoft.com/office/officeart/2005/8/layout/vList5"/>
+    <dgm:cxn modelId="{01E82A18-4706-4384-8F15-502BCF1212CC}" type="presOf" srcId="{8C4BF9D1-AFF8-4068-A2FE-E565A9FC4492}" destId="{30157204-0BF3-4419-B5BF-5B81C36F99F9}" srcOrd="0" destOrd="0" presId="urn:microsoft.com/office/officeart/2005/8/layout/vList5"/>
+    <dgm:cxn modelId="{CDB65E9B-7A5F-4BD8-9D9B-ABB0DAC83176}" type="presParOf" srcId="{F45DC3C4-A5D5-489B-994B-E6390D3DE178}" destId="{D3E48A5A-F36E-43C5-BD53-37D7D169B9B4}" srcOrd="1" destOrd="0" presId="urn:microsoft.com/office/officeart/2005/8/layout/vList5"/>
+    <dgm:cxn modelId="{6A811410-80E2-4FC6-A833-694526D9BE66}" type="presOf" srcId="{06763911-0732-4232-877B-F155A7A7870D}" destId="{D3E48A5A-F36E-43C5-BD53-37D7D169B9B4}" srcOrd="0" destOrd="0" presId="urn:microsoft.com/office/officeart/2005/8/layout/vList5"/>
+    <dgm:cxn modelId="{0BCE71BD-9069-4976-9A6A-1B6181B7D26C}" type="presOf" srcId="{A6B92AB3-832A-492A-87B9-094FC23EE5C9}" destId="{D3E48A5A-F36E-43C5-BD53-37D7D169B9B4}" srcOrd="0" destOrd="1" presId="urn:microsoft.com/office/officeart/2005/8/layout/vList5"/>
+    <dgm:cxn modelId="{5B6AD4F6-EEA5-4639-873F-C63718C75029}" type="presParOf" srcId="{8B426841-9ED7-4717-9771-23BCF21D1DEF}" destId="{DA67041B-8812-4253-9F25-474E21D4BDAD}" srcOrd="7" destOrd="0" presId="urn:microsoft.com/office/officeart/2005/8/layout/vList5"/>
+    <dgm:cxn modelId="{BCF650F5-9D1E-43F9-85DF-C1102129BC3F}" type="presParOf" srcId="{8B426841-9ED7-4717-9771-23BCF21D1DEF}" destId="{CB624201-E96A-4D74-A296-B8C37A359554}" srcOrd="8" destOrd="0" presId="urn:microsoft.com/office/officeart/2005/8/layout/vList5"/>
+    <dgm:cxn modelId="{62CF0B0A-CBE5-4239-B144-D52C7DBD11D7}" type="presParOf" srcId="{CB624201-E96A-4D74-A296-B8C37A359554}" destId="{D5FD0FDD-D624-4659-8257-3C4FA3FA6F4B}" srcOrd="0" destOrd="0" presId="urn:microsoft.com/office/officeart/2005/8/layout/vList5"/>
+    <dgm:cxn modelId="{5F00FEA8-2CA2-4877-8E53-5D6838855017}" type="presOf" srcId="{70D0D24A-C1D3-4A80-A54F-25A2F51DED4F}" destId="{D5FD0FDD-D624-4659-8257-3C4FA3FA6F4B}" srcOrd="0" destOrd="0" presId="urn:microsoft.com/office/officeart/2005/8/layout/vList5"/>
+    <dgm:cxn modelId="{702552C7-D211-4D8E-88FF-0E875C7DA262}" type="presParOf" srcId="{CB624201-E96A-4D74-A296-B8C37A359554}" destId="{3188898B-0B6F-45DA-9B1C-C255B71B9029}" srcOrd="1" destOrd="0" presId="urn:microsoft.com/office/officeart/2005/8/layout/vList5"/>
+    <dgm:cxn modelId="{6FA55624-8BED-44F4-8CF2-803244D1A31A}" type="presOf" srcId="{C642B835-EB96-4AE8-8DF3-729799204460}" destId="{3188898B-0B6F-45DA-9B1C-C255B71B9029}" srcOrd="0" destOrd="0" presId="urn:microsoft.com/office/officeart/2005/8/layout/vList5"/>
+    <dgm:cxn modelId="{817FC628-120E-4FFC-8772-26BE0FA29513}" type="presOf" srcId="{79DEB359-67AB-4C8A-B280-EF9466548259}" destId="{3188898B-0B6F-45DA-9B1C-C255B71B9029}" srcOrd="0" destOrd="1" presId="urn:microsoft.com/office/officeart/2005/8/layout/vList5"/>
   </dgm:cxnLst>
   <dgm:bg/>
   <dgm:whole/>

</xml_diff>

<commit_message>
Đề cương: bìa theo bài mẫu, để trống cơ quan công tác
Co-Authored-By: Claude Opus 5.5 <noreply@anthropic.com>
Claude-Session: https://claude.ai/code/session_01Jj9HfJt3spogVjREoAJ7gj
</commit_message>
<xml_diff>
--- a/de_cuong_tien_si/De_cuong_NCS_NguyenVanTrung.docx
+++ b/de_cuong_tien_si/De_cuong_NCS_NguyenVanTrung.docx
@@ -34,7 +34,7 @@
     </w:p>
     <w:p>
       <w:pPr>
-        <w:spacing w:before="0" w:after="600" w:line="240" w:lineRule="auto"/>
+        <w:spacing w:before="0" w:after="1000" w:line="240" w:lineRule="auto"/>
         <w:ind w:firstLine="0"/>
         <w:jc w:val="center"/>
       </w:pPr>
@@ -91,7 +91,7 @@
     </w:p>
     <w:p>
       <w:pPr>
-        <w:spacing w:before="0" w:after="480" w:line="300" w:lineRule="auto"/>
+        <w:spacing w:before="0" w:after="1000" w:line="312" w:lineRule="auto"/>
         <w:ind w:firstLine="0"/>
         <w:jc w:val="center"/>
       </w:pPr>
@@ -107,7 +107,7 @@
     </w:p>
     <w:p>
       <w:pPr>
-        <w:spacing w:before="0" w:after="360" w:line="240" w:lineRule="auto"/>
+        <w:spacing w:before="0" w:after="240" w:line="240" w:lineRule="auto"/>
         <w:ind w:firstLine="0"/>
         <w:jc w:val="center"/>
       </w:pPr>
@@ -137,7 +137,7 @@
     </w:p>
     <w:p>
       <w:pPr>
-        <w:spacing w:before="0" w:after="360" w:line="240" w:lineRule="auto"/>
+        <w:spacing w:before="0" w:after="1500" w:line="240" w:lineRule="auto"/>
         <w:ind w:firstLine="0"/>
         <w:jc w:val="center"/>
       </w:pPr>
@@ -151,9 +151,9 @@
     </w:p>
     <w:p>
       <w:pPr>
-        <w:spacing w:before="0" w:after="120" w:line="240" w:lineRule="auto"/>
+        <w:spacing w:before="0" w:after="80" w:line="240" w:lineRule="auto"/>
         <w:ind w:firstLine="0"/>
-        <w:jc w:val="center"/>
+        <w:jc w:val="left"/>
       </w:pPr>
       <w:r>
         <w:rPr>
@@ -174,23 +174,23 @@
     </w:p>
     <w:p>
       <w:pPr>
-        <w:spacing w:before="0" w:after="360" w:line="240" w:lineRule="auto"/>
+        <w:spacing w:before="0" w:after="80" w:line="240" w:lineRule="auto"/>
         <w:ind w:firstLine="0"/>
-        <w:jc w:val="center"/>
+        <w:jc w:val="left"/>
       </w:pPr>
       <w:r>
         <w:rPr>
           <w:sz w:val="26"/>
           <w:szCs w:val="26"/>
         </w:rPr>
-        <w:t xml:space="preserve">Cơ quan công tác: Chưa có (tốt nghiệp cử nhân năm 2026)</w:t>
-      </w:r>
-    </w:p>
-    <w:p>
-      <w:pPr>
-        <w:spacing w:before="0" w:after="60" w:line="240" w:lineRule="auto"/>
+        <w:t xml:space="preserve">Cơ quan công tác: </w:t>
+      </w:r>
+    </w:p>
+    <w:p>
+      <w:pPr>
+        <w:spacing w:before="0" w:after="40" w:line="240" w:lineRule="auto"/>
         <w:ind w:firstLine="0"/>
-        <w:jc w:val="center"/>
+        <w:jc w:val="left"/>
       </w:pPr>
       <w:r>
         <w:rPr>
@@ -202,9 +202,9 @@
     </w:p>
     <w:p>
       <w:pPr>
-        <w:spacing w:before="0" w:after="0" w:line="240" w:lineRule="auto"/>
+        <w:spacing w:before="0" w:after="40" w:line="240" w:lineRule="auto"/>
         <w:ind w:firstLine="0"/>
-        <w:jc w:val="center"/>
+        <w:jc w:val="left"/>
       </w:pPr>
       <w:r>
         <w:rPr>
@@ -213,14 +213,14 @@
           <w:sz w:val="26"/>
           <w:szCs w:val="26"/>
         </w:rPr>
-        <w:t xml:space="preserve">- GS.TS. Nguyễn Đức Khương</w:t>
-      </w:r>
-    </w:p>
-    <w:p>
-      <w:pPr>
-        <w:spacing w:before="0" w:after="1500" w:line="240" w:lineRule="auto"/>
+        <w:t xml:space="preserve">    - GS.TS. Nguyễn Đức Khương</w:t>
+      </w:r>
+    </w:p>
+    <w:p>
+      <w:pPr>
+        <w:spacing w:before="0" w:after="2200" w:line="240" w:lineRule="auto"/>
         <w:ind w:firstLine="0"/>
-        <w:jc w:val="center"/>
+        <w:jc w:val="left"/>
       </w:pPr>
       <w:r>
         <w:rPr>
@@ -229,7 +229,7 @@
           <w:sz w:val="26"/>
           <w:szCs w:val="26"/>
         </w:rPr>
-        <w:t xml:space="preserve">- PGS.TS. Trần Thị Thanh Tú</w:t>
+        <w:t xml:space="preserve">    - PGS.TS. Trần Thị Thanh Tú</w:t>
       </w:r>
     </w:p>
     <w:p>
@@ -313,12 +313,6 @@
           <w:b/>
         </w:rPr>
         <w:t xml:space="preserve">Đơn vị công tác:</w:t>
-      </w:r>
-      <w:r>
-        <w:t xml:space="preserve"> </w:t>
-      </w:r>
-      <w:r>
-        <w:t xml:space="preserve">Chưa có (tốt nghiệp cử nhân năm 2026)</w:t>
       </w:r>
     </w:p>
     <w:p>
@@ -12070,7 +12064,7 @@
 <file path=word/diagrams/data1.xml><?xml version="1.0" encoding="utf-8"?>
 <dgm:dataModel xmlns:dgm="http://schemas.openxmlformats.org/drawingml/2006/diagram" xmlns:a="http://schemas.openxmlformats.org/drawingml/2006/main">
   <dgm:ptLst>
-    <dgm:pt modelId="{A14790B2-4EC4-4611-906F-828EC5C5DA3B}" type="doc">
+    <dgm:pt modelId="{F0E5EC29-B935-43FC-A8DC-52B0A9EC61B2}" type="doc">
       <dgm:prSet loTypeId="urn:microsoft.com/office/officeart/2005/8/layout/vList5" loCatId="list" qsTypeId="urn:microsoft.com/office/officeart/2005/8/quickstyle/simple1" qsCatId="simple" csTypeId="urn:microsoft.com/office/officeart/2005/8/colors/accent0_1" csCatId="mainScheme" phldr="0"/>
       <dgm:spPr/>
       <dgm:t>
@@ -12081,7 +12075,7 @@
         </a:p>
       </dgm:t>
     </dgm:pt>
-    <dgm:pt modelId="{2A249F52-7791-48FC-A7F7-9477B1598F9C}">
+    <dgm:pt modelId="{905B648B-5517-41B9-918D-DF4373E4CB86}">
       <dgm:prSet phldrT="[Text]" custT="1"/>
       <dgm:spPr/>
       <dgm:t>
@@ -12099,7 +12093,7 @@
         </a:p>
       </dgm:t>
     </dgm:pt>
-    <dgm:pt modelId="{24D21E4F-CE2D-4EC9-B225-5A8592F2009E}" type="parTrans" cxnId="{77BD46A4-9E0F-459B-B633-E359C905BECE}">
+    <dgm:pt modelId="{444403B0-AA7C-4AB4-88D1-0DB3B1A9372E}" type="parTrans" cxnId="{66E3993D-0009-4E3D-9595-ACC02B76B35B}">
       <dgm:prSet/>
       <dgm:spPr/>
       <dgm:t>
@@ -12110,7 +12104,7 @@
         </a:p>
       </dgm:t>
     </dgm:pt>
-    <dgm:pt modelId="{EFADC0CC-08A8-4903-9BC9-01D307E7D189}" type="sibTrans" cxnId="{77BD46A4-9E0F-459B-B633-E359C905BECE}">
+    <dgm:pt modelId="{89B76813-B16A-45F7-8397-F70D13B34855}" type="sibTrans" cxnId="{66E3993D-0009-4E3D-9595-ACC02B76B35B}">
       <dgm:prSet/>
       <dgm:spPr/>
       <dgm:t>
@@ -12121,7 +12115,7 @@
         </a:p>
       </dgm:t>
     </dgm:pt>
-    <dgm:pt modelId="{67DD0961-D45E-421B-AC27-AE9ED79D959C}">
+    <dgm:pt modelId="{1892D0D8-3048-4663-B368-EA8F196753F5}">
       <dgm:prSet phldrT="[Text]" custT="1"/>
       <dgm:spPr/>
       <dgm:t>
@@ -12139,7 +12133,7 @@
         </a:p>
       </dgm:t>
     </dgm:pt>
-    <dgm:pt modelId="{D7BB1197-45E6-4EE6-B3AA-1D6EAF0BC349}" type="parTrans" cxnId="{12553DB7-CEFB-4043-9B10-60B1CA974367}">
+    <dgm:pt modelId="{C24A4B55-BF30-4222-9D81-E23CA1D8D159}" type="parTrans" cxnId="{1C5182EC-908F-4CA6-977D-3D7E78A40DB0}">
       <dgm:prSet/>
       <dgm:spPr/>
       <dgm:t>
@@ -12150,7 +12144,7 @@
         </a:p>
       </dgm:t>
     </dgm:pt>
-    <dgm:pt modelId="{D1880A73-CEBA-44D7-BBD5-2F15CBBA2D59}" type="sibTrans" cxnId="{12553DB7-CEFB-4043-9B10-60B1CA974367}">
+    <dgm:pt modelId="{F06BA536-4B4B-41E7-824D-1AAB306DB33D}" type="sibTrans" cxnId="{1C5182EC-908F-4CA6-977D-3D7E78A40DB0}">
       <dgm:prSet/>
       <dgm:spPr/>
       <dgm:t>
@@ -12161,7 +12155,7 @@
         </a:p>
       </dgm:t>
     </dgm:pt>
-    <dgm:pt modelId="{F63166CF-860A-47F8-AA2C-8FF6B43A2725}">
+    <dgm:pt modelId="{81B25BD4-7170-46DC-9005-D31BF0FA76D6}">
       <dgm:prSet phldrT="[Text]" custT="1"/>
       <dgm:spPr/>
       <dgm:t>
@@ -12179,7 +12173,7 @@
         </a:p>
       </dgm:t>
     </dgm:pt>
-    <dgm:pt modelId="{F9EC04F9-9475-45A3-AEE3-DC88EEF42786}" type="parTrans" cxnId="{1793D2E6-52CC-42C7-8DC9-0F5DA3324B51}">
+    <dgm:pt modelId="{19902BE4-BB93-4A3F-8D8F-2475B70B6EAF}" type="parTrans" cxnId="{A152E675-CAE8-43C2-8B26-2590A12E4D9D}">
       <dgm:prSet/>
       <dgm:spPr/>
       <dgm:t>
@@ -12190,7 +12184,7 @@
         </a:p>
       </dgm:t>
     </dgm:pt>
-    <dgm:pt modelId="{942C9118-18D4-4B3C-8095-5D90ABFD69E5}" type="sibTrans" cxnId="{1793D2E6-52CC-42C7-8DC9-0F5DA3324B51}">
+    <dgm:pt modelId="{78273206-6345-4914-BEBF-6064DB044DF5}" type="sibTrans" cxnId="{A152E675-CAE8-43C2-8B26-2590A12E4D9D}">
       <dgm:prSet/>
       <dgm:spPr/>
       <dgm:t>
@@ -12201,7 +12195,7 @@
         </a:p>
       </dgm:t>
     </dgm:pt>
-    <dgm:pt modelId="{C9D1F496-E754-4268-8C64-30459A7D6709}">
+    <dgm:pt modelId="{A3DD26F5-7A4C-4FE7-BB87-09033191052E}">
       <dgm:prSet phldrT="[Text]" custT="1"/>
       <dgm:spPr/>
       <dgm:t>
@@ -12219,7 +12213,7 @@
         </a:p>
       </dgm:t>
     </dgm:pt>
-    <dgm:pt modelId="{6FFE751D-FAB9-4F72-8996-B69AF28C170A}" type="parTrans" cxnId="{F61E9AE4-36B6-46E8-97C5-CC5767CE8156}">
+    <dgm:pt modelId="{36FD9F39-FBD6-4A3E-A105-5B4568F07749}" type="parTrans" cxnId="{1D843DEE-0356-4FC9-A748-6AD54116F4FF}">
       <dgm:prSet/>
       <dgm:spPr/>
       <dgm:t>
@@ -12230,7 +12224,7 @@
         </a:p>
       </dgm:t>
     </dgm:pt>
-    <dgm:pt modelId="{2DFDC93E-FA22-4D0A-9678-373F5F2623AA}" type="sibTrans" cxnId="{F61E9AE4-36B6-46E8-97C5-CC5767CE8156}">
+    <dgm:pt modelId="{953F582A-91AF-42B8-B2DA-4608C2DD8D71}" type="sibTrans" cxnId="{1D843DEE-0356-4FC9-A748-6AD54116F4FF}">
       <dgm:prSet/>
       <dgm:spPr/>
       <dgm:t>
@@ -12241,7 +12235,7 @@
         </a:p>
       </dgm:t>
     </dgm:pt>
-    <dgm:pt modelId="{4C9A6D7F-D448-48C4-8FE7-67E65549357A}">
+    <dgm:pt modelId="{A38E62D7-2FC3-43DA-B63E-DF0A64077B83}">
       <dgm:prSet phldrT="[Text]" custT="1"/>
       <dgm:spPr/>
       <dgm:t>
@@ -12259,7 +12253,7 @@
         </a:p>
       </dgm:t>
     </dgm:pt>
-    <dgm:pt modelId="{3D64E841-0A73-4C38-9A43-D43B03B2BEB1}" type="parTrans" cxnId="{EEAABDA0-4E2B-4DDD-83C0-C9F583FAC17F}">
+    <dgm:pt modelId="{3AB51838-B1E4-4E44-8DBB-E5C95EE6EA0F}" type="parTrans" cxnId="{0C7D8336-0CD2-46D8-A152-745B5AED1FBA}">
       <dgm:prSet/>
       <dgm:spPr/>
       <dgm:t>
@@ -12270,7 +12264,7 @@
         </a:p>
       </dgm:t>
     </dgm:pt>
-    <dgm:pt modelId="{7241D431-F080-41C3-9828-E5669CC17B9F}" type="sibTrans" cxnId="{EEAABDA0-4E2B-4DDD-83C0-C9F583FAC17F}">
+    <dgm:pt modelId="{508487B2-3364-4458-9436-05049DF80378}" type="sibTrans" cxnId="{0C7D8336-0CD2-46D8-A152-745B5AED1FBA}">
       <dgm:prSet/>
       <dgm:spPr/>
       <dgm:t>
@@ -12281,7 +12275,7 @@
         </a:p>
       </dgm:t>
     </dgm:pt>
-    <dgm:pt modelId="{910DAFFA-802D-4189-8EFE-9F1C4D28C641}">
+    <dgm:pt modelId="{911D3D38-4878-4487-9C38-283A49674C08}">
       <dgm:prSet phldrT="[Text]" custT="1"/>
       <dgm:spPr/>
       <dgm:t>
@@ -12299,7 +12293,7 @@
         </a:p>
       </dgm:t>
     </dgm:pt>
-    <dgm:pt modelId="{CA4100DA-1127-45D5-9966-DAD64502428D}" type="parTrans" cxnId="{A079E798-D226-4051-A460-C2A5D299DDAB}">
+    <dgm:pt modelId="{A40D3603-7856-467A-B50A-7C88CDD908FE}" type="parTrans" cxnId="{D227E64B-98B2-4587-BE11-AB4D1B728D93}">
       <dgm:prSet/>
       <dgm:spPr/>
       <dgm:t>
@@ -12310,7 +12304,7 @@
         </a:p>
       </dgm:t>
     </dgm:pt>
-    <dgm:pt modelId="{CE7AC8C4-3130-4B80-81E6-6DEC77CB8A87}" type="sibTrans" cxnId="{A079E798-D226-4051-A460-C2A5D299DDAB}">
+    <dgm:pt modelId="{AC0EC7E2-0D05-4827-961D-4CBE00EB9039}" type="sibTrans" cxnId="{D227E64B-98B2-4587-BE11-AB4D1B728D93}">
       <dgm:prSet/>
       <dgm:spPr/>
       <dgm:t>
@@ -12321,7 +12315,7 @@
         </a:p>
       </dgm:t>
     </dgm:pt>
-    <dgm:pt modelId="{A21BE0E5-9F89-42D9-89E8-508E411A75B4}">
+    <dgm:pt modelId="{C2ADA40F-7FD2-4BE7-A6A4-5DF94DFB3EDF}">
       <dgm:prSet phldrT="[Text]" custT="1"/>
       <dgm:spPr/>
       <dgm:t>
@@ -12339,7 +12333,7 @@
         </a:p>
       </dgm:t>
     </dgm:pt>
-    <dgm:pt modelId="{95484804-886B-41B1-93E5-BDD2CD6CEF8F}" type="parTrans" cxnId="{C8B7F2E7-2D8C-436F-A920-71D120802BEB}">
+    <dgm:pt modelId="{0AB4B741-466E-4CEA-ACB3-1CBFFDA5110F}" type="parTrans" cxnId="{9AAB6D26-0F27-495C-B818-D3B5B7E77134}">
       <dgm:prSet/>
       <dgm:spPr/>
       <dgm:t>
@@ -12350,7 +12344,7 @@
         </a:p>
       </dgm:t>
     </dgm:pt>
-    <dgm:pt modelId="{A9BDC510-E5A8-47EE-9DBB-984F4307D33B}" type="sibTrans" cxnId="{C8B7F2E7-2D8C-436F-A920-71D120802BEB}">
+    <dgm:pt modelId="{B482F30E-FA0F-4A9A-967B-57C61F0A2EE7}" type="sibTrans" cxnId="{9AAB6D26-0F27-495C-B818-D3B5B7E77134}">
       <dgm:prSet/>
       <dgm:spPr/>
       <dgm:t>
@@ -12361,7 +12355,7 @@
         </a:p>
       </dgm:t>
     </dgm:pt>
-    <dgm:pt modelId="{3A95B2CD-D13C-40FB-AD26-5672970C63CA}">
+    <dgm:pt modelId="{968DE21C-1ADB-4549-85D1-3D19F5CB7995}">
       <dgm:prSet phldrT="[Text]" custT="1"/>
       <dgm:spPr/>
       <dgm:t>
@@ -12379,7 +12373,7 @@
         </a:p>
       </dgm:t>
     </dgm:pt>
-    <dgm:pt modelId="{76D2A46B-4378-4C10-A7B6-C3FEFD7DA675}" type="parTrans" cxnId="{D42BD8C6-E3ED-4E7B-8686-8E0F04C8E779}">
+    <dgm:pt modelId="{1FF8A868-C726-4FBE-82C9-EA260D6174C9}" type="parTrans" cxnId="{713F9590-91E3-4227-AFED-E57399C303F8}">
       <dgm:prSet/>
       <dgm:spPr/>
       <dgm:t>
@@ -12390,7 +12384,7 @@
         </a:p>
       </dgm:t>
     </dgm:pt>
-    <dgm:pt modelId="{A82ADFAD-2C9C-4EE1-BCAA-AE4A64EB655F}" type="sibTrans" cxnId="{D42BD8C6-E3ED-4E7B-8686-8E0F04C8E779}">
+    <dgm:pt modelId="{52A976F2-260E-4A52-9C50-F9580FCFDD9C}" type="sibTrans" cxnId="{713F9590-91E3-4227-AFED-E57399C303F8}">
       <dgm:prSet/>
       <dgm:spPr/>
       <dgm:t>
@@ -12401,7 +12395,7 @@
         </a:p>
       </dgm:t>
     </dgm:pt>
-    <dgm:pt modelId="{BBEF86E7-5B97-4B28-AA7F-E7C4E933CCCA}">
+    <dgm:pt modelId="{2A6803AC-3514-4198-B128-69CD82766CFC}">
       <dgm:prSet phldrT="[Text]" custT="1"/>
       <dgm:spPr/>
       <dgm:t>
@@ -12419,7 +12413,7 @@
         </a:p>
       </dgm:t>
     </dgm:pt>
-    <dgm:pt modelId="{0FE6DDD2-A2CA-4F63-B254-58292DD055C7}" type="parTrans" cxnId="{8A7CD3E8-B37D-45C5-9FA8-47419B7E7BE8}">
+    <dgm:pt modelId="{3F417067-009E-4F04-ABAF-FA3F9876EA2F}" type="parTrans" cxnId="{87BCB105-B1A6-4F15-87FA-DED88D09F7BC}">
       <dgm:prSet/>
       <dgm:spPr/>
       <dgm:t>
@@ -12430,7 +12424,7 @@
         </a:p>
       </dgm:t>
     </dgm:pt>
-    <dgm:pt modelId="{918740FC-79A2-4108-94DF-A5039D22E381}" type="sibTrans" cxnId="{8A7CD3E8-B37D-45C5-9FA8-47419B7E7BE8}">
+    <dgm:pt modelId="{4A2CEB39-F361-4D26-A078-B617826E4886}" type="sibTrans" cxnId="{87BCB105-B1A6-4F15-87FA-DED88D09F7BC}">
       <dgm:prSet/>
       <dgm:spPr/>
       <dgm:t>
@@ -12441,7 +12435,7 @@
         </a:p>
       </dgm:t>
     </dgm:pt>
-    <dgm:pt modelId="{8C4BF9D1-AFF8-4068-A2FE-E565A9FC4492}">
+    <dgm:pt modelId="{F6A68DFE-8671-4160-B4A8-7013D44E51CB}">
       <dgm:prSet phldrT="[Text]" custT="1"/>
       <dgm:spPr/>
       <dgm:t>
@@ -12459,7 +12453,7 @@
         </a:p>
       </dgm:t>
     </dgm:pt>
-    <dgm:pt modelId="{E8314AD0-3BEC-4A96-B4A9-7277BBFC9561}" type="parTrans" cxnId="{2AE94751-95DB-43C6-89D4-3366721D3258}">
+    <dgm:pt modelId="{817F9D70-A8E6-46A2-8C98-2FEB24F04C0E}" type="parTrans" cxnId="{BA111658-91AF-477E-812F-008906452E03}">
       <dgm:prSet/>
       <dgm:spPr/>
       <dgm:t>
@@ -12470,7 +12464,7 @@
         </a:p>
       </dgm:t>
     </dgm:pt>
-    <dgm:pt modelId="{D7BB0C32-CBD8-4899-BEBF-4D13EB12563E}" type="sibTrans" cxnId="{2AE94751-95DB-43C6-89D4-3366721D3258}">
+    <dgm:pt modelId="{1725503C-5F2B-4797-B086-3696F50210F3}" type="sibTrans" cxnId="{BA111658-91AF-477E-812F-008906452E03}">
       <dgm:prSet/>
       <dgm:spPr/>
       <dgm:t>
@@ -12481,7 +12475,7 @@
         </a:p>
       </dgm:t>
     </dgm:pt>
-    <dgm:pt modelId="{06763911-0732-4232-877B-F155A7A7870D}">
+    <dgm:pt modelId="{52A667BB-500C-4CD0-B771-784C6AC19FBA}">
       <dgm:prSet phldrT="[Text]" custT="1"/>
       <dgm:spPr/>
       <dgm:t>
@@ -12499,7 +12493,7 @@
         </a:p>
       </dgm:t>
     </dgm:pt>
-    <dgm:pt modelId="{86D0F2A7-1430-416B-9C05-97A18421C5E1}" type="parTrans" cxnId="{44B9B88C-53A3-4DFD-B580-F099C34162F2}">
+    <dgm:pt modelId="{7D3847D4-1AA4-4107-9F73-5EBBC968218B}" type="parTrans" cxnId="{A3C19139-96FB-409B-9207-B402F8EA7C97}">
       <dgm:prSet/>
       <dgm:spPr/>
       <dgm:t>
@@ -12510,7 +12504,7 @@
         </a:p>
       </dgm:t>
     </dgm:pt>
-    <dgm:pt modelId="{56E0C3BE-E6C7-4156-A2A2-7AAC1EB77C45}" type="sibTrans" cxnId="{44B9B88C-53A3-4DFD-B580-F099C34162F2}">
+    <dgm:pt modelId="{0C0524B3-F9CC-4B76-9052-4A440475A505}" type="sibTrans" cxnId="{A3C19139-96FB-409B-9207-B402F8EA7C97}">
       <dgm:prSet/>
       <dgm:spPr/>
       <dgm:t>
@@ -12521,7 +12515,7 @@
         </a:p>
       </dgm:t>
     </dgm:pt>
-    <dgm:pt modelId="{A6B92AB3-832A-492A-87B9-094FC23EE5C9}">
+    <dgm:pt modelId="{469ED81A-88C1-4923-9697-6E2619930091}">
       <dgm:prSet phldrT="[Text]" custT="1"/>
       <dgm:spPr/>
       <dgm:t>
@@ -12539,7 +12533,7 @@
         </a:p>
       </dgm:t>
     </dgm:pt>
-    <dgm:pt modelId="{DB67AF25-5729-41D5-BDBC-88859EBD659B}" type="parTrans" cxnId="{837969EB-13FE-425A-8EAF-A519952F1BBE}">
+    <dgm:pt modelId="{5E83756F-3176-47E1-A338-64B0F829793B}" type="parTrans" cxnId="{02D0C366-AF0B-4F8E-BE5C-5DC1E2150FAB}">
       <dgm:prSet/>
       <dgm:spPr/>
       <dgm:t>
@@ -12550,7 +12544,7 @@
         </a:p>
       </dgm:t>
     </dgm:pt>
-    <dgm:pt modelId="{E169BA2A-5E04-41C0-A15C-376D37D47E49}" type="sibTrans" cxnId="{837969EB-13FE-425A-8EAF-A519952F1BBE}">
+    <dgm:pt modelId="{8C45754F-B2E9-4B2B-B3D4-55C19E55379B}" type="sibTrans" cxnId="{02D0C366-AF0B-4F8E-BE5C-5DC1E2150FAB}">
       <dgm:prSet/>
       <dgm:spPr/>
       <dgm:t>
@@ -12561,7 +12555,7 @@
         </a:p>
       </dgm:t>
     </dgm:pt>
-    <dgm:pt modelId="{70D0D24A-C1D3-4A80-A54F-25A2F51DED4F}">
+    <dgm:pt modelId="{31B6847F-7FC0-407B-8FCB-1885E7C41A7C}">
       <dgm:prSet phldrT="[Text]" custT="1"/>
       <dgm:spPr/>
       <dgm:t>
@@ -12579,7 +12573,7 @@
         </a:p>
       </dgm:t>
     </dgm:pt>
-    <dgm:pt modelId="{411EE6CD-516D-48FF-A989-D13294492D6E}" type="parTrans" cxnId="{D67D5BBE-642C-4070-80CE-C487109C0FC4}">
+    <dgm:pt modelId="{175FC084-C7CD-4AD5-99B2-AB3C76E38132}" type="parTrans" cxnId="{0955CE68-5449-4B12-B019-BF188CF1F836}">
       <dgm:prSet/>
       <dgm:spPr/>
       <dgm:t>
@@ -12590,7 +12584,7 @@
         </a:p>
       </dgm:t>
     </dgm:pt>
-    <dgm:pt modelId="{77E10AD2-9BEA-4BCD-9ACD-947CA54A4467}" type="sibTrans" cxnId="{D67D5BBE-642C-4070-80CE-C487109C0FC4}">
+    <dgm:pt modelId="{63D2B4AB-EFE8-4EBA-AC89-EB13FFB77A2B}" type="sibTrans" cxnId="{0955CE68-5449-4B12-B019-BF188CF1F836}">
       <dgm:prSet/>
       <dgm:spPr/>
       <dgm:t>
@@ -12601,7 +12595,7 @@
         </a:p>
       </dgm:t>
     </dgm:pt>
-    <dgm:pt modelId="{C642B835-EB96-4AE8-8DF3-729799204460}">
+    <dgm:pt modelId="{05D52169-53A1-419D-AE13-92A6DDCD8A3C}">
       <dgm:prSet phldrT="[Text]" custT="1"/>
       <dgm:spPr/>
       <dgm:t>
@@ -12619,7 +12613,7 @@
         </a:p>
       </dgm:t>
     </dgm:pt>
-    <dgm:pt modelId="{D003C8E5-435A-47A6-A1BE-061692FC0DF4}" type="parTrans" cxnId="{B893C3D5-183D-41C4-8965-53F9689116F0}">
+    <dgm:pt modelId="{0C95FFBB-96CA-4B29-85DF-F491E05FEE12}" type="parTrans" cxnId="{7E6CC733-7287-4C7C-8400-34321BAED9FF}">
       <dgm:prSet/>
       <dgm:spPr/>
       <dgm:t>
@@ -12630,7 +12624,7 @@
         </a:p>
       </dgm:t>
     </dgm:pt>
-    <dgm:pt modelId="{6CB4DF8F-E8D5-412E-AFF9-1494CB190FD9}" type="sibTrans" cxnId="{B893C3D5-183D-41C4-8965-53F9689116F0}">
+    <dgm:pt modelId="{28E0EA15-A065-4B8C-9132-E4E51FD54B27}" type="sibTrans" cxnId="{7E6CC733-7287-4C7C-8400-34321BAED9FF}">
       <dgm:prSet/>
       <dgm:spPr/>
       <dgm:t>
@@ -12641,7 +12635,7 @@
         </a:p>
       </dgm:t>
     </dgm:pt>
-    <dgm:pt modelId="{79DEB359-67AB-4C8A-B280-EF9466548259}">
+    <dgm:pt modelId="{A491FD41-192C-4D28-8F6F-06396170B6F7}">
       <dgm:prSet phldrT="[Text]" custT="1"/>
       <dgm:spPr/>
       <dgm:t>
@@ -12659,7 +12653,7 @@
         </a:p>
       </dgm:t>
     </dgm:pt>
-    <dgm:pt modelId="{37AA37DF-9AC3-4170-A8AE-B3D85B4AE1E0}" type="parTrans" cxnId="{08B9A0B1-0490-497A-8AF8-A3A0545C5057}">
+    <dgm:pt modelId="{5020D4FA-C480-4E9A-A109-6CAE685CECBC}" type="parTrans" cxnId="{5C41A22A-D862-4A21-B018-267A51D871A0}">
       <dgm:prSet/>
       <dgm:spPr/>
       <dgm:t>
@@ -12670,7 +12664,7 @@
         </a:p>
       </dgm:t>
     </dgm:pt>
-    <dgm:pt modelId="{468498F0-7E34-4614-8BA8-D7985D2A2C72}" type="sibTrans" cxnId="{08B9A0B1-0490-497A-8AF8-A3A0545C5057}">
+    <dgm:pt modelId="{4808E0B8-34DD-4732-9C3C-B558F60365B6}" type="sibTrans" cxnId="{5C41A22A-D862-4A21-B018-267A51D871A0}">
       <dgm:prSet/>
       <dgm:spPr/>
       <dgm:t>
@@ -12681,8 +12675,8 @@
         </a:p>
       </dgm:t>
     </dgm:pt>
-    <dgm:pt modelId="{8B426841-9ED7-4717-9771-23BCF21D1DEF}" type="pres">
-      <dgm:prSet presAssocID="{A14790B2-4EC4-4611-906F-828EC5C5DA3B}" presName="Name0" presStyleCnt="0">
+    <dgm:pt modelId="{1DFCA981-FC5D-4CD2-82E1-3A1132AB10E0}" type="pres">
+      <dgm:prSet presAssocID="{F0E5EC29-B935-43FC-A8DC-52B0A9EC61B2}" presName="Name0" presStyleCnt="0">
         <dgm:presLayoutVars>
           <dgm:dir/>
           <dgm:animLvl val="lvl"/>
@@ -12691,12 +12685,12 @@
       </dgm:prSet>
       <dgm:spPr/>
     </dgm:pt>
-    <dgm:pt modelId="{B89E419B-8B2E-42F2-A252-61FE795F4FB7}" type="pres">
-      <dgm:prSet presAssocID="{2A249F52-7791-48FC-A7F7-9477B1598F9C}" presName="linNode" presStyleCnt="0"/>
+    <dgm:pt modelId="{DB0BD9BE-1482-41E0-A7C0-E083D02C46FB}" type="pres">
+      <dgm:prSet presAssocID="{905B648B-5517-41B9-918D-DF4373E4CB86}" presName="linNode" presStyleCnt="0"/>
       <dgm:spPr/>
     </dgm:pt>
-    <dgm:pt modelId="{AC234256-8D89-4949-AECE-60EAD511FD5D}" type="pres">
-      <dgm:prSet presAssocID="{2A249F52-7791-48FC-A7F7-9477B1598F9C}" presName="parentText" presStyleLbl="node1" presStyleIdx="0" presStyleCnt="5">
+    <dgm:pt modelId="{78789BBE-4898-4099-9C91-99A0869FA37D}" type="pres">
+      <dgm:prSet presAssocID="{905B648B-5517-41B9-918D-DF4373E4CB86}" presName="parentText" presStyleLbl="node1" presStyleIdx="0" presStyleCnt="5">
         <dgm:presLayoutVars>
           <dgm:chMax val="1"/>
           <dgm:bulletEnabled val="1"/>
@@ -12704,24 +12698,24 @@
       </dgm:prSet>
       <dgm:spPr/>
     </dgm:pt>
-    <dgm:pt modelId="{22D20DDA-D0C1-410E-B380-40F1F26EE6EC}" type="pres">
-      <dgm:prSet presAssocID="{2A249F52-7791-48FC-A7F7-9477B1598F9C}" presName="descendantText" presStyleLbl="alignAccFollowNode1" presStyleIdx="0" presStyleCnt="5">
+    <dgm:pt modelId="{57C4B712-EE35-450A-B883-71F107516DEB}" type="pres">
+      <dgm:prSet presAssocID="{905B648B-5517-41B9-918D-DF4373E4CB86}" presName="descendantText" presStyleLbl="alignAccFollowNode1" presStyleIdx="0" presStyleCnt="5">
         <dgm:presLayoutVars>
           <dgm:bulletEnabled val="1"/>
         </dgm:presLayoutVars>
       </dgm:prSet>
       <dgm:spPr/>
     </dgm:pt>
-    <dgm:pt modelId="{A5440042-F755-46D3-9677-BE64CB88FB1D}" type="pres">
-      <dgm:prSet presAssocID="{EFADC0CC-08A8-4903-9BC9-01D307E7D189}" presName="sp" presStyleCnt="0"/>
+    <dgm:pt modelId="{323B1D3F-5F3E-4FE1-8585-8E19C7034BCE}" type="pres">
+      <dgm:prSet presAssocID="{89B76813-B16A-45F7-8397-F70D13B34855}" presName="sp" presStyleCnt="0"/>
       <dgm:spPr/>
     </dgm:pt>
-    <dgm:pt modelId="{C5CDC2CD-DFC7-4A6B-9A79-53F6EB1AA5D9}" type="pres">
-      <dgm:prSet presAssocID="{C9D1F496-E754-4268-8C64-30459A7D6709}" presName="linNode" presStyleCnt="0"/>
+    <dgm:pt modelId="{5AF48F84-71A8-45BF-9187-874F196C425B}" type="pres">
+      <dgm:prSet presAssocID="{A3DD26F5-7A4C-4FE7-BB87-09033191052E}" presName="linNode" presStyleCnt="0"/>
       <dgm:spPr/>
     </dgm:pt>
-    <dgm:pt modelId="{D2152C0F-2F05-4E88-B77A-273198D9B1DE}" type="pres">
-      <dgm:prSet presAssocID="{C9D1F496-E754-4268-8C64-30459A7D6709}" presName="parentText" presStyleLbl="node1" presStyleIdx="1" presStyleCnt="5">
+    <dgm:pt modelId="{F9B13E8C-0FA6-4389-81A2-1617E638414A}" type="pres">
+      <dgm:prSet presAssocID="{A3DD26F5-7A4C-4FE7-BB87-09033191052E}" presName="parentText" presStyleLbl="node1" presStyleIdx="1" presStyleCnt="5">
         <dgm:presLayoutVars>
           <dgm:chMax val="1"/>
           <dgm:bulletEnabled val="1"/>
@@ -12729,24 +12723,24 @@
       </dgm:prSet>
       <dgm:spPr/>
     </dgm:pt>
-    <dgm:pt modelId="{E0EE8E6D-DFC2-4ABA-ACB0-D48EDC31B270}" type="pres">
-      <dgm:prSet presAssocID="{C9D1F496-E754-4268-8C64-30459A7D6709}" presName="descendantText" presStyleLbl="alignAccFollowNode1" presStyleIdx="1" presStyleCnt="5">
+    <dgm:pt modelId="{37A6B501-4217-48D9-A852-741DD34D4155}" type="pres">
+      <dgm:prSet presAssocID="{A3DD26F5-7A4C-4FE7-BB87-09033191052E}" presName="descendantText" presStyleLbl="alignAccFollowNode1" presStyleIdx="1" presStyleCnt="5">
         <dgm:presLayoutVars>
           <dgm:bulletEnabled val="1"/>
         </dgm:presLayoutVars>
       </dgm:prSet>
       <dgm:spPr/>
     </dgm:pt>
-    <dgm:pt modelId="{5FC2771B-3979-4E43-A330-9BA4121C8C22}" type="pres">
-      <dgm:prSet presAssocID="{2DFDC93E-FA22-4D0A-9678-373F5F2623AA}" presName="sp" presStyleCnt="0"/>
+    <dgm:pt modelId="{9EB5782C-335D-4D14-9E37-F47B7BEE0957}" type="pres">
+      <dgm:prSet presAssocID="{953F582A-91AF-42B8-B2DA-4608C2DD8D71}" presName="sp" presStyleCnt="0"/>
       <dgm:spPr/>
     </dgm:pt>
-    <dgm:pt modelId="{AC6944A1-6F21-4A2A-A6BC-C57ADB94A660}" type="pres">
-      <dgm:prSet presAssocID="{A21BE0E5-9F89-42D9-89E8-508E411A75B4}" presName="linNode" presStyleCnt="0"/>
+    <dgm:pt modelId="{BA077992-5F1F-4A89-922C-380EB13DF06C}" type="pres">
+      <dgm:prSet presAssocID="{C2ADA40F-7FD2-4BE7-A6A4-5DF94DFB3EDF}" presName="linNode" presStyleCnt="0"/>
       <dgm:spPr/>
     </dgm:pt>
-    <dgm:pt modelId="{37EB76B8-1EC8-450A-9760-29081E7D8068}" type="pres">
-      <dgm:prSet presAssocID="{A21BE0E5-9F89-42D9-89E8-508E411A75B4}" presName="parentText" presStyleLbl="node1" presStyleIdx="2" presStyleCnt="5">
+    <dgm:pt modelId="{12C1161B-045F-4C04-A313-E29554BBDE91}" type="pres">
+      <dgm:prSet presAssocID="{C2ADA40F-7FD2-4BE7-A6A4-5DF94DFB3EDF}" presName="parentText" presStyleLbl="node1" presStyleIdx="2" presStyleCnt="5">
         <dgm:presLayoutVars>
           <dgm:chMax val="1"/>
           <dgm:bulletEnabled val="1"/>
@@ -12754,24 +12748,24 @@
       </dgm:prSet>
       <dgm:spPr/>
     </dgm:pt>
-    <dgm:pt modelId="{4B74ABAA-97FF-438C-92FD-D94C8FB196AB}" type="pres">
-      <dgm:prSet presAssocID="{A21BE0E5-9F89-42D9-89E8-508E411A75B4}" presName="descendantText" presStyleLbl="alignAccFollowNode1" presStyleIdx="2" presStyleCnt="5">
+    <dgm:pt modelId="{D7F731B8-EDAE-434B-9AC4-4F52E56AF9D5}" type="pres">
+      <dgm:prSet presAssocID="{C2ADA40F-7FD2-4BE7-A6A4-5DF94DFB3EDF}" presName="descendantText" presStyleLbl="alignAccFollowNode1" presStyleIdx="2" presStyleCnt="5">
         <dgm:presLayoutVars>
           <dgm:bulletEnabled val="1"/>
         </dgm:presLayoutVars>
       </dgm:prSet>
       <dgm:spPr/>
     </dgm:pt>
-    <dgm:pt modelId="{957E4C35-5AAB-4E9B-BBD5-F81C07AC7895}" type="pres">
-      <dgm:prSet presAssocID="{A9BDC510-E5A8-47EE-9DBB-984F4307D33B}" presName="sp" presStyleCnt="0"/>
+    <dgm:pt modelId="{E897DF53-0DD5-4B6B-952D-ADFE9CC2431D}" type="pres">
+      <dgm:prSet presAssocID="{B482F30E-FA0F-4A9A-967B-57C61F0A2EE7}" presName="sp" presStyleCnt="0"/>
       <dgm:spPr/>
     </dgm:pt>
-    <dgm:pt modelId="{F45DC3C4-A5D5-489B-994B-E6390D3DE178}" type="pres">
-      <dgm:prSet presAssocID="{8C4BF9D1-AFF8-4068-A2FE-E565A9FC4492}" presName="linNode" presStyleCnt="0"/>
+    <dgm:pt modelId="{BB393C05-5A82-4C38-92ED-8F9CD53DEA9C}" type="pres">
+      <dgm:prSet presAssocID="{F6A68DFE-8671-4160-B4A8-7013D44E51CB}" presName="linNode" presStyleCnt="0"/>
       <dgm:spPr/>
     </dgm:pt>
-    <dgm:pt modelId="{30157204-0BF3-4419-B5BF-5B81C36F99F9}" type="pres">
-      <dgm:prSet presAssocID="{8C4BF9D1-AFF8-4068-A2FE-E565A9FC4492}" presName="parentText" presStyleLbl="node1" presStyleIdx="3" presStyleCnt="5">
+    <dgm:pt modelId="{B9D1539B-EC1A-4FB6-9BB8-5AD744B651B6}" type="pres">
+      <dgm:prSet presAssocID="{F6A68DFE-8671-4160-B4A8-7013D44E51CB}" presName="parentText" presStyleLbl="node1" presStyleIdx="3" presStyleCnt="5">
         <dgm:presLayoutVars>
           <dgm:chMax val="1"/>
           <dgm:bulletEnabled val="1"/>
@@ -12779,24 +12773,24 @@
       </dgm:prSet>
       <dgm:spPr/>
     </dgm:pt>
-    <dgm:pt modelId="{D3E48A5A-F36E-43C5-BD53-37D7D169B9B4}" type="pres">
-      <dgm:prSet presAssocID="{8C4BF9D1-AFF8-4068-A2FE-E565A9FC4492}" presName="descendantText" presStyleLbl="alignAccFollowNode1" presStyleIdx="3" presStyleCnt="5">
+    <dgm:pt modelId="{1015202B-F803-41E6-ACBE-EFE0F11981FE}" type="pres">
+      <dgm:prSet presAssocID="{F6A68DFE-8671-4160-B4A8-7013D44E51CB}" presName="descendantText" presStyleLbl="alignAccFollowNode1" presStyleIdx="3" presStyleCnt="5">
         <dgm:presLayoutVars>
           <dgm:bulletEnabled val="1"/>
         </dgm:presLayoutVars>
       </dgm:prSet>
       <dgm:spPr/>
     </dgm:pt>
-    <dgm:pt modelId="{DA67041B-8812-4253-9F25-474E21D4BDAD}" type="pres">
-      <dgm:prSet presAssocID="{D7BB0C32-CBD8-4899-BEBF-4D13EB12563E}" presName="sp" presStyleCnt="0"/>
+    <dgm:pt modelId="{C6FCC61E-1B19-4E48-A843-35F8FD29BDFF}" type="pres">
+      <dgm:prSet presAssocID="{1725503C-5F2B-4797-B086-3696F50210F3}" presName="sp" presStyleCnt="0"/>
       <dgm:spPr/>
     </dgm:pt>
-    <dgm:pt modelId="{CB624201-E96A-4D74-A296-B8C37A359554}" type="pres">
-      <dgm:prSet presAssocID="{70D0D24A-C1D3-4A80-A54F-25A2F51DED4F}" presName="linNode" presStyleCnt="0"/>
+    <dgm:pt modelId="{0BBD14F3-2DF0-4B72-A4D4-5442232D43F8}" type="pres">
+      <dgm:prSet presAssocID="{31B6847F-7FC0-407B-8FCB-1885E7C41A7C}" presName="linNode" presStyleCnt="0"/>
       <dgm:spPr/>
     </dgm:pt>
-    <dgm:pt modelId="{D5FD0FDD-D624-4659-8257-3C4FA3FA6F4B}" type="pres">
-      <dgm:prSet presAssocID="{70D0D24A-C1D3-4A80-A54F-25A2F51DED4F}" presName="parentText" presStyleLbl="node1" presStyleIdx="4" presStyleCnt="5">
+    <dgm:pt modelId="{FC5A03C8-A193-4988-89F9-C15C3F413212}" type="pres">
+      <dgm:prSet presAssocID="{31B6847F-7FC0-407B-8FCB-1885E7C41A7C}" presName="parentText" presStyleLbl="node1" presStyleIdx="4" presStyleCnt="5">
         <dgm:presLayoutVars>
           <dgm:chMax val="1"/>
           <dgm:bulletEnabled val="1"/>
@@ -12804,8 +12798,8 @@
       </dgm:prSet>
       <dgm:spPr/>
     </dgm:pt>
-    <dgm:pt modelId="{3188898B-0B6F-45DA-9B1C-C255B71B9029}" type="pres">
-      <dgm:prSet presAssocID="{70D0D24A-C1D3-4A80-A54F-25A2F51DED4F}" presName="descendantText" presStyleLbl="alignAccFollowNode1" presStyleIdx="4" presStyleCnt="5">
+    <dgm:pt modelId="{A149E8D8-6B57-420B-A154-DCF9B92EDD3B}" type="pres">
+      <dgm:prSet presAssocID="{31B6847F-7FC0-407B-8FCB-1885E7C41A7C}" presName="descendantText" presStyleLbl="alignAccFollowNode1" presStyleIdx="4" presStyleCnt="5">
         <dgm:presLayoutVars>
           <dgm:bulletEnabled val="1"/>
         </dgm:presLayoutVars>
@@ -12814,56 +12808,56 @@
     </dgm:pt>
   </dgm:ptLst>
   <dgm:cxnLst>
-    <dgm:cxn modelId="{77BD46A4-9E0F-459B-B633-E359C905BECE}" srcId="{A14790B2-4EC4-4611-906F-828EC5C5DA3B}" destId="{2A249F52-7791-48FC-A7F7-9477B1598F9C}" srcOrd="0" destOrd="0" parTransId="{24D21E4F-CE2D-4EC9-B225-5A8592F2009E}" sibTransId="{EFADC0CC-08A8-4903-9BC9-01D307E7D189}"/>
-    <dgm:cxn modelId="{12553DB7-CEFB-4043-9B10-60B1CA974367}" srcId="{2A249F52-7791-48FC-A7F7-9477B1598F9C}" destId="{67DD0961-D45E-421B-AC27-AE9ED79D959C}" srcOrd="0" destOrd="0" parTransId="{D7BB1197-45E6-4EE6-B3AA-1D6EAF0BC349}" sibTransId="{D1880A73-CEBA-44D7-BBD5-2F15CBBA2D59}"/>
-    <dgm:cxn modelId="{1793D2E6-52CC-42C7-8DC9-0F5DA3324B51}" srcId="{2A249F52-7791-48FC-A7F7-9477B1598F9C}" destId="{F63166CF-860A-47F8-AA2C-8FF6B43A2725}" srcOrd="1" destOrd="0" parTransId="{F9EC04F9-9475-45A3-AEE3-DC88EEF42786}" sibTransId="{942C9118-18D4-4B3C-8095-5D90ABFD69E5}"/>
-    <dgm:cxn modelId="{F61E9AE4-36B6-46E8-97C5-CC5767CE8156}" srcId="{A14790B2-4EC4-4611-906F-828EC5C5DA3B}" destId="{C9D1F496-E754-4268-8C64-30459A7D6709}" srcOrd="1" destOrd="0" parTransId="{6FFE751D-FAB9-4F72-8996-B69AF28C170A}" sibTransId="{2DFDC93E-FA22-4D0A-9678-373F5F2623AA}"/>
-    <dgm:cxn modelId="{EEAABDA0-4E2B-4DDD-83C0-C9F583FAC17F}" srcId="{C9D1F496-E754-4268-8C64-30459A7D6709}" destId="{4C9A6D7F-D448-48C4-8FE7-67E65549357A}" srcOrd="0" destOrd="0" parTransId="{3D64E841-0A73-4C38-9A43-D43B03B2BEB1}" sibTransId="{7241D431-F080-41C3-9828-E5669CC17B9F}"/>
-    <dgm:cxn modelId="{A079E798-D226-4051-A460-C2A5D299DDAB}" srcId="{C9D1F496-E754-4268-8C64-30459A7D6709}" destId="{910DAFFA-802D-4189-8EFE-9F1C4D28C641}" srcOrd="1" destOrd="0" parTransId="{CA4100DA-1127-45D5-9966-DAD64502428D}" sibTransId="{CE7AC8C4-3130-4B80-81E6-6DEC77CB8A87}"/>
-    <dgm:cxn modelId="{C8B7F2E7-2D8C-436F-A920-71D120802BEB}" srcId="{A14790B2-4EC4-4611-906F-828EC5C5DA3B}" destId="{A21BE0E5-9F89-42D9-89E8-508E411A75B4}" srcOrd="2" destOrd="0" parTransId="{95484804-886B-41B1-93E5-BDD2CD6CEF8F}" sibTransId="{A9BDC510-E5A8-47EE-9DBB-984F4307D33B}"/>
-    <dgm:cxn modelId="{D42BD8C6-E3ED-4E7B-8686-8E0F04C8E779}" srcId="{A21BE0E5-9F89-42D9-89E8-508E411A75B4}" destId="{3A95B2CD-D13C-40FB-AD26-5672970C63CA}" srcOrd="0" destOrd="0" parTransId="{76D2A46B-4378-4C10-A7B6-C3FEFD7DA675}" sibTransId="{A82ADFAD-2C9C-4EE1-BCAA-AE4A64EB655F}"/>
-    <dgm:cxn modelId="{8A7CD3E8-B37D-45C5-9FA8-47419B7E7BE8}" srcId="{A21BE0E5-9F89-42D9-89E8-508E411A75B4}" destId="{BBEF86E7-5B97-4B28-AA7F-E7C4E933CCCA}" srcOrd="1" destOrd="0" parTransId="{0FE6DDD2-A2CA-4F63-B254-58292DD055C7}" sibTransId="{918740FC-79A2-4108-94DF-A5039D22E381}"/>
-    <dgm:cxn modelId="{2AE94751-95DB-43C6-89D4-3366721D3258}" srcId="{A14790B2-4EC4-4611-906F-828EC5C5DA3B}" destId="{8C4BF9D1-AFF8-4068-A2FE-E565A9FC4492}" srcOrd="3" destOrd="0" parTransId="{E8314AD0-3BEC-4A96-B4A9-7277BBFC9561}" sibTransId="{D7BB0C32-CBD8-4899-BEBF-4D13EB12563E}"/>
-    <dgm:cxn modelId="{44B9B88C-53A3-4DFD-B580-F099C34162F2}" srcId="{8C4BF9D1-AFF8-4068-A2FE-E565A9FC4492}" destId="{06763911-0732-4232-877B-F155A7A7870D}" srcOrd="0" destOrd="0" parTransId="{86D0F2A7-1430-416B-9C05-97A18421C5E1}" sibTransId="{56E0C3BE-E6C7-4156-A2A2-7AAC1EB77C45}"/>
-    <dgm:cxn modelId="{837969EB-13FE-425A-8EAF-A519952F1BBE}" srcId="{8C4BF9D1-AFF8-4068-A2FE-E565A9FC4492}" destId="{A6B92AB3-832A-492A-87B9-094FC23EE5C9}" srcOrd="1" destOrd="0" parTransId="{DB67AF25-5729-41D5-BDBC-88859EBD659B}" sibTransId="{E169BA2A-5E04-41C0-A15C-376D37D47E49}"/>
-    <dgm:cxn modelId="{D67D5BBE-642C-4070-80CE-C487109C0FC4}" srcId="{A14790B2-4EC4-4611-906F-828EC5C5DA3B}" destId="{70D0D24A-C1D3-4A80-A54F-25A2F51DED4F}" srcOrd="4" destOrd="0" parTransId="{411EE6CD-516D-48FF-A989-D13294492D6E}" sibTransId="{77E10AD2-9BEA-4BCD-9ACD-947CA54A4467}"/>
-    <dgm:cxn modelId="{B893C3D5-183D-41C4-8965-53F9689116F0}" srcId="{70D0D24A-C1D3-4A80-A54F-25A2F51DED4F}" destId="{C642B835-EB96-4AE8-8DF3-729799204460}" srcOrd="0" destOrd="0" parTransId="{D003C8E5-435A-47A6-A1BE-061692FC0DF4}" sibTransId="{6CB4DF8F-E8D5-412E-AFF9-1494CB190FD9}"/>
-    <dgm:cxn modelId="{08B9A0B1-0490-497A-8AF8-A3A0545C5057}" srcId="{70D0D24A-C1D3-4A80-A54F-25A2F51DED4F}" destId="{79DEB359-67AB-4C8A-B280-EF9466548259}" srcOrd="1" destOrd="0" parTransId="{37AA37DF-9AC3-4170-A8AE-B3D85B4AE1E0}" sibTransId="{468498F0-7E34-4614-8BA8-D7985D2A2C72}"/>
-    <dgm:cxn modelId="{934CA4AF-3788-441D-976C-DB2675B8577E}" type="presOf" srcId="{A14790B2-4EC4-4611-906F-828EC5C5DA3B}" destId="{8B426841-9ED7-4717-9771-23BCF21D1DEF}" srcOrd="0" destOrd="0" presId="urn:microsoft.com/office/officeart/2005/8/layout/vList5"/>
-    <dgm:cxn modelId="{42BFC064-13FC-4821-972F-00375C570C79}" type="presParOf" srcId="{8B426841-9ED7-4717-9771-23BCF21D1DEF}" destId="{B89E419B-8B2E-42F2-A252-61FE795F4FB7}" srcOrd="0" destOrd="0" presId="urn:microsoft.com/office/officeart/2005/8/layout/vList5"/>
-    <dgm:cxn modelId="{D5CB5C4D-A0DF-47AC-B9F2-EDF0B55BF2CD}" type="presParOf" srcId="{B89E419B-8B2E-42F2-A252-61FE795F4FB7}" destId="{AC234256-8D89-4949-AECE-60EAD511FD5D}" srcOrd="0" destOrd="0" presId="urn:microsoft.com/office/officeart/2005/8/layout/vList5"/>
-    <dgm:cxn modelId="{20B90B99-2195-4D85-B888-10EAE300F5A1}" type="presOf" srcId="{2A249F52-7791-48FC-A7F7-9477B1598F9C}" destId="{AC234256-8D89-4949-AECE-60EAD511FD5D}" srcOrd="0" destOrd="0" presId="urn:microsoft.com/office/officeart/2005/8/layout/vList5"/>
-    <dgm:cxn modelId="{157D82EC-35D7-4E5F-9015-29B535DBF93E}" type="presParOf" srcId="{B89E419B-8B2E-42F2-A252-61FE795F4FB7}" destId="{22D20DDA-D0C1-410E-B380-40F1F26EE6EC}" srcOrd="1" destOrd="0" presId="urn:microsoft.com/office/officeart/2005/8/layout/vList5"/>
-    <dgm:cxn modelId="{7C4A7A08-4B98-4BC9-BFDB-C0D03E4F2810}" type="presOf" srcId="{67DD0961-D45E-421B-AC27-AE9ED79D959C}" destId="{22D20DDA-D0C1-410E-B380-40F1F26EE6EC}" srcOrd="0" destOrd="0" presId="urn:microsoft.com/office/officeart/2005/8/layout/vList5"/>
-    <dgm:cxn modelId="{ED5EB3BF-5561-4C5C-B68E-218AEF0D7B3B}" type="presOf" srcId="{F63166CF-860A-47F8-AA2C-8FF6B43A2725}" destId="{22D20DDA-D0C1-410E-B380-40F1F26EE6EC}" srcOrd="0" destOrd="1" presId="urn:microsoft.com/office/officeart/2005/8/layout/vList5"/>
-    <dgm:cxn modelId="{6BB4FE1F-57AC-4872-83E0-FFA815530F78}" type="presParOf" srcId="{8B426841-9ED7-4717-9771-23BCF21D1DEF}" destId="{A5440042-F755-46D3-9677-BE64CB88FB1D}" srcOrd="1" destOrd="0" presId="urn:microsoft.com/office/officeart/2005/8/layout/vList5"/>
-    <dgm:cxn modelId="{24E065DC-9A65-4EBF-A823-F76FAAACD5DE}" type="presParOf" srcId="{8B426841-9ED7-4717-9771-23BCF21D1DEF}" destId="{C5CDC2CD-DFC7-4A6B-9A79-53F6EB1AA5D9}" srcOrd="2" destOrd="0" presId="urn:microsoft.com/office/officeart/2005/8/layout/vList5"/>
-    <dgm:cxn modelId="{0F6D554A-BFFE-4AC6-8ABA-2C2DE4439751}" type="presParOf" srcId="{C5CDC2CD-DFC7-4A6B-9A79-53F6EB1AA5D9}" destId="{D2152C0F-2F05-4E88-B77A-273198D9B1DE}" srcOrd="0" destOrd="0" presId="urn:microsoft.com/office/officeart/2005/8/layout/vList5"/>
-    <dgm:cxn modelId="{D8E2FE63-E6A6-4F7B-BE03-0C0E2B8C0126}" type="presOf" srcId="{C9D1F496-E754-4268-8C64-30459A7D6709}" destId="{D2152C0F-2F05-4E88-B77A-273198D9B1DE}" srcOrd="0" destOrd="0" presId="urn:microsoft.com/office/officeart/2005/8/layout/vList5"/>
-    <dgm:cxn modelId="{594A5F87-D90B-4A88-B84D-41D37A40D64E}" type="presParOf" srcId="{C5CDC2CD-DFC7-4A6B-9A79-53F6EB1AA5D9}" destId="{E0EE8E6D-DFC2-4ABA-ACB0-D48EDC31B270}" srcOrd="1" destOrd="0" presId="urn:microsoft.com/office/officeart/2005/8/layout/vList5"/>
-    <dgm:cxn modelId="{5A2D33B1-EAC4-4297-9D0F-1F709194184D}" type="presOf" srcId="{4C9A6D7F-D448-48C4-8FE7-67E65549357A}" destId="{E0EE8E6D-DFC2-4ABA-ACB0-D48EDC31B270}" srcOrd="0" destOrd="0" presId="urn:microsoft.com/office/officeart/2005/8/layout/vList5"/>
-    <dgm:cxn modelId="{0F3FA6C3-38E2-4B64-97FD-53179261958C}" type="presOf" srcId="{910DAFFA-802D-4189-8EFE-9F1C4D28C641}" destId="{E0EE8E6D-DFC2-4ABA-ACB0-D48EDC31B270}" srcOrd="0" destOrd="1" presId="urn:microsoft.com/office/officeart/2005/8/layout/vList5"/>
-    <dgm:cxn modelId="{8C6696D6-0327-4321-B2C0-723EDAE1F031}" type="presParOf" srcId="{8B426841-9ED7-4717-9771-23BCF21D1DEF}" destId="{5FC2771B-3979-4E43-A330-9BA4121C8C22}" srcOrd="3" destOrd="0" presId="urn:microsoft.com/office/officeart/2005/8/layout/vList5"/>
-    <dgm:cxn modelId="{93BE6596-A7F3-4456-B8F6-5D72AF060FE9}" type="presParOf" srcId="{8B426841-9ED7-4717-9771-23BCF21D1DEF}" destId="{AC6944A1-6F21-4A2A-A6BC-C57ADB94A660}" srcOrd="4" destOrd="0" presId="urn:microsoft.com/office/officeart/2005/8/layout/vList5"/>
-    <dgm:cxn modelId="{74D42A7C-6ED5-4D3A-AC17-E8A389D488D6}" type="presParOf" srcId="{AC6944A1-6F21-4A2A-A6BC-C57ADB94A660}" destId="{37EB76B8-1EC8-450A-9760-29081E7D8068}" srcOrd="0" destOrd="0" presId="urn:microsoft.com/office/officeart/2005/8/layout/vList5"/>
-    <dgm:cxn modelId="{F02034F3-487B-4C62-8D58-5ED4320ECDFD}" type="presOf" srcId="{A21BE0E5-9F89-42D9-89E8-508E411A75B4}" destId="{37EB76B8-1EC8-450A-9760-29081E7D8068}" srcOrd="0" destOrd="0" presId="urn:microsoft.com/office/officeart/2005/8/layout/vList5"/>
-    <dgm:cxn modelId="{BC807D4E-2F44-4A6D-9C4E-E6E90BDFF8FE}" type="presParOf" srcId="{AC6944A1-6F21-4A2A-A6BC-C57ADB94A660}" destId="{4B74ABAA-97FF-438C-92FD-D94C8FB196AB}" srcOrd="1" destOrd="0" presId="urn:microsoft.com/office/officeart/2005/8/layout/vList5"/>
-    <dgm:cxn modelId="{6482DA17-1AFB-4CB4-85EF-A8E42FECE681}" type="presOf" srcId="{3A95B2CD-D13C-40FB-AD26-5672970C63CA}" destId="{4B74ABAA-97FF-438C-92FD-D94C8FB196AB}" srcOrd="0" destOrd="0" presId="urn:microsoft.com/office/officeart/2005/8/layout/vList5"/>
-    <dgm:cxn modelId="{C9D36FCA-AA84-4DA5-AF34-EBA08721F910}" type="presOf" srcId="{BBEF86E7-5B97-4B28-AA7F-E7C4E933CCCA}" destId="{4B74ABAA-97FF-438C-92FD-D94C8FB196AB}" srcOrd="0" destOrd="1" presId="urn:microsoft.com/office/officeart/2005/8/layout/vList5"/>
-    <dgm:cxn modelId="{3A5C0F08-CD1B-41BC-8666-1E39C015B9D8}" type="presParOf" srcId="{8B426841-9ED7-4717-9771-23BCF21D1DEF}" destId="{957E4C35-5AAB-4E9B-BBD5-F81C07AC7895}" srcOrd="5" destOrd="0" presId="urn:microsoft.com/office/officeart/2005/8/layout/vList5"/>
-    <dgm:cxn modelId="{58812B7E-331C-4F94-A138-6D4897800458}" type="presParOf" srcId="{8B426841-9ED7-4717-9771-23BCF21D1DEF}" destId="{F45DC3C4-A5D5-489B-994B-E6390D3DE178}" srcOrd="6" destOrd="0" presId="urn:microsoft.com/office/officeart/2005/8/layout/vList5"/>
-    <dgm:cxn modelId="{3D2A303F-11B8-475D-BA3C-B2BD82FD33D5}" type="presParOf" srcId="{F45DC3C4-A5D5-489B-994B-E6390D3DE178}" destId="{30157204-0BF3-4419-B5BF-5B81C36F99F9}" srcOrd="0" destOrd="0" presId="urn:microsoft.com/office/officeart/2005/8/layout/vList5"/>
-    <dgm:cxn modelId="{01E82A18-4706-4384-8F15-502BCF1212CC}" type="presOf" srcId="{8C4BF9D1-AFF8-4068-A2FE-E565A9FC4492}" destId="{30157204-0BF3-4419-B5BF-5B81C36F99F9}" srcOrd="0" destOrd="0" presId="urn:microsoft.com/office/officeart/2005/8/layout/vList5"/>
-    <dgm:cxn modelId="{CDB65E9B-7A5F-4BD8-9D9B-ABB0DAC83176}" type="presParOf" srcId="{F45DC3C4-A5D5-489B-994B-E6390D3DE178}" destId="{D3E48A5A-F36E-43C5-BD53-37D7D169B9B4}" srcOrd="1" destOrd="0" presId="urn:microsoft.com/office/officeart/2005/8/layout/vList5"/>
-    <dgm:cxn modelId="{6A811410-80E2-4FC6-A833-694526D9BE66}" type="presOf" srcId="{06763911-0732-4232-877B-F155A7A7870D}" destId="{D3E48A5A-F36E-43C5-BD53-37D7D169B9B4}" srcOrd="0" destOrd="0" presId="urn:microsoft.com/office/officeart/2005/8/layout/vList5"/>
-    <dgm:cxn modelId="{0BCE71BD-9069-4976-9A6A-1B6181B7D26C}" type="presOf" srcId="{A6B92AB3-832A-492A-87B9-094FC23EE5C9}" destId="{D3E48A5A-F36E-43C5-BD53-37D7D169B9B4}" srcOrd="0" destOrd="1" presId="urn:microsoft.com/office/officeart/2005/8/layout/vList5"/>
-    <dgm:cxn modelId="{5B6AD4F6-EEA5-4639-873F-C63718C75029}" type="presParOf" srcId="{8B426841-9ED7-4717-9771-23BCF21D1DEF}" destId="{DA67041B-8812-4253-9F25-474E21D4BDAD}" srcOrd="7" destOrd="0" presId="urn:microsoft.com/office/officeart/2005/8/layout/vList5"/>
-    <dgm:cxn modelId="{BCF650F5-9D1E-43F9-85DF-C1102129BC3F}" type="presParOf" srcId="{8B426841-9ED7-4717-9771-23BCF21D1DEF}" destId="{CB624201-E96A-4D74-A296-B8C37A359554}" srcOrd="8" destOrd="0" presId="urn:microsoft.com/office/officeart/2005/8/layout/vList5"/>
-    <dgm:cxn modelId="{62CF0B0A-CBE5-4239-B144-D52C7DBD11D7}" type="presParOf" srcId="{CB624201-E96A-4D74-A296-B8C37A359554}" destId="{D5FD0FDD-D624-4659-8257-3C4FA3FA6F4B}" srcOrd="0" destOrd="0" presId="urn:microsoft.com/office/officeart/2005/8/layout/vList5"/>
-    <dgm:cxn modelId="{5F00FEA8-2CA2-4877-8E53-5D6838855017}" type="presOf" srcId="{70D0D24A-C1D3-4A80-A54F-25A2F51DED4F}" destId="{D5FD0FDD-D624-4659-8257-3C4FA3FA6F4B}" srcOrd="0" destOrd="0" presId="urn:microsoft.com/office/officeart/2005/8/layout/vList5"/>
-    <dgm:cxn modelId="{702552C7-D211-4D8E-88FF-0E875C7DA262}" type="presParOf" srcId="{CB624201-E96A-4D74-A296-B8C37A359554}" destId="{3188898B-0B6F-45DA-9B1C-C255B71B9029}" srcOrd="1" destOrd="0" presId="urn:microsoft.com/office/officeart/2005/8/layout/vList5"/>
-    <dgm:cxn modelId="{6FA55624-8BED-44F4-8CF2-803244D1A31A}" type="presOf" srcId="{C642B835-EB96-4AE8-8DF3-729799204460}" destId="{3188898B-0B6F-45DA-9B1C-C255B71B9029}" srcOrd="0" destOrd="0" presId="urn:microsoft.com/office/officeart/2005/8/layout/vList5"/>
-    <dgm:cxn modelId="{817FC628-120E-4FFC-8772-26BE0FA29513}" type="presOf" srcId="{79DEB359-67AB-4C8A-B280-EF9466548259}" destId="{3188898B-0B6F-45DA-9B1C-C255B71B9029}" srcOrd="0" destOrd="1" presId="urn:microsoft.com/office/officeart/2005/8/layout/vList5"/>
+    <dgm:cxn modelId="{66E3993D-0009-4E3D-9595-ACC02B76B35B}" srcId="{F0E5EC29-B935-43FC-A8DC-52B0A9EC61B2}" destId="{905B648B-5517-41B9-918D-DF4373E4CB86}" srcOrd="0" destOrd="0" parTransId="{444403B0-AA7C-4AB4-88D1-0DB3B1A9372E}" sibTransId="{89B76813-B16A-45F7-8397-F70D13B34855}"/>
+    <dgm:cxn modelId="{1C5182EC-908F-4CA6-977D-3D7E78A40DB0}" srcId="{905B648B-5517-41B9-918D-DF4373E4CB86}" destId="{1892D0D8-3048-4663-B368-EA8F196753F5}" srcOrd="0" destOrd="0" parTransId="{C24A4B55-BF30-4222-9D81-E23CA1D8D159}" sibTransId="{F06BA536-4B4B-41E7-824D-1AAB306DB33D}"/>
+    <dgm:cxn modelId="{A152E675-CAE8-43C2-8B26-2590A12E4D9D}" srcId="{905B648B-5517-41B9-918D-DF4373E4CB86}" destId="{81B25BD4-7170-46DC-9005-D31BF0FA76D6}" srcOrd="1" destOrd="0" parTransId="{19902BE4-BB93-4A3F-8D8F-2475B70B6EAF}" sibTransId="{78273206-6345-4914-BEBF-6064DB044DF5}"/>
+    <dgm:cxn modelId="{1D843DEE-0356-4FC9-A748-6AD54116F4FF}" srcId="{F0E5EC29-B935-43FC-A8DC-52B0A9EC61B2}" destId="{A3DD26F5-7A4C-4FE7-BB87-09033191052E}" srcOrd="1" destOrd="0" parTransId="{36FD9F39-FBD6-4A3E-A105-5B4568F07749}" sibTransId="{953F582A-91AF-42B8-B2DA-4608C2DD8D71}"/>
+    <dgm:cxn modelId="{0C7D8336-0CD2-46D8-A152-745B5AED1FBA}" srcId="{A3DD26F5-7A4C-4FE7-BB87-09033191052E}" destId="{A38E62D7-2FC3-43DA-B63E-DF0A64077B83}" srcOrd="0" destOrd="0" parTransId="{3AB51838-B1E4-4E44-8DBB-E5C95EE6EA0F}" sibTransId="{508487B2-3364-4458-9436-05049DF80378}"/>
+    <dgm:cxn modelId="{D227E64B-98B2-4587-BE11-AB4D1B728D93}" srcId="{A3DD26F5-7A4C-4FE7-BB87-09033191052E}" destId="{911D3D38-4878-4487-9C38-283A49674C08}" srcOrd="1" destOrd="0" parTransId="{A40D3603-7856-467A-B50A-7C88CDD908FE}" sibTransId="{AC0EC7E2-0D05-4827-961D-4CBE00EB9039}"/>
+    <dgm:cxn modelId="{9AAB6D26-0F27-495C-B818-D3B5B7E77134}" srcId="{F0E5EC29-B935-43FC-A8DC-52B0A9EC61B2}" destId="{C2ADA40F-7FD2-4BE7-A6A4-5DF94DFB3EDF}" srcOrd="2" destOrd="0" parTransId="{0AB4B741-466E-4CEA-ACB3-1CBFFDA5110F}" sibTransId="{B482F30E-FA0F-4A9A-967B-57C61F0A2EE7}"/>
+    <dgm:cxn modelId="{713F9590-91E3-4227-AFED-E57399C303F8}" srcId="{C2ADA40F-7FD2-4BE7-A6A4-5DF94DFB3EDF}" destId="{968DE21C-1ADB-4549-85D1-3D19F5CB7995}" srcOrd="0" destOrd="0" parTransId="{1FF8A868-C726-4FBE-82C9-EA260D6174C9}" sibTransId="{52A976F2-260E-4A52-9C50-F9580FCFDD9C}"/>
+    <dgm:cxn modelId="{87BCB105-B1A6-4F15-87FA-DED88D09F7BC}" srcId="{C2ADA40F-7FD2-4BE7-A6A4-5DF94DFB3EDF}" destId="{2A6803AC-3514-4198-B128-69CD82766CFC}" srcOrd="1" destOrd="0" parTransId="{3F417067-009E-4F04-ABAF-FA3F9876EA2F}" sibTransId="{4A2CEB39-F361-4D26-A078-B617826E4886}"/>
+    <dgm:cxn modelId="{BA111658-91AF-477E-812F-008906452E03}" srcId="{F0E5EC29-B935-43FC-A8DC-52B0A9EC61B2}" destId="{F6A68DFE-8671-4160-B4A8-7013D44E51CB}" srcOrd="3" destOrd="0" parTransId="{817F9D70-A8E6-46A2-8C98-2FEB24F04C0E}" sibTransId="{1725503C-5F2B-4797-B086-3696F50210F3}"/>
+    <dgm:cxn modelId="{A3C19139-96FB-409B-9207-B402F8EA7C97}" srcId="{F6A68DFE-8671-4160-B4A8-7013D44E51CB}" destId="{52A667BB-500C-4CD0-B771-784C6AC19FBA}" srcOrd="0" destOrd="0" parTransId="{7D3847D4-1AA4-4107-9F73-5EBBC968218B}" sibTransId="{0C0524B3-F9CC-4B76-9052-4A440475A505}"/>
+    <dgm:cxn modelId="{02D0C366-AF0B-4F8E-BE5C-5DC1E2150FAB}" srcId="{F6A68DFE-8671-4160-B4A8-7013D44E51CB}" destId="{469ED81A-88C1-4923-9697-6E2619930091}" srcOrd="1" destOrd="0" parTransId="{5E83756F-3176-47E1-A338-64B0F829793B}" sibTransId="{8C45754F-B2E9-4B2B-B3D4-55C19E55379B}"/>
+    <dgm:cxn modelId="{0955CE68-5449-4B12-B019-BF188CF1F836}" srcId="{F0E5EC29-B935-43FC-A8DC-52B0A9EC61B2}" destId="{31B6847F-7FC0-407B-8FCB-1885E7C41A7C}" srcOrd="4" destOrd="0" parTransId="{175FC084-C7CD-4AD5-99B2-AB3C76E38132}" sibTransId="{63D2B4AB-EFE8-4EBA-AC89-EB13FFB77A2B}"/>
+    <dgm:cxn modelId="{7E6CC733-7287-4C7C-8400-34321BAED9FF}" srcId="{31B6847F-7FC0-407B-8FCB-1885E7C41A7C}" destId="{05D52169-53A1-419D-AE13-92A6DDCD8A3C}" srcOrd="0" destOrd="0" parTransId="{0C95FFBB-96CA-4B29-85DF-F491E05FEE12}" sibTransId="{28E0EA15-A065-4B8C-9132-E4E51FD54B27}"/>
+    <dgm:cxn modelId="{5C41A22A-D862-4A21-B018-267A51D871A0}" srcId="{31B6847F-7FC0-407B-8FCB-1885E7C41A7C}" destId="{A491FD41-192C-4D28-8F6F-06396170B6F7}" srcOrd="1" destOrd="0" parTransId="{5020D4FA-C480-4E9A-A109-6CAE685CECBC}" sibTransId="{4808E0B8-34DD-4732-9C3C-B558F60365B6}"/>
+    <dgm:cxn modelId="{57B5AD7F-3A3C-4E8C-9602-0C158FB61594}" type="presOf" srcId="{F0E5EC29-B935-43FC-A8DC-52B0A9EC61B2}" destId="{1DFCA981-FC5D-4CD2-82E1-3A1132AB10E0}" srcOrd="0" destOrd="0" presId="urn:microsoft.com/office/officeart/2005/8/layout/vList5"/>
+    <dgm:cxn modelId="{815E8706-9D7A-40AA-B737-189DD4439366}" type="presParOf" srcId="{1DFCA981-FC5D-4CD2-82E1-3A1132AB10E0}" destId="{DB0BD9BE-1482-41E0-A7C0-E083D02C46FB}" srcOrd="0" destOrd="0" presId="urn:microsoft.com/office/officeart/2005/8/layout/vList5"/>
+    <dgm:cxn modelId="{A04E6886-1105-4523-BFB5-E6D11E7666BE}" type="presParOf" srcId="{DB0BD9BE-1482-41E0-A7C0-E083D02C46FB}" destId="{78789BBE-4898-4099-9C91-99A0869FA37D}" srcOrd="0" destOrd="0" presId="urn:microsoft.com/office/officeart/2005/8/layout/vList5"/>
+    <dgm:cxn modelId="{45160DBC-6203-496E-81DA-DAF8720EF0E1}" type="presOf" srcId="{905B648B-5517-41B9-918D-DF4373E4CB86}" destId="{78789BBE-4898-4099-9C91-99A0869FA37D}" srcOrd="0" destOrd="0" presId="urn:microsoft.com/office/officeart/2005/8/layout/vList5"/>
+    <dgm:cxn modelId="{C69DCAB9-374A-4CEE-8FEE-73473A6C1EBE}" type="presParOf" srcId="{DB0BD9BE-1482-41E0-A7C0-E083D02C46FB}" destId="{57C4B712-EE35-450A-B883-71F107516DEB}" srcOrd="1" destOrd="0" presId="urn:microsoft.com/office/officeart/2005/8/layout/vList5"/>
+    <dgm:cxn modelId="{42F217DB-16AB-4B52-B5BC-F9F6DD2488C0}" type="presOf" srcId="{1892D0D8-3048-4663-B368-EA8F196753F5}" destId="{57C4B712-EE35-450A-B883-71F107516DEB}" srcOrd="0" destOrd="0" presId="urn:microsoft.com/office/officeart/2005/8/layout/vList5"/>
+    <dgm:cxn modelId="{36E9C54B-A27D-41E7-968C-568F35548C59}" type="presOf" srcId="{81B25BD4-7170-46DC-9005-D31BF0FA76D6}" destId="{57C4B712-EE35-450A-B883-71F107516DEB}" srcOrd="0" destOrd="1" presId="urn:microsoft.com/office/officeart/2005/8/layout/vList5"/>
+    <dgm:cxn modelId="{B27778B5-66B8-4F37-AF23-EFFA0AD41794}" type="presParOf" srcId="{1DFCA981-FC5D-4CD2-82E1-3A1132AB10E0}" destId="{323B1D3F-5F3E-4FE1-8585-8E19C7034BCE}" srcOrd="1" destOrd="0" presId="urn:microsoft.com/office/officeart/2005/8/layout/vList5"/>
+    <dgm:cxn modelId="{933B6505-8BE2-4248-A8E7-48DD0CA81D39}" type="presParOf" srcId="{1DFCA981-FC5D-4CD2-82E1-3A1132AB10E0}" destId="{5AF48F84-71A8-45BF-9187-874F196C425B}" srcOrd="2" destOrd="0" presId="urn:microsoft.com/office/officeart/2005/8/layout/vList5"/>
+    <dgm:cxn modelId="{B44A2AEC-031A-4B35-AFF6-E2870A231308}" type="presParOf" srcId="{5AF48F84-71A8-45BF-9187-874F196C425B}" destId="{F9B13E8C-0FA6-4389-81A2-1617E638414A}" srcOrd="0" destOrd="0" presId="urn:microsoft.com/office/officeart/2005/8/layout/vList5"/>
+    <dgm:cxn modelId="{DA134575-38DB-4E29-A675-6AAA93E6729A}" type="presOf" srcId="{A3DD26F5-7A4C-4FE7-BB87-09033191052E}" destId="{F9B13E8C-0FA6-4389-81A2-1617E638414A}" srcOrd="0" destOrd="0" presId="urn:microsoft.com/office/officeart/2005/8/layout/vList5"/>
+    <dgm:cxn modelId="{FE3C040F-15D0-40E9-B5C3-93309B41B0A8}" type="presParOf" srcId="{5AF48F84-71A8-45BF-9187-874F196C425B}" destId="{37A6B501-4217-48D9-A852-741DD34D4155}" srcOrd="1" destOrd="0" presId="urn:microsoft.com/office/officeart/2005/8/layout/vList5"/>
+    <dgm:cxn modelId="{998B2C0A-2196-4F48-B3BA-A7D4EFD067C5}" type="presOf" srcId="{A38E62D7-2FC3-43DA-B63E-DF0A64077B83}" destId="{37A6B501-4217-48D9-A852-741DD34D4155}" srcOrd="0" destOrd="0" presId="urn:microsoft.com/office/officeart/2005/8/layout/vList5"/>
+    <dgm:cxn modelId="{7CC50E0E-7FC8-49CC-831D-96C9AE9A1D6E}" type="presOf" srcId="{911D3D38-4878-4487-9C38-283A49674C08}" destId="{37A6B501-4217-48D9-A852-741DD34D4155}" srcOrd="0" destOrd="1" presId="urn:microsoft.com/office/officeart/2005/8/layout/vList5"/>
+    <dgm:cxn modelId="{42BE5EF4-126B-4A9C-B291-6CDA92047706}" type="presParOf" srcId="{1DFCA981-FC5D-4CD2-82E1-3A1132AB10E0}" destId="{9EB5782C-335D-4D14-9E37-F47B7BEE0957}" srcOrd="3" destOrd="0" presId="urn:microsoft.com/office/officeart/2005/8/layout/vList5"/>
+    <dgm:cxn modelId="{9941EBBB-7EC6-4C83-AE65-50AEABAB7197}" type="presParOf" srcId="{1DFCA981-FC5D-4CD2-82E1-3A1132AB10E0}" destId="{BA077992-5F1F-4A89-922C-380EB13DF06C}" srcOrd="4" destOrd="0" presId="urn:microsoft.com/office/officeart/2005/8/layout/vList5"/>
+    <dgm:cxn modelId="{ED633999-DEC8-400F-9FDE-4601D0E27499}" type="presParOf" srcId="{BA077992-5F1F-4A89-922C-380EB13DF06C}" destId="{12C1161B-045F-4C04-A313-E29554BBDE91}" srcOrd="0" destOrd="0" presId="urn:microsoft.com/office/officeart/2005/8/layout/vList5"/>
+    <dgm:cxn modelId="{25B26740-8CE8-46D3-93E3-CC3BA648106B}" type="presOf" srcId="{C2ADA40F-7FD2-4BE7-A6A4-5DF94DFB3EDF}" destId="{12C1161B-045F-4C04-A313-E29554BBDE91}" srcOrd="0" destOrd="0" presId="urn:microsoft.com/office/officeart/2005/8/layout/vList5"/>
+    <dgm:cxn modelId="{86C84709-A823-425B-85E4-D9149F456910}" type="presParOf" srcId="{BA077992-5F1F-4A89-922C-380EB13DF06C}" destId="{D7F731B8-EDAE-434B-9AC4-4F52E56AF9D5}" srcOrd="1" destOrd="0" presId="urn:microsoft.com/office/officeart/2005/8/layout/vList5"/>
+    <dgm:cxn modelId="{14F838C7-4C38-4606-8EC2-1C8E0E73D446}" type="presOf" srcId="{968DE21C-1ADB-4549-85D1-3D19F5CB7995}" destId="{D7F731B8-EDAE-434B-9AC4-4F52E56AF9D5}" srcOrd="0" destOrd="0" presId="urn:microsoft.com/office/officeart/2005/8/layout/vList5"/>
+    <dgm:cxn modelId="{1B93CCD1-75B4-4EAA-80DE-C9CDCF5523CC}" type="presOf" srcId="{2A6803AC-3514-4198-B128-69CD82766CFC}" destId="{D7F731B8-EDAE-434B-9AC4-4F52E56AF9D5}" srcOrd="0" destOrd="1" presId="urn:microsoft.com/office/officeart/2005/8/layout/vList5"/>
+    <dgm:cxn modelId="{9BF39F16-B37A-4E08-8735-45EFECDB571D}" type="presParOf" srcId="{1DFCA981-FC5D-4CD2-82E1-3A1132AB10E0}" destId="{E897DF53-0DD5-4B6B-952D-ADFE9CC2431D}" srcOrd="5" destOrd="0" presId="urn:microsoft.com/office/officeart/2005/8/layout/vList5"/>
+    <dgm:cxn modelId="{BD9D28FA-770D-4C59-B2CA-A1CE8F843F08}" type="presParOf" srcId="{1DFCA981-FC5D-4CD2-82E1-3A1132AB10E0}" destId="{BB393C05-5A82-4C38-92ED-8F9CD53DEA9C}" srcOrd="6" destOrd="0" presId="urn:microsoft.com/office/officeart/2005/8/layout/vList5"/>
+    <dgm:cxn modelId="{B685A7AB-0469-4FED-8103-66AEDDC5106D}" type="presParOf" srcId="{BB393C05-5A82-4C38-92ED-8F9CD53DEA9C}" destId="{B9D1539B-EC1A-4FB6-9BB8-5AD744B651B6}" srcOrd="0" destOrd="0" presId="urn:microsoft.com/office/officeart/2005/8/layout/vList5"/>
+    <dgm:cxn modelId="{2BA4CA5E-D3D0-40CC-BC78-32D4D0708F1C}" type="presOf" srcId="{F6A68DFE-8671-4160-B4A8-7013D44E51CB}" destId="{B9D1539B-EC1A-4FB6-9BB8-5AD744B651B6}" srcOrd="0" destOrd="0" presId="urn:microsoft.com/office/officeart/2005/8/layout/vList5"/>
+    <dgm:cxn modelId="{5A1F02FF-05B3-42A8-A65B-8A4FFD44703A}" type="presParOf" srcId="{BB393C05-5A82-4C38-92ED-8F9CD53DEA9C}" destId="{1015202B-F803-41E6-ACBE-EFE0F11981FE}" srcOrd="1" destOrd="0" presId="urn:microsoft.com/office/officeart/2005/8/layout/vList5"/>
+    <dgm:cxn modelId="{DFF87951-2B75-4795-9F0C-0C85DB3E645E}" type="presOf" srcId="{52A667BB-500C-4CD0-B771-784C6AC19FBA}" destId="{1015202B-F803-41E6-ACBE-EFE0F11981FE}" srcOrd="0" destOrd="0" presId="urn:microsoft.com/office/officeart/2005/8/layout/vList5"/>
+    <dgm:cxn modelId="{8505AD78-F658-45A9-8B3F-ECD78B62A998}" type="presOf" srcId="{469ED81A-88C1-4923-9697-6E2619930091}" destId="{1015202B-F803-41E6-ACBE-EFE0F11981FE}" srcOrd="0" destOrd="1" presId="urn:microsoft.com/office/officeart/2005/8/layout/vList5"/>
+    <dgm:cxn modelId="{E4E0DF12-7680-4632-817A-A89A380E71F2}" type="presParOf" srcId="{1DFCA981-FC5D-4CD2-82E1-3A1132AB10E0}" destId="{C6FCC61E-1B19-4E48-A843-35F8FD29BDFF}" srcOrd="7" destOrd="0" presId="urn:microsoft.com/office/officeart/2005/8/layout/vList5"/>
+    <dgm:cxn modelId="{75C56E8F-0DF8-4C56-B9E8-0E3204CF40D0}" type="presParOf" srcId="{1DFCA981-FC5D-4CD2-82E1-3A1132AB10E0}" destId="{0BBD14F3-2DF0-4B72-A4D4-5442232D43F8}" srcOrd="8" destOrd="0" presId="urn:microsoft.com/office/officeart/2005/8/layout/vList5"/>
+    <dgm:cxn modelId="{C9C6CD79-099B-4942-8DE3-9ECBF77D0ABA}" type="presParOf" srcId="{0BBD14F3-2DF0-4B72-A4D4-5442232D43F8}" destId="{FC5A03C8-A193-4988-89F9-C15C3F413212}" srcOrd="0" destOrd="0" presId="urn:microsoft.com/office/officeart/2005/8/layout/vList5"/>
+    <dgm:cxn modelId="{A384E351-A210-4AC9-96B7-16E4943900F9}" type="presOf" srcId="{31B6847F-7FC0-407B-8FCB-1885E7C41A7C}" destId="{FC5A03C8-A193-4988-89F9-C15C3F413212}" srcOrd="0" destOrd="0" presId="urn:microsoft.com/office/officeart/2005/8/layout/vList5"/>
+    <dgm:cxn modelId="{2FF4406F-16EA-4B42-A743-72D3CF893AE7}" type="presParOf" srcId="{0BBD14F3-2DF0-4B72-A4D4-5442232D43F8}" destId="{A149E8D8-6B57-420B-A154-DCF9B92EDD3B}" srcOrd="1" destOrd="0" presId="urn:microsoft.com/office/officeart/2005/8/layout/vList5"/>
+    <dgm:cxn modelId="{DBC2CAC4-194D-4AC1-9349-A3F18CB50C96}" type="presOf" srcId="{05D52169-53A1-419D-AE13-92A6DDCD8A3C}" destId="{A149E8D8-6B57-420B-A154-DCF9B92EDD3B}" srcOrd="0" destOrd="0" presId="urn:microsoft.com/office/officeart/2005/8/layout/vList5"/>
+    <dgm:cxn modelId="{125382DF-767C-4ACC-80CF-89EA2205E684}" type="presOf" srcId="{A491FD41-192C-4D28-8F6F-06396170B6F7}" destId="{A149E8D8-6B57-420B-A154-DCF9B92EDD3B}" srcOrd="0" destOrd="1" presId="urn:microsoft.com/office/officeart/2005/8/layout/vList5"/>
   </dgm:cxnLst>
   <dgm:bg/>
   <dgm:whole/>

</xml_diff>